<commit_message>
feat(figures): update Figure 4 to single 17-category panel comparing BioBERT vs LLMs and backup 10-cat script
</commit_message>
<xml_diff>
--- a/publication/manuscripts/LLM4AE_rev1_clean_updated.docx
+++ b/publication/manuscripts/LLM4AE_rev1_clean_updated.docx
@@ -6578,4481 +6578,8 @@
       </w:tr>
     </w:tbl>
     <w:p>
-      <w:r>
-        <w:t>Table 4. Fine-Grained Category-Level Performance Breakdown on the FAERS Dataset Across All 17 Clinical Concept Categories (N = 829 Reports).</w:t>
-      </w:r>
+      <w:r/>
     </w:p>
-    <w:tbl>
-      <w:tblPr>
-        <w:tblW w:type="auto" w:w="0"/>
-        <w:jc w:val="center"/>
-        <w:tblLook w:firstColumn="1" w:firstRow="1" w:lastColumn="0" w:lastRow="0" w:noHBand="0" w:noVBand="1" w:val="04A0"/>
-        <w:tblBorders>
-          <w:top w:val="single" w:sz="8" w:space="0" w:color="333333"/>
-          <w:bottom w:val="single" w:sz="8" w:space="0" w:color="333333"/>
-          <w:insideH w:val="single" w:sz="4" w:space="0" w:color="E0E0E0"/>
-          <w:insideV w:val="none"/>
-          <w:left w:val="none"/>
-          <w:right w:val="none"/>
-        </w:tblBorders>
-      </w:tblPr>
-      <w:tblGrid>
-        <w:gridCol w:w="1170"/>
-        <w:gridCol w:w="1170"/>
-        <w:gridCol w:w="1170"/>
-        <w:gridCol w:w="1170"/>
-        <w:gridCol w:w="1170"/>
-        <w:gridCol w:w="1170"/>
-        <w:gridCol w:w="1170"/>
-        <w:gridCol w:w="1170"/>
-      </w:tblGrid>
-      <w:tr>
-        <w:tc>
-          <w:tcPr>
-            <w:tcW w:type="dxa" w:w="1584"/>
-            <w:shd w:fill="F2F4F8"/>
-            <w:tcMar>
-              <w:top w:w="60" w:type="dxa"/>
-              <w:bottom w:w="60" w:type="dxa"/>
-              <w:left w:w="90" w:type="dxa"/>
-              <w:right w:w="90" w:type="dxa"/>
-            </w:tcMar>
-            <w:vAlign w:val="center"/>
-          </w:tcPr>
-          <w:p>
-            <w:pPr>
-              <w:spacing w:before="30" w:after="30"/>
-              <w:jc w:val="center"/>
-            </w:pPr>
-            <w:r/>
-            <w:r>
-              <w:rPr>
-                <w:rFonts w:ascii="Arial" w:hAnsi="Arial"/>
-                <w:b/>
-                <w:color w:val="111111"/>
-                <w:sz w:val="16"/>
-              </w:rPr>
-              <w:t>Category</w:t>
-            </w:r>
-          </w:p>
-        </w:tc>
-        <w:tc>
-          <w:tcPr>
-            <w:tcW w:type="dxa" w:w="1008"/>
-            <w:shd w:fill="F2F4F8"/>
-            <w:tcMar>
-              <w:top w:w="60" w:type="dxa"/>
-              <w:bottom w:w="60" w:type="dxa"/>
-              <w:left w:w="90" w:type="dxa"/>
-              <w:right w:w="90" w:type="dxa"/>
-            </w:tcMar>
-            <w:vAlign w:val="center"/>
-          </w:tcPr>
-          <w:p>
-            <w:pPr>
-              <w:spacing w:before="30" w:after="30"/>
-              <w:jc w:val="center"/>
-            </w:pPr>
-            <w:r/>
-            <w:r>
-              <w:rPr>
-                <w:rFonts w:ascii="Arial" w:hAnsi="Arial"/>
-                <w:b/>
-                <w:color w:val="111111"/>
-                <w:sz w:val="16"/>
-              </w:rPr>
-              <w:t>Gold (N)</w:t>
-            </w:r>
-          </w:p>
-        </w:tc>
-        <w:tc>
-          <w:tcPr>
-            <w:tcW w:type="dxa" w:w="1296"/>
-            <w:shd w:fill="F2F4F8"/>
-            <w:tcMar>
-              <w:top w:w="60" w:type="dxa"/>
-              <w:bottom w:w="60" w:type="dxa"/>
-              <w:left w:w="90" w:type="dxa"/>
-              <w:right w:w="90" w:type="dxa"/>
-            </w:tcMar>
-            <w:vAlign w:val="center"/>
-          </w:tcPr>
-          <w:p>
-            <w:pPr>
-              <w:spacing w:before="30" w:after="30"/>
-              <w:jc w:val="center"/>
-            </w:pPr>
-            <w:r/>
-            <w:r>
-              <w:rPr>
-                <w:rFonts w:ascii="Arial" w:hAnsi="Arial"/>
-                <w:b/>
-                <w:color w:val="111111"/>
-                <w:sz w:val="16"/>
-              </w:rPr>
-              <w:t>BioBERT (Strict)</w:t>
-            </w:r>
-          </w:p>
-        </w:tc>
-        <w:tc>
-          <w:tcPr>
-            <w:tcW w:type="dxa" w:w="1296"/>
-            <w:shd w:fill="F2F4F8"/>
-            <w:tcMar>
-              <w:top w:w="60" w:type="dxa"/>
-              <w:bottom w:w="60" w:type="dxa"/>
-              <w:left w:w="90" w:type="dxa"/>
-              <w:right w:w="90" w:type="dxa"/>
-            </w:tcMar>
-            <w:vAlign w:val="center"/>
-          </w:tcPr>
-          <w:p>
-            <w:pPr>
-              <w:spacing w:before="30" w:after="30"/>
-              <w:jc w:val="center"/>
-            </w:pPr>
-            <w:r/>
-            <w:r>
-              <w:rPr>
-                <w:rFonts w:ascii="Arial" w:hAnsi="Arial"/>
-                <w:b/>
-                <w:color w:val="111111"/>
-                <w:sz w:val="16"/>
-              </w:rPr>
-              <w:t>LLaMA 4 (Strict)</w:t>
-            </w:r>
-          </w:p>
-        </w:tc>
-        <w:tc>
-          <w:tcPr>
-            <w:tcW w:type="dxa" w:w="1440"/>
-            <w:shd w:fill="F2F4F8"/>
-            <w:tcMar>
-              <w:top w:w="60" w:type="dxa"/>
-              <w:bottom w:w="60" w:type="dxa"/>
-              <w:left w:w="90" w:type="dxa"/>
-              <w:right w:w="90" w:type="dxa"/>
-            </w:tcMar>
-            <w:vAlign w:val="center"/>
-          </w:tcPr>
-          <w:p>
-            <w:pPr>
-              <w:spacing w:before="30" w:after="30"/>
-              <w:jc w:val="center"/>
-            </w:pPr>
-            <w:r/>
-            <w:r>
-              <w:rPr>
-                <w:rFonts w:ascii="Arial" w:hAnsi="Arial"/>
-                <w:b/>
-                <w:color w:val="111111"/>
-                <w:sz w:val="16"/>
-              </w:rPr>
-              <w:t>Claude Sonnet (Strict)</w:t>
-            </w:r>
-          </w:p>
-        </w:tc>
-        <w:tc>
-          <w:tcPr>
-            <w:tcW w:type="dxa" w:w="1296"/>
-            <w:shd w:fill="F2F4F8"/>
-            <w:tcMar>
-              <w:top w:w="60" w:type="dxa"/>
-              <w:bottom w:w="60" w:type="dxa"/>
-              <w:left w:w="90" w:type="dxa"/>
-              <w:right w:w="90" w:type="dxa"/>
-            </w:tcMar>
-            <w:vAlign w:val="center"/>
-          </w:tcPr>
-          <w:p>
-            <w:pPr>
-              <w:spacing w:before="30" w:after="30"/>
-              <w:jc w:val="center"/>
-            </w:pPr>
-            <w:r/>
-            <w:r>
-              <w:rPr>
-                <w:rFonts w:ascii="Arial" w:hAnsi="Arial"/>
-                <w:b/>
-                <w:color w:val="111111"/>
-                <w:sz w:val="16"/>
-              </w:rPr>
-              <w:t>BioBERT (Adapted)</w:t>
-            </w:r>
-          </w:p>
-        </w:tc>
-        <w:tc>
-          <w:tcPr>
-            <w:tcW w:type="dxa" w:w="1296"/>
-            <w:shd w:fill="F2F4F8"/>
-            <w:tcMar>
-              <w:top w:w="60" w:type="dxa"/>
-              <w:bottom w:w="60" w:type="dxa"/>
-              <w:left w:w="90" w:type="dxa"/>
-              <w:right w:w="90" w:type="dxa"/>
-            </w:tcMar>
-            <w:vAlign w:val="center"/>
-          </w:tcPr>
-          <w:p>
-            <w:pPr>
-              <w:spacing w:before="30" w:after="30"/>
-              <w:jc w:val="center"/>
-            </w:pPr>
-            <w:r/>
-            <w:r>
-              <w:rPr>
-                <w:rFonts w:ascii="Arial" w:hAnsi="Arial"/>
-                <w:b/>
-                <w:color w:val="111111"/>
-                <w:sz w:val="16"/>
-              </w:rPr>
-              <w:t>LLaMA 4 (Adapted)</w:t>
-            </w:r>
-          </w:p>
-        </w:tc>
-        <w:tc>
-          <w:tcPr>
-            <w:tcW w:type="dxa" w:w="1440"/>
-            <w:shd w:fill="F2F4F8"/>
-            <w:tcMar>
-              <w:top w:w="60" w:type="dxa"/>
-              <w:bottom w:w="60" w:type="dxa"/>
-              <w:left w:w="90" w:type="dxa"/>
-              <w:right w:w="90" w:type="dxa"/>
-            </w:tcMar>
-            <w:vAlign w:val="center"/>
-          </w:tcPr>
-          <w:p>
-            <w:pPr>
-              <w:spacing w:before="30" w:after="30"/>
-              <w:jc w:val="center"/>
-            </w:pPr>
-            <w:r/>
-            <w:r>
-              <w:rPr>
-                <w:rFonts w:ascii="Arial" w:hAnsi="Arial"/>
-                <w:b/>
-                <w:color w:val="111111"/>
-                <w:sz w:val="16"/>
-              </w:rPr>
-              <w:t>Claude Sonnet (Adapted)</w:t>
-            </w:r>
-          </w:p>
-        </w:tc>
-      </w:tr>
-      <w:tr>
-        <w:tc>
-          <w:tcPr>
-            <w:tcW w:type="dxa" w:w="1584"/>
-            <w:shd w:fill="FFFFFF"/>
-            <w:tcMar>
-              <w:top w:w="60" w:type="dxa"/>
-              <w:bottom w:w="60" w:type="dxa"/>
-              <w:left w:w="90" w:type="dxa"/>
-              <w:right w:w="90" w:type="dxa"/>
-            </w:tcMar>
-            <w:vAlign w:val="center"/>
-          </w:tcPr>
-          <w:p>
-            <w:pPr>
-              <w:spacing w:before="30" w:after="30"/>
-              <w:jc w:val="left"/>
-            </w:pPr>
-            <w:r/>
-            <w:r>
-              <w:rPr>
-                <w:rFonts w:ascii="Arial" w:hAnsi="Arial"/>
-                <w:b/>
-                <w:color w:val="222222"/>
-                <w:sz w:val="16"/>
-              </w:rPr>
-              <w:t>sDrug</w:t>
-            </w:r>
-          </w:p>
-        </w:tc>
-        <w:tc>
-          <w:tcPr>
-            <w:tcW w:type="dxa" w:w="1008"/>
-            <w:shd w:fill="FFFFFF"/>
-            <w:tcMar>
-              <w:top w:w="60" w:type="dxa"/>
-              <w:bottom w:w="60" w:type="dxa"/>
-              <w:left w:w="90" w:type="dxa"/>
-              <w:right w:w="90" w:type="dxa"/>
-            </w:tcMar>
-            <w:vAlign w:val="center"/>
-          </w:tcPr>
-          <w:p>
-            <w:pPr>
-              <w:spacing w:before="30" w:after="30"/>
-              <w:jc w:val="center"/>
-            </w:pPr>
-            <w:r/>
-            <w:r>
-              <w:rPr>
-                <w:rFonts w:ascii="Arial" w:hAnsi="Arial"/>
-                <w:b w:val="0"/>
-                <w:color w:val="222222"/>
-                <w:sz w:val="16"/>
-              </w:rPr>
-              <w:t>4,665</w:t>
-            </w:r>
-          </w:p>
-        </w:tc>
-        <w:tc>
-          <w:tcPr>
-            <w:tcW w:type="dxa" w:w="1296"/>
-            <w:shd w:fill="FFFFFF"/>
-            <w:tcMar>
-              <w:top w:w="60" w:type="dxa"/>
-              <w:bottom w:w="60" w:type="dxa"/>
-              <w:left w:w="90" w:type="dxa"/>
-              <w:right w:w="90" w:type="dxa"/>
-            </w:tcMar>
-            <w:vAlign w:val="center"/>
-          </w:tcPr>
-          <w:p>
-            <w:pPr>
-              <w:spacing w:before="30" w:after="30"/>
-              <w:jc w:val="center"/>
-            </w:pPr>
-            <w:r/>
-            <w:r>
-              <w:rPr>
-                <w:rFonts w:ascii="Arial" w:hAnsi="Arial"/>
-                <w:b w:val="0"/>
-                <w:color w:val="222222"/>
-                <w:sz w:val="16"/>
-              </w:rPr>
-              <w:t>0.6025</w:t>
-            </w:r>
-          </w:p>
-        </w:tc>
-        <w:tc>
-          <w:tcPr>
-            <w:tcW w:type="dxa" w:w="1296"/>
-            <w:shd w:fill="FFFFFF"/>
-            <w:tcMar>
-              <w:top w:w="60" w:type="dxa"/>
-              <w:bottom w:w="60" w:type="dxa"/>
-              <w:left w:w="90" w:type="dxa"/>
-              <w:right w:w="90" w:type="dxa"/>
-            </w:tcMar>
-            <w:vAlign w:val="center"/>
-          </w:tcPr>
-          <w:p>
-            <w:pPr>
-              <w:spacing w:before="30" w:after="30"/>
-              <w:jc w:val="center"/>
-            </w:pPr>
-            <w:r/>
-            <w:r>
-              <w:rPr>
-                <w:rFonts w:ascii="Arial" w:hAnsi="Arial"/>
-                <w:b w:val="0"/>
-                <w:color w:val="222222"/>
-                <w:sz w:val="16"/>
-              </w:rPr>
-              <w:t>0.3181</w:t>
-            </w:r>
-          </w:p>
-        </w:tc>
-        <w:tc>
-          <w:tcPr>
-            <w:tcW w:type="dxa" w:w="1440"/>
-            <w:shd w:fill="FFFFFF"/>
-            <w:tcMar>
-              <w:top w:w="60" w:type="dxa"/>
-              <w:bottom w:w="60" w:type="dxa"/>
-              <w:left w:w="90" w:type="dxa"/>
-              <w:right w:w="90" w:type="dxa"/>
-            </w:tcMar>
-            <w:vAlign w:val="center"/>
-          </w:tcPr>
-          <w:p>
-            <w:pPr>
-              <w:spacing w:before="30" w:after="30"/>
-              <w:jc w:val="center"/>
-            </w:pPr>
-            <w:r/>
-            <w:r>
-              <w:rPr>
-                <w:rFonts w:ascii="Arial" w:hAnsi="Arial"/>
-                <w:b w:val="0"/>
-                <w:color w:val="222222"/>
-                <w:sz w:val="16"/>
-              </w:rPr>
-              <w:t>0.4006</w:t>
-            </w:r>
-          </w:p>
-        </w:tc>
-        <w:tc>
-          <w:tcPr>
-            <w:tcW w:type="dxa" w:w="1296"/>
-            <w:shd w:fill="FFFFFF"/>
-            <w:tcMar>
-              <w:top w:w="60" w:type="dxa"/>
-              <w:bottom w:w="60" w:type="dxa"/>
-              <w:left w:w="90" w:type="dxa"/>
-              <w:right w:w="90" w:type="dxa"/>
-            </w:tcMar>
-            <w:vAlign w:val="center"/>
-          </w:tcPr>
-          <w:p>
-            <w:pPr>
-              <w:spacing w:before="30" w:after="30"/>
-              <w:jc w:val="center"/>
-            </w:pPr>
-            <w:r/>
-            <w:r>
-              <w:rPr>
-                <w:rFonts w:ascii="Arial" w:hAnsi="Arial"/>
-                <w:b w:val="0"/>
-                <w:color w:val="222222"/>
-                <w:sz w:val="16"/>
-              </w:rPr>
-              <w:t>0.7376</w:t>
-            </w:r>
-          </w:p>
-        </w:tc>
-        <w:tc>
-          <w:tcPr>
-            <w:tcW w:type="dxa" w:w="1296"/>
-            <w:shd w:fill="FFFFFF"/>
-            <w:tcMar>
-              <w:top w:w="60" w:type="dxa"/>
-              <w:bottom w:w="60" w:type="dxa"/>
-              <w:left w:w="90" w:type="dxa"/>
-              <w:right w:w="90" w:type="dxa"/>
-            </w:tcMar>
-            <w:vAlign w:val="center"/>
-          </w:tcPr>
-          <w:p>
-            <w:pPr>
-              <w:spacing w:before="30" w:after="30"/>
-              <w:jc w:val="center"/>
-            </w:pPr>
-            <w:r/>
-            <w:r>
-              <w:rPr>
-                <w:rFonts w:ascii="Arial" w:hAnsi="Arial"/>
-                <w:b w:val="0"/>
-                <w:color w:val="222222"/>
-                <w:sz w:val="16"/>
-              </w:rPr>
-              <w:t>0.5463</w:t>
-            </w:r>
-          </w:p>
-        </w:tc>
-        <w:tc>
-          <w:tcPr>
-            <w:tcW w:type="dxa" w:w="1440"/>
-            <w:shd w:fill="FFFFFF"/>
-            <w:tcMar>
-              <w:top w:w="60" w:type="dxa"/>
-              <w:bottom w:w="60" w:type="dxa"/>
-              <w:left w:w="90" w:type="dxa"/>
-              <w:right w:w="90" w:type="dxa"/>
-            </w:tcMar>
-            <w:vAlign w:val="center"/>
-          </w:tcPr>
-          <w:p>
-            <w:pPr>
-              <w:spacing w:before="30" w:after="30"/>
-              <w:jc w:val="center"/>
-            </w:pPr>
-            <w:r/>
-            <w:r>
-              <w:rPr>
-                <w:rFonts w:ascii="Arial" w:hAnsi="Arial"/>
-                <w:b w:val="0"/>
-                <w:color w:val="222222"/>
-                <w:sz w:val="16"/>
-              </w:rPr>
-              <w:t>0.5619</w:t>
-            </w:r>
-          </w:p>
-        </w:tc>
-      </w:tr>
-      <w:tr>
-        <w:tc>
-          <w:tcPr>
-            <w:tcW w:type="dxa" w:w="1584"/>
-            <w:shd w:fill="FBFBFB"/>
-            <w:tcMar>
-              <w:top w:w="60" w:type="dxa"/>
-              <w:bottom w:w="60" w:type="dxa"/>
-              <w:left w:w="90" w:type="dxa"/>
-              <w:right w:w="90" w:type="dxa"/>
-            </w:tcMar>
-            <w:vAlign w:val="center"/>
-          </w:tcPr>
-          <w:p>
-            <w:pPr>
-              <w:spacing w:before="30" w:after="30"/>
-              <w:jc w:val="left"/>
-            </w:pPr>
-            <w:r/>
-            <w:r>
-              <w:rPr>
-                <w:rFonts w:ascii="Arial" w:hAnsi="Arial"/>
-                <w:b/>
-                <w:color w:val="222222"/>
-                <w:sz w:val="16"/>
-              </w:rPr>
-              <w:t>cDrug</w:t>
-            </w:r>
-          </w:p>
-        </w:tc>
-        <w:tc>
-          <w:tcPr>
-            <w:tcW w:type="dxa" w:w="1008"/>
-            <w:shd w:fill="FBFBFB"/>
-            <w:tcMar>
-              <w:top w:w="60" w:type="dxa"/>
-              <w:bottom w:w="60" w:type="dxa"/>
-              <w:left w:w="90" w:type="dxa"/>
-              <w:right w:w="90" w:type="dxa"/>
-            </w:tcMar>
-            <w:vAlign w:val="center"/>
-          </w:tcPr>
-          <w:p>
-            <w:pPr>
-              <w:spacing w:before="30" w:after="30"/>
-              <w:jc w:val="center"/>
-            </w:pPr>
-            <w:r/>
-            <w:r>
-              <w:rPr>
-                <w:rFonts w:ascii="Arial" w:hAnsi="Arial"/>
-                <w:b w:val="0"/>
-                <w:color w:val="222222"/>
-                <w:sz w:val="16"/>
-              </w:rPr>
-              <w:t>2,995</w:t>
-            </w:r>
-          </w:p>
-        </w:tc>
-        <w:tc>
-          <w:tcPr>
-            <w:tcW w:type="dxa" w:w="1296"/>
-            <w:shd w:fill="FBFBFB"/>
-            <w:tcMar>
-              <w:top w:w="60" w:type="dxa"/>
-              <w:bottom w:w="60" w:type="dxa"/>
-              <w:left w:w="90" w:type="dxa"/>
-              <w:right w:w="90" w:type="dxa"/>
-            </w:tcMar>
-            <w:vAlign w:val="center"/>
-          </w:tcPr>
-          <w:p>
-            <w:pPr>
-              <w:spacing w:before="30" w:after="30"/>
-              <w:jc w:val="center"/>
-            </w:pPr>
-            <w:r/>
-            <w:r>
-              <w:rPr>
-                <w:rFonts w:ascii="Arial" w:hAnsi="Arial"/>
-                <w:b w:val="0"/>
-                <w:color w:val="222222"/>
-                <w:sz w:val="16"/>
-              </w:rPr>
-              <w:t>0.7433</w:t>
-            </w:r>
-          </w:p>
-        </w:tc>
-        <w:tc>
-          <w:tcPr>
-            <w:tcW w:type="dxa" w:w="1296"/>
-            <w:shd w:fill="FBFBFB"/>
-            <w:tcMar>
-              <w:top w:w="60" w:type="dxa"/>
-              <w:bottom w:w="60" w:type="dxa"/>
-              <w:left w:w="90" w:type="dxa"/>
-              <w:right w:w="90" w:type="dxa"/>
-            </w:tcMar>
-            <w:vAlign w:val="center"/>
-          </w:tcPr>
-          <w:p>
-            <w:pPr>
-              <w:spacing w:before="30" w:after="30"/>
-              <w:jc w:val="center"/>
-            </w:pPr>
-            <w:r/>
-            <w:r>
-              <w:rPr>
-                <w:rFonts w:ascii="Arial" w:hAnsi="Arial"/>
-                <w:b w:val="0"/>
-                <w:color w:val="222222"/>
-                <w:sz w:val="16"/>
-              </w:rPr>
-              <w:t>0.3443</w:t>
-            </w:r>
-          </w:p>
-        </w:tc>
-        <w:tc>
-          <w:tcPr>
-            <w:tcW w:type="dxa" w:w="1440"/>
-            <w:shd w:fill="FBFBFB"/>
-            <w:tcMar>
-              <w:top w:w="60" w:type="dxa"/>
-              <w:bottom w:w="60" w:type="dxa"/>
-              <w:left w:w="90" w:type="dxa"/>
-              <w:right w:w="90" w:type="dxa"/>
-            </w:tcMar>
-            <w:vAlign w:val="center"/>
-          </w:tcPr>
-          <w:p>
-            <w:pPr>
-              <w:spacing w:before="30" w:after="30"/>
-              <w:jc w:val="center"/>
-            </w:pPr>
-            <w:r/>
-            <w:r>
-              <w:rPr>
-                <w:rFonts w:ascii="Arial" w:hAnsi="Arial"/>
-                <w:b w:val="0"/>
-                <w:color w:val="222222"/>
-                <w:sz w:val="16"/>
-              </w:rPr>
-              <w:t>0.5689</w:t>
-            </w:r>
-          </w:p>
-        </w:tc>
-        <w:tc>
-          <w:tcPr>
-            <w:tcW w:type="dxa" w:w="1296"/>
-            <w:shd w:fill="FBFBFB"/>
-            <w:tcMar>
-              <w:top w:w="60" w:type="dxa"/>
-              <w:bottom w:w="60" w:type="dxa"/>
-              <w:left w:w="90" w:type="dxa"/>
-              <w:right w:w="90" w:type="dxa"/>
-            </w:tcMar>
-            <w:vAlign w:val="center"/>
-          </w:tcPr>
-          <w:p>
-            <w:pPr>
-              <w:spacing w:before="30" w:after="30"/>
-              <w:jc w:val="center"/>
-            </w:pPr>
-            <w:r/>
-            <w:r>
-              <w:rPr>
-                <w:rFonts w:ascii="Arial" w:hAnsi="Arial"/>
-                <w:b w:val="0"/>
-                <w:color w:val="222222"/>
-                <w:sz w:val="16"/>
-              </w:rPr>
-              <w:t>0.8451</w:t>
-            </w:r>
-          </w:p>
-        </w:tc>
-        <w:tc>
-          <w:tcPr>
-            <w:tcW w:type="dxa" w:w="1296"/>
-            <w:shd w:fill="FBFBFB"/>
-            <w:tcMar>
-              <w:top w:w="60" w:type="dxa"/>
-              <w:bottom w:w="60" w:type="dxa"/>
-              <w:left w:w="90" w:type="dxa"/>
-              <w:right w:w="90" w:type="dxa"/>
-            </w:tcMar>
-            <w:vAlign w:val="center"/>
-          </w:tcPr>
-          <w:p>
-            <w:pPr>
-              <w:spacing w:before="30" w:after="30"/>
-              <w:jc w:val="center"/>
-            </w:pPr>
-            <w:r/>
-            <w:r>
-              <w:rPr>
-                <w:rFonts w:ascii="Arial" w:hAnsi="Arial"/>
-                <w:b w:val="0"/>
-                <w:color w:val="222222"/>
-                <w:sz w:val="16"/>
-              </w:rPr>
-              <w:t>0.6013</w:t>
-            </w:r>
-          </w:p>
-        </w:tc>
-        <w:tc>
-          <w:tcPr>
-            <w:tcW w:type="dxa" w:w="1440"/>
-            <w:shd w:fill="FBFBFB"/>
-            <w:tcMar>
-              <w:top w:w="60" w:type="dxa"/>
-              <w:bottom w:w="60" w:type="dxa"/>
-              <w:left w:w="90" w:type="dxa"/>
-              <w:right w:w="90" w:type="dxa"/>
-            </w:tcMar>
-            <w:vAlign w:val="center"/>
-          </w:tcPr>
-          <w:p>
-            <w:pPr>
-              <w:spacing w:before="30" w:after="30"/>
-              <w:jc w:val="center"/>
-            </w:pPr>
-            <w:r/>
-            <w:r>
-              <w:rPr>
-                <w:rFonts w:ascii="Arial" w:hAnsi="Arial"/>
-                <w:b w:val="0"/>
-                <w:color w:val="222222"/>
-                <w:sz w:val="16"/>
-              </w:rPr>
-              <w:t>0.7130</w:t>
-            </w:r>
-          </w:p>
-        </w:tc>
-      </w:tr>
-      <w:tr>
-        <w:tc>
-          <w:tcPr>
-            <w:tcW w:type="dxa" w:w="1584"/>
-            <w:shd w:fill="FFFFFF"/>
-            <w:tcMar>
-              <w:top w:w="60" w:type="dxa"/>
-              <w:bottom w:w="60" w:type="dxa"/>
-              <w:left w:w="90" w:type="dxa"/>
-              <w:right w:w="90" w:type="dxa"/>
-            </w:tcMar>
-            <w:vAlign w:val="center"/>
-          </w:tcPr>
-          <w:p>
-            <w:pPr>
-              <w:spacing w:before="30" w:after="30"/>
-              <w:jc w:val="left"/>
-            </w:pPr>
-            <w:r/>
-            <w:r>
-              <w:rPr>
-                <w:rFonts w:ascii="Arial" w:hAnsi="Arial"/>
-                <w:b/>
-                <w:color w:val="222222"/>
-                <w:sz w:val="16"/>
-              </w:rPr>
-              <w:t>oDrug</w:t>
-            </w:r>
-          </w:p>
-        </w:tc>
-        <w:tc>
-          <w:tcPr>
-            <w:tcW w:type="dxa" w:w="1008"/>
-            <w:shd w:fill="FFFFFF"/>
-            <w:tcMar>
-              <w:top w:w="60" w:type="dxa"/>
-              <w:bottom w:w="60" w:type="dxa"/>
-              <w:left w:w="90" w:type="dxa"/>
-              <w:right w:w="90" w:type="dxa"/>
-            </w:tcMar>
-            <w:vAlign w:val="center"/>
-          </w:tcPr>
-          <w:p>
-            <w:pPr>
-              <w:spacing w:before="30" w:after="30"/>
-              <w:jc w:val="center"/>
-            </w:pPr>
-            <w:r/>
-            <w:r>
-              <w:rPr>
-                <w:rFonts w:ascii="Arial" w:hAnsi="Arial"/>
-                <w:b w:val="0"/>
-                <w:color w:val="222222"/>
-                <w:sz w:val="16"/>
-              </w:rPr>
-              <w:t>0</w:t>
-            </w:r>
-          </w:p>
-        </w:tc>
-        <w:tc>
-          <w:tcPr>
-            <w:tcW w:type="dxa" w:w="1296"/>
-            <w:shd w:fill="FFFFFF"/>
-            <w:tcMar>
-              <w:top w:w="60" w:type="dxa"/>
-              <w:bottom w:w="60" w:type="dxa"/>
-              <w:left w:w="90" w:type="dxa"/>
-              <w:right w:w="90" w:type="dxa"/>
-            </w:tcMar>
-            <w:vAlign w:val="center"/>
-          </w:tcPr>
-          <w:p>
-            <w:pPr>
-              <w:spacing w:before="30" w:after="30"/>
-              <w:jc w:val="center"/>
-            </w:pPr>
-            <w:r/>
-            <w:r>
-              <w:rPr>
-                <w:rFonts w:ascii="Arial" w:hAnsi="Arial"/>
-                <w:b w:val="0"/>
-                <w:color w:val="222222"/>
-                <w:sz w:val="16"/>
-              </w:rPr>
-              <w:t>0.0000</w:t>
-            </w:r>
-          </w:p>
-        </w:tc>
-        <w:tc>
-          <w:tcPr>
-            <w:tcW w:type="dxa" w:w="1296"/>
-            <w:shd w:fill="FFFFFF"/>
-            <w:tcMar>
-              <w:top w:w="60" w:type="dxa"/>
-              <w:bottom w:w="60" w:type="dxa"/>
-              <w:left w:w="90" w:type="dxa"/>
-              <w:right w:w="90" w:type="dxa"/>
-            </w:tcMar>
-            <w:vAlign w:val="center"/>
-          </w:tcPr>
-          <w:p>
-            <w:pPr>
-              <w:spacing w:before="30" w:after="30"/>
-              <w:jc w:val="center"/>
-            </w:pPr>
-            <w:r/>
-            <w:r>
-              <w:rPr>
-                <w:rFonts w:ascii="Arial" w:hAnsi="Arial"/>
-                <w:b w:val="0"/>
-                <w:color w:val="222222"/>
-                <w:sz w:val="16"/>
-              </w:rPr>
-              <w:t>0.0000</w:t>
-            </w:r>
-          </w:p>
-        </w:tc>
-        <w:tc>
-          <w:tcPr>
-            <w:tcW w:type="dxa" w:w="1440"/>
-            <w:shd w:fill="FFFFFF"/>
-            <w:tcMar>
-              <w:top w:w="60" w:type="dxa"/>
-              <w:bottom w:w="60" w:type="dxa"/>
-              <w:left w:w="90" w:type="dxa"/>
-              <w:right w:w="90" w:type="dxa"/>
-            </w:tcMar>
-            <w:vAlign w:val="center"/>
-          </w:tcPr>
-          <w:p>
-            <w:pPr>
-              <w:spacing w:before="30" w:after="30"/>
-              <w:jc w:val="center"/>
-            </w:pPr>
-            <w:r/>
-            <w:r>
-              <w:rPr>
-                <w:rFonts w:ascii="Arial" w:hAnsi="Arial"/>
-                <w:b w:val="0"/>
-                <w:color w:val="222222"/>
-                <w:sz w:val="16"/>
-              </w:rPr>
-              <w:t>0.0000</w:t>
-            </w:r>
-          </w:p>
-        </w:tc>
-        <w:tc>
-          <w:tcPr>
-            <w:tcW w:type="dxa" w:w="1296"/>
-            <w:shd w:fill="FFFFFF"/>
-            <w:tcMar>
-              <w:top w:w="60" w:type="dxa"/>
-              <w:bottom w:w="60" w:type="dxa"/>
-              <w:left w:w="90" w:type="dxa"/>
-              <w:right w:w="90" w:type="dxa"/>
-            </w:tcMar>
-            <w:vAlign w:val="center"/>
-          </w:tcPr>
-          <w:p>
-            <w:pPr>
-              <w:spacing w:before="30" w:after="30"/>
-              <w:jc w:val="center"/>
-            </w:pPr>
-            <w:r/>
-            <w:r>
-              <w:rPr>
-                <w:rFonts w:ascii="Arial" w:hAnsi="Arial"/>
-                <w:b w:val="0"/>
-                <w:color w:val="222222"/>
-                <w:sz w:val="16"/>
-              </w:rPr>
-              <w:t>0.0000</w:t>
-            </w:r>
-          </w:p>
-        </w:tc>
-        <w:tc>
-          <w:tcPr>
-            <w:tcW w:type="dxa" w:w="1296"/>
-            <w:shd w:fill="FFFFFF"/>
-            <w:tcMar>
-              <w:top w:w="60" w:type="dxa"/>
-              <w:bottom w:w="60" w:type="dxa"/>
-              <w:left w:w="90" w:type="dxa"/>
-              <w:right w:w="90" w:type="dxa"/>
-            </w:tcMar>
-            <w:vAlign w:val="center"/>
-          </w:tcPr>
-          <w:p>
-            <w:pPr>
-              <w:spacing w:before="30" w:after="30"/>
-              <w:jc w:val="center"/>
-            </w:pPr>
-            <w:r/>
-            <w:r>
-              <w:rPr>
-                <w:rFonts w:ascii="Arial" w:hAnsi="Arial"/>
-                <w:b w:val="0"/>
-                <w:color w:val="222222"/>
-                <w:sz w:val="16"/>
-              </w:rPr>
-              <w:t>0.4804</w:t>
-            </w:r>
-          </w:p>
-        </w:tc>
-        <w:tc>
-          <w:tcPr>
-            <w:tcW w:type="dxa" w:w="1440"/>
-            <w:shd w:fill="FFFFFF"/>
-            <w:tcMar>
-              <w:top w:w="60" w:type="dxa"/>
-              <w:bottom w:w="60" w:type="dxa"/>
-              <w:left w:w="90" w:type="dxa"/>
-              <w:right w:w="90" w:type="dxa"/>
-            </w:tcMar>
-            <w:vAlign w:val="center"/>
-          </w:tcPr>
-          <w:p>
-            <w:pPr>
-              <w:spacing w:before="30" w:after="30"/>
-              <w:jc w:val="center"/>
-            </w:pPr>
-            <w:r/>
-            <w:r>
-              <w:rPr>
-                <w:rFonts w:ascii="Arial" w:hAnsi="Arial"/>
-                <w:b w:val="0"/>
-                <w:color w:val="222222"/>
-                <w:sz w:val="16"/>
-              </w:rPr>
-              <w:t>0.4848</w:t>
-            </w:r>
-          </w:p>
-        </w:tc>
-      </w:tr>
-      <w:tr>
-        <w:tc>
-          <w:tcPr>
-            <w:tcW w:type="dxa" w:w="1584"/>
-            <w:shd w:fill="FBFBFB"/>
-            <w:tcMar>
-              <w:top w:w="60" w:type="dxa"/>
-              <w:bottom w:w="60" w:type="dxa"/>
-              <w:left w:w="90" w:type="dxa"/>
-              <w:right w:w="90" w:type="dxa"/>
-            </w:tcMar>
-            <w:vAlign w:val="center"/>
-          </w:tcPr>
-          <w:p>
-            <w:pPr>
-              <w:spacing w:before="30" w:after="30"/>
-              <w:jc w:val="left"/>
-            </w:pPr>
-            <w:r/>
-            <w:r>
-              <w:rPr>
-                <w:rFonts w:ascii="Arial" w:hAnsi="Arial"/>
-                <w:b/>
-                <w:color w:val="222222"/>
-                <w:sz w:val="16"/>
-              </w:rPr>
-              <w:t>Dose</w:t>
-            </w:r>
-          </w:p>
-        </w:tc>
-        <w:tc>
-          <w:tcPr>
-            <w:tcW w:type="dxa" w:w="1008"/>
-            <w:shd w:fill="FBFBFB"/>
-            <w:tcMar>
-              <w:top w:w="60" w:type="dxa"/>
-              <w:bottom w:w="60" w:type="dxa"/>
-              <w:left w:w="90" w:type="dxa"/>
-              <w:right w:w="90" w:type="dxa"/>
-            </w:tcMar>
-            <w:vAlign w:val="center"/>
-          </w:tcPr>
-          <w:p>
-            <w:pPr>
-              <w:spacing w:before="30" w:after="30"/>
-              <w:jc w:val="center"/>
-            </w:pPr>
-            <w:r/>
-            <w:r>
-              <w:rPr>
-                <w:rFonts w:ascii="Arial" w:hAnsi="Arial"/>
-                <w:b w:val="0"/>
-                <w:color w:val="222222"/>
-                <w:sz w:val="16"/>
-              </w:rPr>
-              <w:t>1,668</w:t>
-            </w:r>
-          </w:p>
-        </w:tc>
-        <w:tc>
-          <w:tcPr>
-            <w:tcW w:type="dxa" w:w="1296"/>
-            <w:shd w:fill="FBFBFB"/>
-            <w:tcMar>
-              <w:top w:w="60" w:type="dxa"/>
-              <w:bottom w:w="60" w:type="dxa"/>
-              <w:left w:w="90" w:type="dxa"/>
-              <w:right w:w="90" w:type="dxa"/>
-            </w:tcMar>
-            <w:vAlign w:val="center"/>
-          </w:tcPr>
-          <w:p>
-            <w:pPr>
-              <w:spacing w:before="30" w:after="30"/>
-              <w:jc w:val="center"/>
-            </w:pPr>
-            <w:r/>
-            <w:r>
-              <w:rPr>
-                <w:rFonts w:ascii="Arial" w:hAnsi="Arial"/>
-                <w:b w:val="0"/>
-                <w:color w:val="222222"/>
-                <w:sz w:val="16"/>
-              </w:rPr>
-              <w:t>0.6100</w:t>
-            </w:r>
-          </w:p>
-        </w:tc>
-        <w:tc>
-          <w:tcPr>
-            <w:tcW w:type="dxa" w:w="1296"/>
-            <w:shd w:fill="FBFBFB"/>
-            <w:tcMar>
-              <w:top w:w="60" w:type="dxa"/>
-              <w:bottom w:w="60" w:type="dxa"/>
-              <w:left w:w="90" w:type="dxa"/>
-              <w:right w:w="90" w:type="dxa"/>
-            </w:tcMar>
-            <w:vAlign w:val="center"/>
-          </w:tcPr>
-          <w:p>
-            <w:pPr>
-              <w:spacing w:before="30" w:after="30"/>
-              <w:jc w:val="center"/>
-            </w:pPr>
-            <w:r/>
-            <w:r>
-              <w:rPr>
-                <w:rFonts w:ascii="Arial" w:hAnsi="Arial"/>
-                <w:b w:val="0"/>
-                <w:color w:val="222222"/>
-                <w:sz w:val="16"/>
-              </w:rPr>
-              <w:t>0.2752</w:t>
-            </w:r>
-          </w:p>
-        </w:tc>
-        <w:tc>
-          <w:tcPr>
-            <w:tcW w:type="dxa" w:w="1440"/>
-            <w:shd w:fill="FBFBFB"/>
-            <w:tcMar>
-              <w:top w:w="60" w:type="dxa"/>
-              <w:bottom w:w="60" w:type="dxa"/>
-              <w:left w:w="90" w:type="dxa"/>
-              <w:right w:w="90" w:type="dxa"/>
-            </w:tcMar>
-            <w:vAlign w:val="center"/>
-          </w:tcPr>
-          <w:p>
-            <w:pPr>
-              <w:spacing w:before="30" w:after="30"/>
-              <w:jc w:val="center"/>
-            </w:pPr>
-            <w:r/>
-            <w:r>
-              <w:rPr>
-                <w:rFonts w:ascii="Arial" w:hAnsi="Arial"/>
-                <w:b w:val="0"/>
-                <w:color w:val="222222"/>
-                <w:sz w:val="16"/>
-              </w:rPr>
-              <w:t>0.4300</w:t>
-            </w:r>
-          </w:p>
-        </w:tc>
-        <w:tc>
-          <w:tcPr>
-            <w:tcW w:type="dxa" w:w="1296"/>
-            <w:shd w:fill="FBFBFB"/>
-            <w:tcMar>
-              <w:top w:w="60" w:type="dxa"/>
-              <w:bottom w:w="60" w:type="dxa"/>
-              <w:left w:w="90" w:type="dxa"/>
-              <w:right w:w="90" w:type="dxa"/>
-            </w:tcMar>
-            <w:vAlign w:val="center"/>
-          </w:tcPr>
-          <w:p>
-            <w:pPr>
-              <w:spacing w:before="30" w:after="30"/>
-              <w:jc w:val="center"/>
-            </w:pPr>
-            <w:r/>
-            <w:r>
-              <w:rPr>
-                <w:rFonts w:ascii="Arial" w:hAnsi="Arial"/>
-                <w:b w:val="0"/>
-                <w:color w:val="222222"/>
-                <w:sz w:val="16"/>
-              </w:rPr>
-              <w:t>0.7427</w:t>
-            </w:r>
-          </w:p>
-        </w:tc>
-        <w:tc>
-          <w:tcPr>
-            <w:tcW w:type="dxa" w:w="1296"/>
-            <w:shd w:fill="FBFBFB"/>
-            <w:tcMar>
-              <w:top w:w="60" w:type="dxa"/>
-              <w:bottom w:w="60" w:type="dxa"/>
-              <w:left w:w="90" w:type="dxa"/>
-              <w:right w:w="90" w:type="dxa"/>
-            </w:tcMar>
-            <w:vAlign w:val="center"/>
-          </w:tcPr>
-          <w:p>
-            <w:pPr>
-              <w:spacing w:before="30" w:after="30"/>
-              <w:jc w:val="center"/>
-            </w:pPr>
-            <w:r/>
-            <w:r>
-              <w:rPr>
-                <w:rFonts w:ascii="Arial" w:hAnsi="Arial"/>
-                <w:b w:val="0"/>
-                <w:color w:val="222222"/>
-                <w:sz w:val="16"/>
-              </w:rPr>
-              <w:t>0.5783</w:t>
-            </w:r>
-          </w:p>
-        </w:tc>
-        <w:tc>
-          <w:tcPr>
-            <w:tcW w:type="dxa" w:w="1440"/>
-            <w:shd w:fill="FBFBFB"/>
-            <w:tcMar>
-              <w:top w:w="60" w:type="dxa"/>
-              <w:bottom w:w="60" w:type="dxa"/>
-              <w:left w:w="90" w:type="dxa"/>
-              <w:right w:w="90" w:type="dxa"/>
-            </w:tcMar>
-            <w:vAlign w:val="center"/>
-          </w:tcPr>
-          <w:p>
-            <w:pPr>
-              <w:spacing w:before="30" w:after="30"/>
-              <w:jc w:val="center"/>
-            </w:pPr>
-            <w:r/>
-            <w:r>
-              <w:rPr>
-                <w:rFonts w:ascii="Arial" w:hAnsi="Arial"/>
-                <w:b w:val="0"/>
-                <w:color w:val="222222"/>
-                <w:sz w:val="16"/>
-              </w:rPr>
-              <w:t>0.6826</w:t>
-            </w:r>
-          </w:p>
-        </w:tc>
-      </w:tr>
-      <w:tr>
-        <w:tc>
-          <w:tcPr>
-            <w:tcW w:type="dxa" w:w="1584"/>
-            <w:shd w:fill="FFFFFF"/>
-            <w:tcMar>
-              <w:top w:w="60" w:type="dxa"/>
-              <w:bottom w:w="60" w:type="dxa"/>
-              <w:left w:w="90" w:type="dxa"/>
-              <w:right w:w="90" w:type="dxa"/>
-            </w:tcMar>
-            <w:vAlign w:val="center"/>
-          </w:tcPr>
-          <w:p>
-            <w:pPr>
-              <w:spacing w:before="30" w:after="30"/>
-              <w:jc w:val="left"/>
-            </w:pPr>
-            <w:r/>
-            <w:r>
-              <w:rPr>
-                <w:rFonts w:ascii="Arial" w:hAnsi="Arial"/>
-                <w:b/>
-                <w:color w:val="222222"/>
-                <w:sz w:val="16"/>
-              </w:rPr>
-              <w:t>Indication</w:t>
-            </w:r>
-          </w:p>
-        </w:tc>
-        <w:tc>
-          <w:tcPr>
-            <w:tcW w:type="dxa" w:w="1008"/>
-            <w:shd w:fill="FFFFFF"/>
-            <w:tcMar>
-              <w:top w:w="60" w:type="dxa"/>
-              <w:bottom w:w="60" w:type="dxa"/>
-              <w:left w:w="90" w:type="dxa"/>
-              <w:right w:w="90" w:type="dxa"/>
-            </w:tcMar>
-            <w:vAlign w:val="center"/>
-          </w:tcPr>
-          <w:p>
-            <w:pPr>
-              <w:spacing w:before="30" w:after="30"/>
-              <w:jc w:val="center"/>
-            </w:pPr>
-            <w:r/>
-            <w:r>
-              <w:rPr>
-                <w:rFonts w:ascii="Arial" w:hAnsi="Arial"/>
-                <w:b w:val="0"/>
-                <w:color w:val="222222"/>
-                <w:sz w:val="16"/>
-              </w:rPr>
-              <w:t>202</w:t>
-            </w:r>
-          </w:p>
-        </w:tc>
-        <w:tc>
-          <w:tcPr>
-            <w:tcW w:type="dxa" w:w="1296"/>
-            <w:shd w:fill="FFFFFF"/>
-            <w:tcMar>
-              <w:top w:w="60" w:type="dxa"/>
-              <w:bottom w:w="60" w:type="dxa"/>
-              <w:left w:w="90" w:type="dxa"/>
-              <w:right w:w="90" w:type="dxa"/>
-            </w:tcMar>
-            <w:vAlign w:val="center"/>
-          </w:tcPr>
-          <w:p>
-            <w:pPr>
-              <w:spacing w:before="30" w:after="30"/>
-              <w:jc w:val="center"/>
-            </w:pPr>
-            <w:r/>
-            <w:r>
-              <w:rPr>
-                <w:rFonts w:ascii="Arial" w:hAnsi="Arial"/>
-                <w:b w:val="0"/>
-                <w:color w:val="222222"/>
-                <w:sz w:val="16"/>
-              </w:rPr>
-              <w:t>0.1335</w:t>
-            </w:r>
-          </w:p>
-        </w:tc>
-        <w:tc>
-          <w:tcPr>
-            <w:tcW w:type="dxa" w:w="1296"/>
-            <w:shd w:fill="FFFFFF"/>
-            <w:tcMar>
-              <w:top w:w="60" w:type="dxa"/>
-              <w:bottom w:w="60" w:type="dxa"/>
-              <w:left w:w="90" w:type="dxa"/>
-              <w:right w:w="90" w:type="dxa"/>
-            </w:tcMar>
-            <w:vAlign w:val="center"/>
-          </w:tcPr>
-          <w:p>
-            <w:pPr>
-              <w:spacing w:before="30" w:after="30"/>
-              <w:jc w:val="center"/>
-            </w:pPr>
-            <w:r/>
-            <w:r>
-              <w:rPr>
-                <w:rFonts w:ascii="Arial" w:hAnsi="Arial"/>
-                <w:b w:val="0"/>
-                <w:color w:val="222222"/>
-                <w:sz w:val="16"/>
-              </w:rPr>
-              <w:t>0.0690</w:t>
-            </w:r>
-          </w:p>
-        </w:tc>
-        <w:tc>
-          <w:tcPr>
-            <w:tcW w:type="dxa" w:w="1440"/>
-            <w:shd w:fill="FFFFFF"/>
-            <w:tcMar>
-              <w:top w:w="60" w:type="dxa"/>
-              <w:bottom w:w="60" w:type="dxa"/>
-              <w:left w:w="90" w:type="dxa"/>
-              <w:right w:w="90" w:type="dxa"/>
-            </w:tcMar>
-            <w:vAlign w:val="center"/>
-          </w:tcPr>
-          <w:p>
-            <w:pPr>
-              <w:spacing w:before="30" w:after="30"/>
-              <w:jc w:val="center"/>
-            </w:pPr>
-            <w:r/>
-            <w:r>
-              <w:rPr>
-                <w:rFonts w:ascii="Arial" w:hAnsi="Arial"/>
-                <w:b w:val="0"/>
-                <w:color w:val="222222"/>
-                <w:sz w:val="16"/>
-              </w:rPr>
-              <w:t>0.1042</w:t>
-            </w:r>
-          </w:p>
-        </w:tc>
-        <w:tc>
-          <w:tcPr>
-            <w:tcW w:type="dxa" w:w="1296"/>
-            <w:shd w:fill="FFFFFF"/>
-            <w:tcMar>
-              <w:top w:w="60" w:type="dxa"/>
-              <w:bottom w:w="60" w:type="dxa"/>
-              <w:left w:w="90" w:type="dxa"/>
-              <w:right w:w="90" w:type="dxa"/>
-            </w:tcMar>
-            <w:vAlign w:val="center"/>
-          </w:tcPr>
-          <w:p>
-            <w:pPr>
-              <w:spacing w:before="30" w:after="30"/>
-              <w:jc w:val="center"/>
-            </w:pPr>
-            <w:r/>
-            <w:r>
-              <w:rPr>
-                <w:rFonts w:ascii="Arial" w:hAnsi="Arial"/>
-                <w:b w:val="0"/>
-                <w:color w:val="222222"/>
-                <w:sz w:val="16"/>
-              </w:rPr>
-              <w:t>0.5021</w:t>
-            </w:r>
-          </w:p>
-        </w:tc>
-        <w:tc>
-          <w:tcPr>
-            <w:tcW w:type="dxa" w:w="1296"/>
-            <w:shd w:fill="FFFFFF"/>
-            <w:tcMar>
-              <w:top w:w="60" w:type="dxa"/>
-              <w:bottom w:w="60" w:type="dxa"/>
-              <w:left w:w="90" w:type="dxa"/>
-              <w:right w:w="90" w:type="dxa"/>
-            </w:tcMar>
-            <w:vAlign w:val="center"/>
-          </w:tcPr>
-          <w:p>
-            <w:pPr>
-              <w:spacing w:before="30" w:after="30"/>
-              <w:jc w:val="center"/>
-            </w:pPr>
-            <w:r/>
-            <w:r>
-              <w:rPr>
-                <w:rFonts w:ascii="Arial" w:hAnsi="Arial"/>
-                <w:b w:val="0"/>
-                <w:color w:val="222222"/>
-                <w:sz w:val="16"/>
-              </w:rPr>
-              <w:t>0.4913</w:t>
-            </w:r>
-          </w:p>
-        </w:tc>
-        <w:tc>
-          <w:tcPr>
-            <w:tcW w:type="dxa" w:w="1440"/>
-            <w:shd w:fill="FFFFFF"/>
-            <w:tcMar>
-              <w:top w:w="60" w:type="dxa"/>
-              <w:bottom w:w="60" w:type="dxa"/>
-              <w:left w:w="90" w:type="dxa"/>
-              <w:right w:w="90" w:type="dxa"/>
-            </w:tcMar>
-            <w:vAlign w:val="center"/>
-          </w:tcPr>
-          <w:p>
-            <w:pPr>
-              <w:spacing w:before="30" w:after="30"/>
-              <w:jc w:val="center"/>
-            </w:pPr>
-            <w:r/>
-            <w:r>
-              <w:rPr>
-                <w:rFonts w:ascii="Arial" w:hAnsi="Arial"/>
-                <w:b w:val="0"/>
-                <w:color w:val="222222"/>
-                <w:sz w:val="16"/>
-              </w:rPr>
-              <w:t>0.5194</w:t>
-            </w:r>
-          </w:p>
-        </w:tc>
-      </w:tr>
-      <w:tr>
-        <w:tc>
-          <w:tcPr>
-            <w:tcW w:type="dxa" w:w="1584"/>
-            <w:shd w:fill="FBFBFB"/>
-            <w:tcMar>
-              <w:top w:w="60" w:type="dxa"/>
-              <w:bottom w:w="60" w:type="dxa"/>
-              <w:left w:w="90" w:type="dxa"/>
-              <w:right w:w="90" w:type="dxa"/>
-            </w:tcMar>
-            <w:vAlign w:val="center"/>
-          </w:tcPr>
-          <w:p>
-            <w:pPr>
-              <w:spacing w:before="30" w:after="30"/>
-              <w:jc w:val="left"/>
-            </w:pPr>
-            <w:r/>
-            <w:r>
-              <w:rPr>
-                <w:rFonts w:ascii="Arial" w:hAnsi="Arial"/>
-                <w:b/>
-                <w:color w:val="222222"/>
-                <w:sz w:val="16"/>
-              </w:rPr>
-              <w:t>Treatment</w:t>
-            </w:r>
-          </w:p>
-        </w:tc>
-        <w:tc>
-          <w:tcPr>
-            <w:tcW w:type="dxa" w:w="1008"/>
-            <w:shd w:fill="FBFBFB"/>
-            <w:tcMar>
-              <w:top w:w="60" w:type="dxa"/>
-              <w:bottom w:w="60" w:type="dxa"/>
-              <w:left w:w="90" w:type="dxa"/>
-              <w:right w:w="90" w:type="dxa"/>
-            </w:tcMar>
-            <w:vAlign w:val="center"/>
-          </w:tcPr>
-          <w:p>
-            <w:pPr>
-              <w:spacing w:before="30" w:after="30"/>
-              <w:jc w:val="center"/>
-            </w:pPr>
-            <w:r/>
-            <w:r>
-              <w:rPr>
-                <w:rFonts w:ascii="Arial" w:hAnsi="Arial"/>
-                <w:b w:val="0"/>
-                <w:color w:val="222222"/>
-                <w:sz w:val="16"/>
-              </w:rPr>
-              <w:t>1,490</w:t>
-            </w:r>
-          </w:p>
-        </w:tc>
-        <w:tc>
-          <w:tcPr>
-            <w:tcW w:type="dxa" w:w="1296"/>
-            <w:shd w:fill="FBFBFB"/>
-            <w:tcMar>
-              <w:top w:w="60" w:type="dxa"/>
-              <w:bottom w:w="60" w:type="dxa"/>
-              <w:left w:w="90" w:type="dxa"/>
-              <w:right w:w="90" w:type="dxa"/>
-            </w:tcMar>
-            <w:vAlign w:val="center"/>
-          </w:tcPr>
-          <w:p>
-            <w:pPr>
-              <w:spacing w:before="30" w:after="30"/>
-              <w:jc w:val="center"/>
-            </w:pPr>
-            <w:r/>
-            <w:r>
-              <w:rPr>
-                <w:rFonts w:ascii="Arial" w:hAnsi="Arial"/>
-                <w:b w:val="0"/>
-                <w:color w:val="222222"/>
-                <w:sz w:val="16"/>
-              </w:rPr>
-              <w:t>0.6260</w:t>
-            </w:r>
-          </w:p>
-        </w:tc>
-        <w:tc>
-          <w:tcPr>
-            <w:tcW w:type="dxa" w:w="1296"/>
-            <w:shd w:fill="FBFBFB"/>
-            <w:tcMar>
-              <w:top w:w="60" w:type="dxa"/>
-              <w:bottom w:w="60" w:type="dxa"/>
-              <w:left w:w="90" w:type="dxa"/>
-              <w:right w:w="90" w:type="dxa"/>
-            </w:tcMar>
-            <w:vAlign w:val="center"/>
-          </w:tcPr>
-          <w:p>
-            <w:pPr>
-              <w:spacing w:before="30" w:after="30"/>
-              <w:jc w:val="center"/>
-            </w:pPr>
-            <w:r/>
-            <w:r>
-              <w:rPr>
-                <w:rFonts w:ascii="Arial" w:hAnsi="Arial"/>
-                <w:b w:val="0"/>
-                <w:color w:val="222222"/>
-                <w:sz w:val="16"/>
-              </w:rPr>
-              <w:t>0.1832</w:t>
-            </w:r>
-          </w:p>
-        </w:tc>
-        <w:tc>
-          <w:tcPr>
-            <w:tcW w:type="dxa" w:w="1440"/>
-            <w:shd w:fill="FBFBFB"/>
-            <w:tcMar>
-              <w:top w:w="60" w:type="dxa"/>
-              <w:bottom w:w="60" w:type="dxa"/>
-              <w:left w:w="90" w:type="dxa"/>
-              <w:right w:w="90" w:type="dxa"/>
-            </w:tcMar>
-            <w:vAlign w:val="center"/>
-          </w:tcPr>
-          <w:p>
-            <w:pPr>
-              <w:spacing w:before="30" w:after="30"/>
-              <w:jc w:val="center"/>
-            </w:pPr>
-            <w:r/>
-            <w:r>
-              <w:rPr>
-                <w:rFonts w:ascii="Arial" w:hAnsi="Arial"/>
-                <w:b w:val="0"/>
-                <w:color w:val="222222"/>
-                <w:sz w:val="16"/>
-              </w:rPr>
-              <w:t>0.3189</w:t>
-            </w:r>
-          </w:p>
-        </w:tc>
-        <w:tc>
-          <w:tcPr>
-            <w:tcW w:type="dxa" w:w="1296"/>
-            <w:shd w:fill="FBFBFB"/>
-            <w:tcMar>
-              <w:top w:w="60" w:type="dxa"/>
-              <w:bottom w:w="60" w:type="dxa"/>
-              <w:left w:w="90" w:type="dxa"/>
-              <w:right w:w="90" w:type="dxa"/>
-            </w:tcMar>
-            <w:vAlign w:val="center"/>
-          </w:tcPr>
-          <w:p>
-            <w:pPr>
-              <w:spacing w:before="30" w:after="30"/>
-              <w:jc w:val="center"/>
-            </w:pPr>
-            <w:r/>
-            <w:r>
-              <w:rPr>
-                <w:rFonts w:ascii="Arial" w:hAnsi="Arial"/>
-                <w:b w:val="0"/>
-                <w:color w:val="222222"/>
-                <w:sz w:val="16"/>
-              </w:rPr>
-              <w:t>0.7775</w:t>
-            </w:r>
-          </w:p>
-        </w:tc>
-        <w:tc>
-          <w:tcPr>
-            <w:tcW w:type="dxa" w:w="1296"/>
-            <w:shd w:fill="FBFBFB"/>
-            <w:tcMar>
-              <w:top w:w="60" w:type="dxa"/>
-              <w:bottom w:w="60" w:type="dxa"/>
-              <w:left w:w="90" w:type="dxa"/>
-              <w:right w:w="90" w:type="dxa"/>
-            </w:tcMar>
-            <w:vAlign w:val="center"/>
-          </w:tcPr>
-          <w:p>
-            <w:pPr>
-              <w:spacing w:before="30" w:after="30"/>
-              <w:jc w:val="center"/>
-            </w:pPr>
-            <w:r/>
-            <w:r>
-              <w:rPr>
-                <w:rFonts w:ascii="Arial" w:hAnsi="Arial"/>
-                <w:b w:val="0"/>
-                <w:color w:val="222222"/>
-                <w:sz w:val="16"/>
-              </w:rPr>
-              <w:t>0.4647</w:t>
-            </w:r>
-          </w:p>
-        </w:tc>
-        <w:tc>
-          <w:tcPr>
-            <w:tcW w:type="dxa" w:w="1440"/>
-            <w:shd w:fill="FBFBFB"/>
-            <w:tcMar>
-              <w:top w:w="60" w:type="dxa"/>
-              <w:bottom w:w="60" w:type="dxa"/>
-              <w:left w:w="90" w:type="dxa"/>
-              <w:right w:w="90" w:type="dxa"/>
-            </w:tcMar>
-            <w:vAlign w:val="center"/>
-          </w:tcPr>
-          <w:p>
-            <w:pPr>
-              <w:spacing w:before="30" w:after="30"/>
-              <w:jc w:val="center"/>
-            </w:pPr>
-            <w:r/>
-            <w:r>
-              <w:rPr>
-                <w:rFonts w:ascii="Arial" w:hAnsi="Arial"/>
-                <w:b w:val="0"/>
-                <w:color w:val="222222"/>
-                <w:sz w:val="16"/>
-              </w:rPr>
-              <w:t>0.5355</w:t>
-            </w:r>
-          </w:p>
-        </w:tc>
-      </w:tr>
-      <w:tr>
-        <w:tc>
-          <w:tcPr>
-            <w:tcW w:type="dxa" w:w="1584"/>
-            <w:shd w:fill="FFFFFF"/>
-            <w:tcMar>
-              <w:top w:w="60" w:type="dxa"/>
-              <w:bottom w:w="60" w:type="dxa"/>
-              <w:left w:w="90" w:type="dxa"/>
-              <w:right w:w="90" w:type="dxa"/>
-            </w:tcMar>
-            <w:vAlign w:val="center"/>
-          </w:tcPr>
-          <w:p>
-            <w:pPr>
-              <w:spacing w:before="30" w:after="30"/>
-              <w:jc w:val="left"/>
-            </w:pPr>
-            <w:r/>
-            <w:r>
-              <w:rPr>
-                <w:rFonts w:ascii="Arial" w:hAnsi="Arial"/>
-                <w:b/>
-                <w:color w:val="222222"/>
-                <w:sz w:val="16"/>
-              </w:rPr>
-              <w:t>AE</w:t>
-            </w:r>
-          </w:p>
-        </w:tc>
-        <w:tc>
-          <w:tcPr>
-            <w:tcW w:type="dxa" w:w="1008"/>
-            <w:shd w:fill="FFFFFF"/>
-            <w:tcMar>
-              <w:top w:w="60" w:type="dxa"/>
-              <w:bottom w:w="60" w:type="dxa"/>
-              <w:left w:w="90" w:type="dxa"/>
-              <w:right w:w="90" w:type="dxa"/>
-            </w:tcMar>
-            <w:vAlign w:val="center"/>
-          </w:tcPr>
-          <w:p>
-            <w:pPr>
-              <w:spacing w:before="30" w:after="30"/>
-              <w:jc w:val="center"/>
-            </w:pPr>
-            <w:r/>
-            <w:r>
-              <w:rPr>
-                <w:rFonts w:ascii="Arial" w:hAnsi="Arial"/>
-                <w:b w:val="0"/>
-                <w:color w:val="222222"/>
-                <w:sz w:val="16"/>
-              </w:rPr>
-              <w:t>12,010</w:t>
-            </w:r>
-          </w:p>
-        </w:tc>
-        <w:tc>
-          <w:tcPr>
-            <w:tcW w:type="dxa" w:w="1296"/>
-            <w:shd w:fill="FFFFFF"/>
-            <w:tcMar>
-              <w:top w:w="60" w:type="dxa"/>
-              <w:bottom w:w="60" w:type="dxa"/>
-              <w:left w:w="90" w:type="dxa"/>
-              <w:right w:w="90" w:type="dxa"/>
-            </w:tcMar>
-            <w:vAlign w:val="center"/>
-          </w:tcPr>
-          <w:p>
-            <w:pPr>
-              <w:spacing w:before="30" w:after="30"/>
-              <w:jc w:val="center"/>
-            </w:pPr>
-            <w:r/>
-            <w:r>
-              <w:rPr>
-                <w:rFonts w:ascii="Arial" w:hAnsi="Arial"/>
-                <w:b w:val="0"/>
-                <w:color w:val="222222"/>
-                <w:sz w:val="16"/>
-              </w:rPr>
-              <w:t>0.5931</w:t>
-            </w:r>
-          </w:p>
-        </w:tc>
-        <w:tc>
-          <w:tcPr>
-            <w:tcW w:type="dxa" w:w="1296"/>
-            <w:shd w:fill="FFFFFF"/>
-            <w:tcMar>
-              <w:top w:w="60" w:type="dxa"/>
-              <w:bottom w:w="60" w:type="dxa"/>
-              <w:left w:w="90" w:type="dxa"/>
-              <w:right w:w="90" w:type="dxa"/>
-            </w:tcMar>
-            <w:vAlign w:val="center"/>
-          </w:tcPr>
-          <w:p>
-            <w:pPr>
-              <w:spacing w:before="30" w:after="30"/>
-              <w:jc w:val="center"/>
-            </w:pPr>
-            <w:r/>
-            <w:r>
-              <w:rPr>
-                <w:rFonts w:ascii="Arial" w:hAnsi="Arial"/>
-                <w:b w:val="0"/>
-                <w:color w:val="222222"/>
-                <w:sz w:val="16"/>
-              </w:rPr>
-              <w:t>0.3582</w:t>
-            </w:r>
-          </w:p>
-        </w:tc>
-        <w:tc>
-          <w:tcPr>
-            <w:tcW w:type="dxa" w:w="1440"/>
-            <w:shd w:fill="FFFFFF"/>
-            <w:tcMar>
-              <w:top w:w="60" w:type="dxa"/>
-              <w:bottom w:w="60" w:type="dxa"/>
-              <w:left w:w="90" w:type="dxa"/>
-              <w:right w:w="90" w:type="dxa"/>
-            </w:tcMar>
-            <w:vAlign w:val="center"/>
-          </w:tcPr>
-          <w:p>
-            <w:pPr>
-              <w:spacing w:before="30" w:after="30"/>
-              <w:jc w:val="center"/>
-            </w:pPr>
-            <w:r/>
-            <w:r>
-              <w:rPr>
-                <w:rFonts w:ascii="Arial" w:hAnsi="Arial"/>
-                <w:b w:val="0"/>
-                <w:color w:val="222222"/>
-                <w:sz w:val="16"/>
-              </w:rPr>
-              <w:t>0.4401</w:t>
-            </w:r>
-          </w:p>
-        </w:tc>
-        <w:tc>
-          <w:tcPr>
-            <w:tcW w:type="dxa" w:w="1296"/>
-            <w:shd w:fill="FFFFFF"/>
-            <w:tcMar>
-              <w:top w:w="60" w:type="dxa"/>
-              <w:bottom w:w="60" w:type="dxa"/>
-              <w:left w:w="90" w:type="dxa"/>
-              <w:right w:w="90" w:type="dxa"/>
-            </w:tcMar>
-            <w:vAlign w:val="center"/>
-          </w:tcPr>
-          <w:p>
-            <w:pPr>
-              <w:spacing w:before="30" w:after="30"/>
-              <w:jc w:val="center"/>
-            </w:pPr>
-            <w:r/>
-            <w:r>
-              <w:rPr>
-                <w:rFonts w:ascii="Arial" w:hAnsi="Arial"/>
-                <w:b w:val="0"/>
-                <w:color w:val="222222"/>
-                <w:sz w:val="16"/>
-              </w:rPr>
-              <w:t>0.7066</w:t>
-            </w:r>
-          </w:p>
-        </w:tc>
-        <w:tc>
-          <w:tcPr>
-            <w:tcW w:type="dxa" w:w="1296"/>
-            <w:shd w:fill="FFFFFF"/>
-            <w:tcMar>
-              <w:top w:w="60" w:type="dxa"/>
-              <w:bottom w:w="60" w:type="dxa"/>
-              <w:left w:w="90" w:type="dxa"/>
-              <w:right w:w="90" w:type="dxa"/>
-            </w:tcMar>
-            <w:vAlign w:val="center"/>
-          </w:tcPr>
-          <w:p>
-            <w:pPr>
-              <w:spacing w:before="30" w:after="30"/>
-              <w:jc w:val="center"/>
-            </w:pPr>
-            <w:r/>
-            <w:r>
-              <w:rPr>
-                <w:rFonts w:ascii="Arial" w:hAnsi="Arial"/>
-                <w:b w:val="0"/>
-                <w:color w:val="222222"/>
-                <w:sz w:val="16"/>
-              </w:rPr>
-              <w:t>0.5635</w:t>
-            </w:r>
-          </w:p>
-        </w:tc>
-        <w:tc>
-          <w:tcPr>
-            <w:tcW w:type="dxa" w:w="1440"/>
-            <w:shd w:fill="FFFFFF"/>
-            <w:tcMar>
-              <w:top w:w="60" w:type="dxa"/>
-              <w:bottom w:w="60" w:type="dxa"/>
-              <w:left w:w="90" w:type="dxa"/>
-              <w:right w:w="90" w:type="dxa"/>
-            </w:tcMar>
-            <w:vAlign w:val="center"/>
-          </w:tcPr>
-          <w:p>
-            <w:pPr>
-              <w:spacing w:before="30" w:after="30"/>
-              <w:jc w:val="center"/>
-            </w:pPr>
-            <w:r/>
-            <w:r>
-              <w:rPr>
-                <w:rFonts w:ascii="Arial" w:hAnsi="Arial"/>
-                <w:b w:val="0"/>
-                <w:color w:val="222222"/>
-                <w:sz w:val="16"/>
-              </w:rPr>
-              <w:t>0.5678</w:t>
-            </w:r>
-          </w:p>
-        </w:tc>
-      </w:tr>
-      <w:tr>
-        <w:tc>
-          <w:tcPr>
-            <w:tcW w:type="dxa" w:w="1584"/>
-            <w:shd w:fill="FBFBFB"/>
-            <w:tcMar>
-              <w:top w:w="60" w:type="dxa"/>
-              <w:bottom w:w="60" w:type="dxa"/>
-              <w:left w:w="90" w:type="dxa"/>
-              <w:right w:w="90" w:type="dxa"/>
-            </w:tcMar>
-            <w:vAlign w:val="center"/>
-          </w:tcPr>
-          <w:p>
-            <w:pPr>
-              <w:spacing w:before="30" w:after="30"/>
-              <w:jc w:val="left"/>
-            </w:pPr>
-            <w:r/>
-            <w:r>
-              <w:rPr>
-                <w:rFonts w:ascii="Arial" w:hAnsi="Arial"/>
-                <w:b/>
-                <w:color w:val="222222"/>
-                <w:sz w:val="16"/>
-              </w:rPr>
-              <w:t>mAE</w:t>
-            </w:r>
-          </w:p>
-        </w:tc>
-        <w:tc>
-          <w:tcPr>
-            <w:tcW w:type="dxa" w:w="1008"/>
-            <w:shd w:fill="FBFBFB"/>
-            <w:tcMar>
-              <w:top w:w="60" w:type="dxa"/>
-              <w:bottom w:w="60" w:type="dxa"/>
-              <w:left w:w="90" w:type="dxa"/>
-              <w:right w:w="90" w:type="dxa"/>
-            </w:tcMar>
-            <w:vAlign w:val="center"/>
-          </w:tcPr>
-          <w:p>
-            <w:pPr>
-              <w:spacing w:before="30" w:after="30"/>
-              <w:jc w:val="center"/>
-            </w:pPr>
-            <w:r/>
-            <w:r>
-              <w:rPr>
-                <w:rFonts w:ascii="Arial" w:hAnsi="Arial"/>
-                <w:b w:val="0"/>
-                <w:color w:val="222222"/>
-                <w:sz w:val="16"/>
-              </w:rPr>
-              <w:t>113</w:t>
-            </w:r>
-          </w:p>
-        </w:tc>
-        <w:tc>
-          <w:tcPr>
-            <w:tcW w:type="dxa" w:w="1296"/>
-            <w:shd w:fill="FBFBFB"/>
-            <w:tcMar>
-              <w:top w:w="60" w:type="dxa"/>
-              <w:bottom w:w="60" w:type="dxa"/>
-              <w:left w:w="90" w:type="dxa"/>
-              <w:right w:w="90" w:type="dxa"/>
-            </w:tcMar>
-            <w:vAlign w:val="center"/>
-          </w:tcPr>
-          <w:p>
-            <w:pPr>
-              <w:spacing w:before="30" w:after="30"/>
-              <w:jc w:val="center"/>
-            </w:pPr>
-            <w:r/>
-            <w:r>
-              <w:rPr>
-                <w:rFonts w:ascii="Arial" w:hAnsi="Arial"/>
-                <w:b w:val="0"/>
-                <w:color w:val="222222"/>
-                <w:sz w:val="16"/>
-              </w:rPr>
-              <w:t>0.0480</w:t>
-            </w:r>
-          </w:p>
-        </w:tc>
-        <w:tc>
-          <w:tcPr>
-            <w:tcW w:type="dxa" w:w="1296"/>
-            <w:shd w:fill="FBFBFB"/>
-            <w:tcMar>
-              <w:top w:w="60" w:type="dxa"/>
-              <w:bottom w:w="60" w:type="dxa"/>
-              <w:left w:w="90" w:type="dxa"/>
-              <w:right w:w="90" w:type="dxa"/>
-            </w:tcMar>
-            <w:vAlign w:val="center"/>
-          </w:tcPr>
-          <w:p>
-            <w:pPr>
-              <w:spacing w:before="30" w:after="30"/>
-              <w:jc w:val="center"/>
-            </w:pPr>
-            <w:r/>
-            <w:r>
-              <w:rPr>
-                <w:rFonts w:ascii="Arial" w:hAnsi="Arial"/>
-                <w:b w:val="0"/>
-                <w:color w:val="222222"/>
-                <w:sz w:val="16"/>
-              </w:rPr>
-              <w:t>0.0405</w:t>
-            </w:r>
-          </w:p>
-        </w:tc>
-        <w:tc>
-          <w:tcPr>
-            <w:tcW w:type="dxa" w:w="1440"/>
-            <w:shd w:fill="FBFBFB"/>
-            <w:tcMar>
-              <w:top w:w="60" w:type="dxa"/>
-              <w:bottom w:w="60" w:type="dxa"/>
-              <w:left w:w="90" w:type="dxa"/>
-              <w:right w:w="90" w:type="dxa"/>
-            </w:tcMar>
-            <w:vAlign w:val="center"/>
-          </w:tcPr>
-          <w:p>
-            <w:pPr>
-              <w:spacing w:before="30" w:after="30"/>
-              <w:jc w:val="center"/>
-            </w:pPr>
-            <w:r/>
-            <w:r>
-              <w:rPr>
-                <w:rFonts w:ascii="Arial" w:hAnsi="Arial"/>
-                <w:b w:val="0"/>
-                <w:color w:val="222222"/>
-                <w:sz w:val="16"/>
-              </w:rPr>
-              <w:t>0.0594</w:t>
-            </w:r>
-          </w:p>
-        </w:tc>
-        <w:tc>
-          <w:tcPr>
-            <w:tcW w:type="dxa" w:w="1296"/>
-            <w:shd w:fill="FBFBFB"/>
-            <w:tcMar>
-              <w:top w:w="60" w:type="dxa"/>
-              <w:bottom w:w="60" w:type="dxa"/>
-              <w:left w:w="90" w:type="dxa"/>
-              <w:right w:w="90" w:type="dxa"/>
-            </w:tcMar>
-            <w:vAlign w:val="center"/>
-          </w:tcPr>
-          <w:p>
-            <w:pPr>
-              <w:spacing w:before="30" w:after="30"/>
-              <w:jc w:val="center"/>
-            </w:pPr>
-            <w:r/>
-            <w:r>
-              <w:rPr>
-                <w:rFonts w:ascii="Arial" w:hAnsi="Arial"/>
-                <w:b w:val="0"/>
-                <w:color w:val="222222"/>
-                <w:sz w:val="16"/>
-              </w:rPr>
-              <w:t>0.0507</w:t>
-            </w:r>
-          </w:p>
-        </w:tc>
-        <w:tc>
-          <w:tcPr>
-            <w:tcW w:type="dxa" w:w="1296"/>
-            <w:shd w:fill="FBFBFB"/>
-            <w:tcMar>
-              <w:top w:w="60" w:type="dxa"/>
-              <w:bottom w:w="60" w:type="dxa"/>
-              <w:left w:w="90" w:type="dxa"/>
-              <w:right w:w="90" w:type="dxa"/>
-            </w:tcMar>
-            <w:vAlign w:val="center"/>
-          </w:tcPr>
-          <w:p>
-            <w:pPr>
-              <w:spacing w:before="30" w:after="30"/>
-              <w:jc w:val="center"/>
-            </w:pPr>
-            <w:r/>
-            <w:r>
-              <w:rPr>
-                <w:rFonts w:ascii="Arial" w:hAnsi="Arial"/>
-                <w:b w:val="0"/>
-                <w:color w:val="222222"/>
-                <w:sz w:val="16"/>
-              </w:rPr>
-              <w:t>0.4604</w:t>
-            </w:r>
-          </w:p>
-        </w:tc>
-        <w:tc>
-          <w:tcPr>
-            <w:tcW w:type="dxa" w:w="1440"/>
-            <w:shd w:fill="FBFBFB"/>
-            <w:tcMar>
-              <w:top w:w="60" w:type="dxa"/>
-              <w:bottom w:w="60" w:type="dxa"/>
-              <w:left w:w="90" w:type="dxa"/>
-              <w:right w:w="90" w:type="dxa"/>
-            </w:tcMar>
-            <w:vAlign w:val="center"/>
-          </w:tcPr>
-          <w:p>
-            <w:pPr>
-              <w:spacing w:before="30" w:after="30"/>
-              <w:jc w:val="center"/>
-            </w:pPr>
-            <w:r/>
-            <w:r>
-              <w:rPr>
-                <w:rFonts w:ascii="Arial" w:hAnsi="Arial"/>
-                <w:b w:val="0"/>
-                <w:color w:val="222222"/>
-                <w:sz w:val="16"/>
-              </w:rPr>
-              <w:t>0.4574</w:t>
-            </w:r>
-          </w:p>
-        </w:tc>
-      </w:tr>
-      <w:tr>
-        <w:tc>
-          <w:tcPr>
-            <w:tcW w:type="dxa" w:w="1584"/>
-            <w:shd w:fill="FFFFFF"/>
-            <w:tcMar>
-              <w:top w:w="60" w:type="dxa"/>
-              <w:bottom w:w="60" w:type="dxa"/>
-              <w:left w:w="90" w:type="dxa"/>
-              <w:right w:w="90" w:type="dxa"/>
-            </w:tcMar>
-            <w:vAlign w:val="center"/>
-          </w:tcPr>
-          <w:p>
-            <w:pPr>
-              <w:spacing w:before="30" w:after="30"/>
-              <w:jc w:val="left"/>
-            </w:pPr>
-            <w:r/>
-            <w:r>
-              <w:rPr>
-                <w:rFonts w:ascii="Arial" w:hAnsi="Arial"/>
-                <w:b/>
-                <w:color w:val="222222"/>
-                <w:sz w:val="16"/>
-              </w:rPr>
-              <w:t>Dx</w:t>
-            </w:r>
-          </w:p>
-        </w:tc>
-        <w:tc>
-          <w:tcPr>
-            <w:tcW w:type="dxa" w:w="1008"/>
-            <w:shd w:fill="FFFFFF"/>
-            <w:tcMar>
-              <w:top w:w="60" w:type="dxa"/>
-              <w:bottom w:w="60" w:type="dxa"/>
-              <w:left w:w="90" w:type="dxa"/>
-              <w:right w:w="90" w:type="dxa"/>
-            </w:tcMar>
-            <w:vAlign w:val="center"/>
-          </w:tcPr>
-          <w:p>
-            <w:pPr>
-              <w:spacing w:before="30" w:after="30"/>
-              <w:jc w:val="center"/>
-            </w:pPr>
-            <w:r/>
-            <w:r>
-              <w:rPr>
-                <w:rFonts w:ascii="Arial" w:hAnsi="Arial"/>
-                <w:b w:val="0"/>
-                <w:color w:val="222222"/>
-                <w:sz w:val="16"/>
-              </w:rPr>
-              <w:t>64</w:t>
-            </w:r>
-          </w:p>
-        </w:tc>
-        <w:tc>
-          <w:tcPr>
-            <w:tcW w:type="dxa" w:w="1296"/>
-            <w:shd w:fill="FFFFFF"/>
-            <w:tcMar>
-              <w:top w:w="60" w:type="dxa"/>
-              <w:bottom w:w="60" w:type="dxa"/>
-              <w:left w:w="90" w:type="dxa"/>
-              <w:right w:w="90" w:type="dxa"/>
-            </w:tcMar>
-            <w:vAlign w:val="center"/>
-          </w:tcPr>
-          <w:p>
-            <w:pPr>
-              <w:spacing w:before="30" w:after="30"/>
-              <w:jc w:val="center"/>
-            </w:pPr>
-            <w:r/>
-            <w:r>
-              <w:rPr>
-                <w:rFonts w:ascii="Arial" w:hAnsi="Arial"/>
-                <w:b w:val="0"/>
-                <w:color w:val="222222"/>
-                <w:sz w:val="16"/>
-              </w:rPr>
-              <w:t>0.0670</w:t>
-            </w:r>
-          </w:p>
-        </w:tc>
-        <w:tc>
-          <w:tcPr>
-            <w:tcW w:type="dxa" w:w="1296"/>
-            <w:shd w:fill="FFFFFF"/>
-            <w:tcMar>
-              <w:top w:w="60" w:type="dxa"/>
-              <w:bottom w:w="60" w:type="dxa"/>
-              <w:left w:w="90" w:type="dxa"/>
-              <w:right w:w="90" w:type="dxa"/>
-            </w:tcMar>
-            <w:vAlign w:val="center"/>
-          </w:tcPr>
-          <w:p>
-            <w:pPr>
-              <w:spacing w:before="30" w:after="30"/>
-              <w:jc w:val="center"/>
-            </w:pPr>
-            <w:r/>
-            <w:r>
-              <w:rPr>
-                <w:rFonts w:ascii="Arial" w:hAnsi="Arial"/>
-                <w:b w:val="0"/>
-                <w:color w:val="222222"/>
-                <w:sz w:val="16"/>
-              </w:rPr>
-              <w:t>0.0016</w:t>
-            </w:r>
-          </w:p>
-        </w:tc>
-        <w:tc>
-          <w:tcPr>
-            <w:tcW w:type="dxa" w:w="1440"/>
-            <w:shd w:fill="FFFFFF"/>
-            <w:tcMar>
-              <w:top w:w="60" w:type="dxa"/>
-              <w:bottom w:w="60" w:type="dxa"/>
-              <w:left w:w="90" w:type="dxa"/>
-              <w:right w:w="90" w:type="dxa"/>
-            </w:tcMar>
-            <w:vAlign w:val="center"/>
-          </w:tcPr>
-          <w:p>
-            <w:pPr>
-              <w:spacing w:before="30" w:after="30"/>
-              <w:jc w:val="center"/>
-            </w:pPr>
-            <w:r/>
-            <w:r>
-              <w:rPr>
-                <w:rFonts w:ascii="Arial" w:hAnsi="Arial"/>
-                <w:b w:val="0"/>
-                <w:color w:val="222222"/>
-                <w:sz w:val="16"/>
-              </w:rPr>
-              <w:t>0.0000</w:t>
-            </w:r>
-          </w:p>
-        </w:tc>
-        <w:tc>
-          <w:tcPr>
-            <w:tcW w:type="dxa" w:w="1296"/>
-            <w:shd w:fill="FFFFFF"/>
-            <w:tcMar>
-              <w:top w:w="60" w:type="dxa"/>
-              <w:bottom w:w="60" w:type="dxa"/>
-              <w:left w:w="90" w:type="dxa"/>
-              <w:right w:w="90" w:type="dxa"/>
-            </w:tcMar>
-            <w:vAlign w:val="center"/>
-          </w:tcPr>
-          <w:p>
-            <w:pPr>
-              <w:spacing w:before="30" w:after="30"/>
-              <w:jc w:val="center"/>
-            </w:pPr>
-            <w:r/>
-            <w:r>
-              <w:rPr>
-                <w:rFonts w:ascii="Arial" w:hAnsi="Arial"/>
-                <w:b w:val="0"/>
-                <w:color w:val="222222"/>
-                <w:sz w:val="16"/>
-              </w:rPr>
-              <w:t>0.4536</w:t>
-            </w:r>
-          </w:p>
-        </w:tc>
-        <w:tc>
-          <w:tcPr>
-            <w:tcW w:type="dxa" w:w="1296"/>
-            <w:shd w:fill="FFFFFF"/>
-            <w:tcMar>
-              <w:top w:w="60" w:type="dxa"/>
-              <w:bottom w:w="60" w:type="dxa"/>
-              <w:left w:w="90" w:type="dxa"/>
-              <w:right w:w="90" w:type="dxa"/>
-            </w:tcMar>
-            <w:vAlign w:val="center"/>
-          </w:tcPr>
-          <w:p>
-            <w:pPr>
-              <w:spacing w:before="30" w:after="30"/>
-              <w:jc w:val="center"/>
-            </w:pPr>
-            <w:r/>
-            <w:r>
-              <w:rPr>
-                <w:rFonts w:ascii="Arial" w:hAnsi="Arial"/>
-                <w:b w:val="0"/>
-                <w:color w:val="222222"/>
-                <w:sz w:val="16"/>
-              </w:rPr>
-              <w:t>0.4016</w:t>
-            </w:r>
-          </w:p>
-        </w:tc>
-        <w:tc>
-          <w:tcPr>
-            <w:tcW w:type="dxa" w:w="1440"/>
-            <w:shd w:fill="FFFFFF"/>
-            <w:tcMar>
-              <w:top w:w="60" w:type="dxa"/>
-              <w:bottom w:w="60" w:type="dxa"/>
-              <w:left w:w="90" w:type="dxa"/>
-              <w:right w:w="90" w:type="dxa"/>
-            </w:tcMar>
-            <w:vAlign w:val="center"/>
-          </w:tcPr>
-          <w:p>
-            <w:pPr>
-              <w:spacing w:before="30" w:after="30"/>
-              <w:jc w:val="center"/>
-            </w:pPr>
-            <w:r/>
-            <w:r>
-              <w:rPr>
-                <w:rFonts w:ascii="Arial" w:hAnsi="Arial"/>
-                <w:b w:val="0"/>
-                <w:color w:val="222222"/>
-                <w:sz w:val="16"/>
-              </w:rPr>
-              <w:t>0.3704</w:t>
-            </w:r>
-          </w:p>
-        </w:tc>
-      </w:tr>
-      <w:tr>
-        <w:tc>
-          <w:tcPr>
-            <w:tcW w:type="dxa" w:w="1584"/>
-            <w:shd w:fill="FBFBFB"/>
-            <w:tcMar>
-              <w:top w:w="60" w:type="dxa"/>
-              <w:bottom w:w="60" w:type="dxa"/>
-              <w:left w:w="90" w:type="dxa"/>
-              <w:right w:w="90" w:type="dxa"/>
-            </w:tcMar>
-            <w:vAlign w:val="center"/>
-          </w:tcPr>
-          <w:p>
-            <w:pPr>
-              <w:spacing w:before="30" w:after="30"/>
-              <w:jc w:val="left"/>
-            </w:pPr>
-            <w:r/>
-            <w:r>
-              <w:rPr>
-                <w:rFonts w:ascii="Arial" w:hAnsi="Arial"/>
-                <w:b/>
-                <w:color w:val="222222"/>
-                <w:sz w:val="16"/>
-              </w:rPr>
-              <w:t>Lab</w:t>
-            </w:r>
-          </w:p>
-        </w:tc>
-        <w:tc>
-          <w:tcPr>
-            <w:tcW w:type="dxa" w:w="1008"/>
-            <w:shd w:fill="FBFBFB"/>
-            <w:tcMar>
-              <w:top w:w="60" w:type="dxa"/>
-              <w:bottom w:w="60" w:type="dxa"/>
-              <w:left w:w="90" w:type="dxa"/>
-              <w:right w:w="90" w:type="dxa"/>
-            </w:tcMar>
-            <w:vAlign w:val="center"/>
-          </w:tcPr>
-          <w:p>
-            <w:pPr>
-              <w:spacing w:before="30" w:after="30"/>
-              <w:jc w:val="center"/>
-            </w:pPr>
-            <w:r/>
-            <w:r>
-              <w:rPr>
-                <w:rFonts w:ascii="Arial" w:hAnsi="Arial"/>
-                <w:b w:val="0"/>
-                <w:color w:val="222222"/>
-                <w:sz w:val="16"/>
-              </w:rPr>
-              <w:t>3,482</w:t>
-            </w:r>
-          </w:p>
-        </w:tc>
-        <w:tc>
-          <w:tcPr>
-            <w:tcW w:type="dxa" w:w="1296"/>
-            <w:shd w:fill="FBFBFB"/>
-            <w:tcMar>
-              <w:top w:w="60" w:type="dxa"/>
-              <w:bottom w:w="60" w:type="dxa"/>
-              <w:left w:w="90" w:type="dxa"/>
-              <w:right w:w="90" w:type="dxa"/>
-            </w:tcMar>
-            <w:vAlign w:val="center"/>
-          </w:tcPr>
-          <w:p>
-            <w:pPr>
-              <w:spacing w:before="30" w:after="30"/>
-              <w:jc w:val="center"/>
-            </w:pPr>
-            <w:r/>
-            <w:r>
-              <w:rPr>
-                <w:rFonts w:ascii="Arial" w:hAnsi="Arial"/>
-                <w:b w:val="0"/>
-                <w:color w:val="222222"/>
-                <w:sz w:val="16"/>
-              </w:rPr>
-              <w:t>0.5964</w:t>
-            </w:r>
-          </w:p>
-        </w:tc>
-        <w:tc>
-          <w:tcPr>
-            <w:tcW w:type="dxa" w:w="1296"/>
-            <w:shd w:fill="FBFBFB"/>
-            <w:tcMar>
-              <w:top w:w="60" w:type="dxa"/>
-              <w:bottom w:w="60" w:type="dxa"/>
-              <w:left w:w="90" w:type="dxa"/>
-              <w:right w:w="90" w:type="dxa"/>
-            </w:tcMar>
-            <w:vAlign w:val="center"/>
-          </w:tcPr>
-          <w:p>
-            <w:pPr>
-              <w:spacing w:before="30" w:after="30"/>
-              <w:jc w:val="center"/>
-            </w:pPr>
-            <w:r/>
-            <w:r>
-              <w:rPr>
-                <w:rFonts w:ascii="Arial" w:hAnsi="Arial"/>
-                <w:b w:val="0"/>
-                <w:color w:val="222222"/>
-                <w:sz w:val="16"/>
-              </w:rPr>
-              <w:t>0.1575</w:t>
-            </w:r>
-          </w:p>
-        </w:tc>
-        <w:tc>
-          <w:tcPr>
-            <w:tcW w:type="dxa" w:w="1440"/>
-            <w:shd w:fill="FBFBFB"/>
-            <w:tcMar>
-              <w:top w:w="60" w:type="dxa"/>
-              <w:bottom w:w="60" w:type="dxa"/>
-              <w:left w:w="90" w:type="dxa"/>
-              <w:right w:w="90" w:type="dxa"/>
-            </w:tcMar>
-            <w:vAlign w:val="center"/>
-          </w:tcPr>
-          <w:p>
-            <w:pPr>
-              <w:spacing w:before="30" w:after="30"/>
-              <w:jc w:val="center"/>
-            </w:pPr>
-            <w:r/>
-            <w:r>
-              <w:rPr>
-                <w:rFonts w:ascii="Arial" w:hAnsi="Arial"/>
-                <w:b w:val="0"/>
-                <w:color w:val="222222"/>
-                <w:sz w:val="16"/>
-              </w:rPr>
-              <w:t>0.3742</w:t>
-            </w:r>
-          </w:p>
-        </w:tc>
-        <w:tc>
-          <w:tcPr>
-            <w:tcW w:type="dxa" w:w="1296"/>
-            <w:shd w:fill="FBFBFB"/>
-            <w:tcMar>
-              <w:top w:w="60" w:type="dxa"/>
-              <w:bottom w:w="60" w:type="dxa"/>
-              <w:left w:w="90" w:type="dxa"/>
-              <w:right w:w="90" w:type="dxa"/>
-            </w:tcMar>
-            <w:vAlign w:val="center"/>
-          </w:tcPr>
-          <w:p>
-            <w:pPr>
-              <w:spacing w:before="30" w:after="30"/>
-              <w:jc w:val="center"/>
-            </w:pPr>
-            <w:r/>
-            <w:r>
-              <w:rPr>
-                <w:rFonts w:ascii="Arial" w:hAnsi="Arial"/>
-                <w:b w:val="0"/>
-                <w:color w:val="222222"/>
-                <w:sz w:val="16"/>
-              </w:rPr>
-              <w:t>0.7637</w:t>
-            </w:r>
-          </w:p>
-        </w:tc>
-        <w:tc>
-          <w:tcPr>
-            <w:tcW w:type="dxa" w:w="1296"/>
-            <w:shd w:fill="FBFBFB"/>
-            <w:tcMar>
-              <w:top w:w="60" w:type="dxa"/>
-              <w:bottom w:w="60" w:type="dxa"/>
-              <w:left w:w="90" w:type="dxa"/>
-              <w:right w:w="90" w:type="dxa"/>
-            </w:tcMar>
-            <w:vAlign w:val="center"/>
-          </w:tcPr>
-          <w:p>
-            <w:pPr>
-              <w:spacing w:before="30" w:after="30"/>
-              <w:jc w:val="center"/>
-            </w:pPr>
-            <w:r/>
-            <w:r>
-              <w:rPr>
-                <w:rFonts w:ascii="Arial" w:hAnsi="Arial"/>
-                <w:b w:val="0"/>
-                <w:color w:val="222222"/>
-                <w:sz w:val="16"/>
-              </w:rPr>
-              <w:t>0.4912</w:t>
-            </w:r>
-          </w:p>
-        </w:tc>
-        <w:tc>
-          <w:tcPr>
-            <w:tcW w:type="dxa" w:w="1440"/>
-            <w:shd w:fill="FBFBFB"/>
-            <w:tcMar>
-              <w:top w:w="60" w:type="dxa"/>
-              <w:bottom w:w="60" w:type="dxa"/>
-              <w:left w:w="90" w:type="dxa"/>
-              <w:right w:w="90" w:type="dxa"/>
-            </w:tcMar>
-            <w:vAlign w:val="center"/>
-          </w:tcPr>
-          <w:p>
-            <w:pPr>
-              <w:spacing w:before="30" w:after="30"/>
-              <w:jc w:val="center"/>
-            </w:pPr>
-            <w:r/>
-            <w:r>
-              <w:rPr>
-                <w:rFonts w:ascii="Arial" w:hAnsi="Arial"/>
-                <w:b w:val="0"/>
-                <w:color w:val="222222"/>
-                <w:sz w:val="16"/>
-              </w:rPr>
-              <w:t>0.6105</w:t>
-            </w:r>
-          </w:p>
-        </w:tc>
-      </w:tr>
-      <w:tr>
-        <w:tc>
-          <w:tcPr>
-            <w:tcW w:type="dxa" w:w="1584"/>
-            <w:shd w:fill="FFFFFF"/>
-            <w:tcMar>
-              <w:top w:w="60" w:type="dxa"/>
-              <w:bottom w:w="60" w:type="dxa"/>
-              <w:left w:w="90" w:type="dxa"/>
-              <w:right w:w="90" w:type="dxa"/>
-            </w:tcMar>
-            <w:vAlign w:val="center"/>
-          </w:tcPr>
-          <w:p>
-            <w:pPr>
-              <w:spacing w:before="30" w:after="30"/>
-              <w:jc w:val="left"/>
-            </w:pPr>
-            <w:r/>
-            <w:r>
-              <w:rPr>
-                <w:rFonts w:ascii="Arial" w:hAnsi="Arial"/>
-                <w:b/>
-                <w:color w:val="222222"/>
-                <w:sz w:val="16"/>
-              </w:rPr>
-              <w:t>Status</w:t>
-            </w:r>
-          </w:p>
-        </w:tc>
-        <w:tc>
-          <w:tcPr>
-            <w:tcW w:type="dxa" w:w="1008"/>
-            <w:shd w:fill="FFFFFF"/>
-            <w:tcMar>
-              <w:top w:w="60" w:type="dxa"/>
-              <w:bottom w:w="60" w:type="dxa"/>
-              <w:left w:w="90" w:type="dxa"/>
-              <w:right w:w="90" w:type="dxa"/>
-            </w:tcMar>
-            <w:vAlign w:val="center"/>
-          </w:tcPr>
-          <w:p>
-            <w:pPr>
-              <w:spacing w:before="30" w:after="30"/>
-              <w:jc w:val="center"/>
-            </w:pPr>
-            <w:r/>
-            <w:r>
-              <w:rPr>
-                <w:rFonts w:ascii="Arial" w:hAnsi="Arial"/>
-                <w:b w:val="0"/>
-                <w:color w:val="222222"/>
-                <w:sz w:val="16"/>
-              </w:rPr>
-              <w:t>1,910</w:t>
-            </w:r>
-          </w:p>
-        </w:tc>
-        <w:tc>
-          <w:tcPr>
-            <w:tcW w:type="dxa" w:w="1296"/>
-            <w:shd w:fill="FFFFFF"/>
-            <w:tcMar>
-              <w:top w:w="60" w:type="dxa"/>
-              <w:bottom w:w="60" w:type="dxa"/>
-              <w:left w:w="90" w:type="dxa"/>
-              <w:right w:w="90" w:type="dxa"/>
-            </w:tcMar>
-            <w:vAlign w:val="center"/>
-          </w:tcPr>
-          <w:p>
-            <w:pPr>
-              <w:spacing w:before="30" w:after="30"/>
-              <w:jc w:val="center"/>
-            </w:pPr>
-            <w:r/>
-            <w:r>
-              <w:rPr>
-                <w:rFonts w:ascii="Arial" w:hAnsi="Arial"/>
-                <w:b w:val="0"/>
-                <w:color w:val="222222"/>
-                <w:sz w:val="16"/>
-              </w:rPr>
-              <w:t>0.7169</w:t>
-            </w:r>
-          </w:p>
-        </w:tc>
-        <w:tc>
-          <w:tcPr>
-            <w:tcW w:type="dxa" w:w="1296"/>
-            <w:shd w:fill="FFFFFF"/>
-            <w:tcMar>
-              <w:top w:w="60" w:type="dxa"/>
-              <w:bottom w:w="60" w:type="dxa"/>
-              <w:left w:w="90" w:type="dxa"/>
-              <w:right w:w="90" w:type="dxa"/>
-            </w:tcMar>
-            <w:vAlign w:val="center"/>
-          </w:tcPr>
-          <w:p>
-            <w:pPr>
-              <w:spacing w:before="30" w:after="30"/>
-              <w:jc w:val="center"/>
-            </w:pPr>
-            <w:r/>
-            <w:r>
-              <w:rPr>
-                <w:rFonts w:ascii="Arial" w:hAnsi="Arial"/>
-                <w:b w:val="0"/>
-                <w:color w:val="222222"/>
-                <w:sz w:val="16"/>
-              </w:rPr>
-              <w:t>0.1304</w:t>
-            </w:r>
-          </w:p>
-        </w:tc>
-        <w:tc>
-          <w:tcPr>
-            <w:tcW w:type="dxa" w:w="1440"/>
-            <w:shd w:fill="FFFFFF"/>
-            <w:tcMar>
-              <w:top w:w="60" w:type="dxa"/>
-              <w:bottom w:w="60" w:type="dxa"/>
-              <w:left w:w="90" w:type="dxa"/>
-              <w:right w:w="90" w:type="dxa"/>
-            </w:tcMar>
-            <w:vAlign w:val="center"/>
-          </w:tcPr>
-          <w:p>
-            <w:pPr>
-              <w:spacing w:before="30" w:after="30"/>
-              <w:jc w:val="center"/>
-            </w:pPr>
-            <w:r/>
-            <w:r>
-              <w:rPr>
-                <w:rFonts w:ascii="Arial" w:hAnsi="Arial"/>
-                <w:b w:val="0"/>
-                <w:color w:val="222222"/>
-                <w:sz w:val="16"/>
-              </w:rPr>
-              <w:t>0.2741</w:t>
-            </w:r>
-          </w:p>
-        </w:tc>
-        <w:tc>
-          <w:tcPr>
-            <w:tcW w:type="dxa" w:w="1296"/>
-            <w:shd w:fill="FFFFFF"/>
-            <w:tcMar>
-              <w:top w:w="60" w:type="dxa"/>
-              <w:bottom w:w="60" w:type="dxa"/>
-              <w:left w:w="90" w:type="dxa"/>
-              <w:right w:w="90" w:type="dxa"/>
-            </w:tcMar>
-            <w:vAlign w:val="center"/>
-          </w:tcPr>
-          <w:p>
-            <w:pPr>
-              <w:spacing w:before="30" w:after="30"/>
-              <w:jc w:val="center"/>
-            </w:pPr>
-            <w:r/>
-            <w:r>
-              <w:rPr>
-                <w:rFonts w:ascii="Arial" w:hAnsi="Arial"/>
-                <w:b w:val="0"/>
-                <w:color w:val="222222"/>
-                <w:sz w:val="16"/>
-              </w:rPr>
-              <w:t>0.8386</w:t>
-            </w:r>
-          </w:p>
-        </w:tc>
-        <w:tc>
-          <w:tcPr>
-            <w:tcW w:type="dxa" w:w="1296"/>
-            <w:shd w:fill="FFFFFF"/>
-            <w:tcMar>
-              <w:top w:w="60" w:type="dxa"/>
-              <w:bottom w:w="60" w:type="dxa"/>
-              <w:left w:w="90" w:type="dxa"/>
-              <w:right w:w="90" w:type="dxa"/>
-            </w:tcMar>
-            <w:vAlign w:val="center"/>
-          </w:tcPr>
-          <w:p>
-            <w:pPr>
-              <w:spacing w:before="30" w:after="30"/>
-              <w:jc w:val="center"/>
-            </w:pPr>
-            <w:r/>
-            <w:r>
-              <w:rPr>
-                <w:rFonts w:ascii="Arial" w:hAnsi="Arial"/>
-                <w:b w:val="0"/>
-                <w:color w:val="222222"/>
-                <w:sz w:val="16"/>
-              </w:rPr>
-              <w:t>0.2676</w:t>
-            </w:r>
-          </w:p>
-        </w:tc>
-        <w:tc>
-          <w:tcPr>
-            <w:tcW w:type="dxa" w:w="1440"/>
-            <w:shd w:fill="FFFFFF"/>
-            <w:tcMar>
-              <w:top w:w="60" w:type="dxa"/>
-              <w:bottom w:w="60" w:type="dxa"/>
-              <w:left w:w="90" w:type="dxa"/>
-              <w:right w:w="90" w:type="dxa"/>
-            </w:tcMar>
-            <w:vAlign w:val="center"/>
-          </w:tcPr>
-          <w:p>
-            <w:pPr>
-              <w:spacing w:before="30" w:after="30"/>
-              <w:jc w:val="center"/>
-            </w:pPr>
-            <w:r/>
-            <w:r>
-              <w:rPr>
-                <w:rFonts w:ascii="Arial" w:hAnsi="Arial"/>
-                <w:b w:val="0"/>
-                <w:color w:val="222222"/>
-                <w:sz w:val="16"/>
-              </w:rPr>
-              <w:t>0.4547</w:t>
-            </w:r>
-          </w:p>
-        </w:tc>
-      </w:tr>
-      <w:tr>
-        <w:tc>
-          <w:tcPr>
-            <w:tcW w:type="dxa" w:w="1584"/>
-            <w:shd w:fill="FBFBFB"/>
-            <w:tcMar>
-              <w:top w:w="60" w:type="dxa"/>
-              <w:bottom w:w="60" w:type="dxa"/>
-              <w:left w:w="90" w:type="dxa"/>
-              <w:right w:w="90" w:type="dxa"/>
-            </w:tcMar>
-            <w:vAlign w:val="center"/>
-          </w:tcPr>
-          <w:p>
-            <w:pPr>
-              <w:spacing w:before="30" w:after="30"/>
-              <w:jc w:val="left"/>
-            </w:pPr>
-            <w:r/>
-            <w:r>
-              <w:rPr>
-                <w:rFonts w:ascii="Arial" w:hAnsi="Arial"/>
-                <w:b/>
-                <w:color w:val="222222"/>
-                <w:sz w:val="16"/>
-              </w:rPr>
-              <w:t>R/O</w:t>
-            </w:r>
-          </w:p>
-        </w:tc>
-        <w:tc>
-          <w:tcPr>
-            <w:tcW w:type="dxa" w:w="1008"/>
-            <w:shd w:fill="FBFBFB"/>
-            <w:tcMar>
-              <w:top w:w="60" w:type="dxa"/>
-              <w:bottom w:w="60" w:type="dxa"/>
-              <w:left w:w="90" w:type="dxa"/>
-              <w:right w:w="90" w:type="dxa"/>
-            </w:tcMar>
-            <w:vAlign w:val="center"/>
-          </w:tcPr>
-          <w:p>
-            <w:pPr>
-              <w:spacing w:before="30" w:after="30"/>
-              <w:jc w:val="center"/>
-            </w:pPr>
-            <w:r/>
-            <w:r>
-              <w:rPr>
-                <w:rFonts w:ascii="Arial" w:hAnsi="Arial"/>
-                <w:b w:val="0"/>
-                <w:color w:val="222222"/>
-                <w:sz w:val="16"/>
-              </w:rPr>
-              <w:t>9</w:t>
-            </w:r>
-          </w:p>
-        </w:tc>
-        <w:tc>
-          <w:tcPr>
-            <w:tcW w:type="dxa" w:w="1296"/>
-            <w:shd w:fill="FBFBFB"/>
-            <w:tcMar>
-              <w:top w:w="60" w:type="dxa"/>
-              <w:bottom w:w="60" w:type="dxa"/>
-              <w:left w:w="90" w:type="dxa"/>
-              <w:right w:w="90" w:type="dxa"/>
-            </w:tcMar>
-            <w:vAlign w:val="center"/>
-          </w:tcPr>
-          <w:p>
-            <w:pPr>
-              <w:spacing w:before="30" w:after="30"/>
-              <w:jc w:val="center"/>
-            </w:pPr>
-            <w:r/>
-            <w:r>
-              <w:rPr>
-                <w:rFonts w:ascii="Arial" w:hAnsi="Arial"/>
-                <w:b w:val="0"/>
-                <w:color w:val="222222"/>
-                <w:sz w:val="16"/>
-              </w:rPr>
-              <w:t>0.0000</w:t>
-            </w:r>
-          </w:p>
-        </w:tc>
-        <w:tc>
-          <w:tcPr>
-            <w:tcW w:type="dxa" w:w="1296"/>
-            <w:shd w:fill="FBFBFB"/>
-            <w:tcMar>
-              <w:top w:w="60" w:type="dxa"/>
-              <w:bottom w:w="60" w:type="dxa"/>
-              <w:left w:w="90" w:type="dxa"/>
-              <w:right w:w="90" w:type="dxa"/>
-            </w:tcMar>
-            <w:vAlign w:val="center"/>
-          </w:tcPr>
-          <w:p>
-            <w:pPr>
-              <w:spacing w:before="30" w:after="30"/>
-              <w:jc w:val="center"/>
-            </w:pPr>
-            <w:r/>
-            <w:r>
-              <w:rPr>
-                <w:rFonts w:ascii="Arial" w:hAnsi="Arial"/>
-                <w:b w:val="0"/>
-                <w:color w:val="222222"/>
-                <w:sz w:val="16"/>
-              </w:rPr>
-              <w:t>0.0073</w:t>
-            </w:r>
-          </w:p>
-        </w:tc>
-        <w:tc>
-          <w:tcPr>
-            <w:tcW w:type="dxa" w:w="1440"/>
-            <w:shd w:fill="FBFBFB"/>
-            <w:tcMar>
-              <w:top w:w="60" w:type="dxa"/>
-              <w:bottom w:w="60" w:type="dxa"/>
-              <w:left w:w="90" w:type="dxa"/>
-              <w:right w:w="90" w:type="dxa"/>
-            </w:tcMar>
-            <w:vAlign w:val="center"/>
-          </w:tcPr>
-          <w:p>
-            <w:pPr>
-              <w:spacing w:before="30" w:after="30"/>
-              <w:jc w:val="center"/>
-            </w:pPr>
-            <w:r/>
-            <w:r>
-              <w:rPr>
-                <w:rFonts w:ascii="Arial" w:hAnsi="Arial"/>
-                <w:b w:val="0"/>
-                <w:color w:val="222222"/>
-                <w:sz w:val="16"/>
-              </w:rPr>
-              <w:t>0.0094</w:t>
-            </w:r>
-          </w:p>
-        </w:tc>
-        <w:tc>
-          <w:tcPr>
-            <w:tcW w:type="dxa" w:w="1296"/>
-            <w:shd w:fill="FBFBFB"/>
-            <w:tcMar>
-              <w:top w:w="60" w:type="dxa"/>
-              <w:bottom w:w="60" w:type="dxa"/>
-              <w:left w:w="90" w:type="dxa"/>
-              <w:right w:w="90" w:type="dxa"/>
-            </w:tcMar>
-            <w:vAlign w:val="center"/>
-          </w:tcPr>
-          <w:p>
-            <w:pPr>
-              <w:spacing w:before="30" w:after="30"/>
-              <w:jc w:val="center"/>
-            </w:pPr>
-            <w:r/>
-            <w:r>
-              <w:rPr>
-                <w:rFonts w:ascii="Arial" w:hAnsi="Arial"/>
-                <w:b w:val="0"/>
-                <w:color w:val="222222"/>
-                <w:sz w:val="16"/>
-              </w:rPr>
-              <w:t>0.0000</w:t>
-            </w:r>
-          </w:p>
-        </w:tc>
-        <w:tc>
-          <w:tcPr>
-            <w:tcW w:type="dxa" w:w="1296"/>
-            <w:shd w:fill="FBFBFB"/>
-            <w:tcMar>
-              <w:top w:w="60" w:type="dxa"/>
-              <w:bottom w:w="60" w:type="dxa"/>
-              <w:left w:w="90" w:type="dxa"/>
-              <w:right w:w="90" w:type="dxa"/>
-            </w:tcMar>
-            <w:vAlign w:val="center"/>
-          </w:tcPr>
-          <w:p>
-            <w:pPr>
-              <w:spacing w:before="30" w:after="30"/>
-              <w:jc w:val="center"/>
-            </w:pPr>
-            <w:r/>
-            <w:r>
-              <w:rPr>
-                <w:rFonts w:ascii="Arial" w:hAnsi="Arial"/>
-                <w:b w:val="0"/>
-                <w:color w:val="222222"/>
-                <w:sz w:val="16"/>
-              </w:rPr>
-              <w:t>0.4444</w:t>
-            </w:r>
-          </w:p>
-        </w:tc>
-        <w:tc>
-          <w:tcPr>
-            <w:tcW w:type="dxa" w:w="1440"/>
-            <w:shd w:fill="FBFBFB"/>
-            <w:tcMar>
-              <w:top w:w="60" w:type="dxa"/>
-              <w:bottom w:w="60" w:type="dxa"/>
-              <w:left w:w="90" w:type="dxa"/>
-              <w:right w:w="90" w:type="dxa"/>
-            </w:tcMar>
-            <w:vAlign w:val="center"/>
-          </w:tcPr>
-          <w:p>
-            <w:pPr>
-              <w:spacing w:before="30" w:after="30"/>
-              <w:jc w:val="center"/>
-            </w:pPr>
-            <w:r/>
-            <w:r>
-              <w:rPr>
-                <w:rFonts w:ascii="Arial" w:hAnsi="Arial"/>
-                <w:b w:val="0"/>
-                <w:color w:val="222222"/>
-                <w:sz w:val="16"/>
-              </w:rPr>
-              <w:t>0.4539</w:t>
-            </w:r>
-          </w:p>
-        </w:tc>
-      </w:tr>
-      <w:tr>
-        <w:tc>
-          <w:tcPr>
-            <w:tcW w:type="dxa" w:w="1584"/>
-            <w:shd w:fill="FFFFFF"/>
-            <w:tcMar>
-              <w:top w:w="60" w:type="dxa"/>
-              <w:bottom w:w="60" w:type="dxa"/>
-              <w:left w:w="90" w:type="dxa"/>
-              <w:right w:w="90" w:type="dxa"/>
-            </w:tcMar>
-            <w:vAlign w:val="center"/>
-          </w:tcPr>
-          <w:p>
-            <w:pPr>
-              <w:spacing w:before="30" w:after="30"/>
-              <w:jc w:val="left"/>
-            </w:pPr>
-            <w:r/>
-            <w:r>
-              <w:rPr>
-                <w:rFonts w:ascii="Arial" w:hAnsi="Arial"/>
-                <w:b/>
-                <w:color w:val="222222"/>
-                <w:sz w:val="16"/>
-              </w:rPr>
-              <w:t>CoD</w:t>
-            </w:r>
-          </w:p>
-        </w:tc>
-        <w:tc>
-          <w:tcPr>
-            <w:tcW w:type="dxa" w:w="1008"/>
-            <w:shd w:fill="FFFFFF"/>
-            <w:tcMar>
-              <w:top w:w="60" w:type="dxa"/>
-              <w:bottom w:w="60" w:type="dxa"/>
-              <w:left w:w="90" w:type="dxa"/>
-              <w:right w:w="90" w:type="dxa"/>
-            </w:tcMar>
-            <w:vAlign w:val="center"/>
-          </w:tcPr>
-          <w:p>
-            <w:pPr>
-              <w:spacing w:before="30" w:after="30"/>
-              <w:jc w:val="center"/>
-            </w:pPr>
-            <w:r/>
-            <w:r>
-              <w:rPr>
-                <w:rFonts w:ascii="Arial" w:hAnsi="Arial"/>
-                <w:b w:val="0"/>
-                <w:color w:val="222222"/>
-                <w:sz w:val="16"/>
-              </w:rPr>
-              <w:t>3</w:t>
-            </w:r>
-          </w:p>
-        </w:tc>
-        <w:tc>
-          <w:tcPr>
-            <w:tcW w:type="dxa" w:w="1296"/>
-            <w:shd w:fill="FFFFFF"/>
-            <w:tcMar>
-              <w:top w:w="60" w:type="dxa"/>
-              <w:bottom w:w="60" w:type="dxa"/>
-              <w:left w:w="90" w:type="dxa"/>
-              <w:right w:w="90" w:type="dxa"/>
-            </w:tcMar>
-            <w:vAlign w:val="center"/>
-          </w:tcPr>
-          <w:p>
-            <w:pPr>
-              <w:spacing w:before="30" w:after="30"/>
-              <w:jc w:val="center"/>
-            </w:pPr>
-            <w:r/>
-            <w:r>
-              <w:rPr>
-                <w:rFonts w:ascii="Arial" w:hAnsi="Arial"/>
-                <w:b w:val="0"/>
-                <w:color w:val="222222"/>
-                <w:sz w:val="16"/>
-              </w:rPr>
-              <w:t>0.0000</w:t>
-            </w:r>
-          </w:p>
-        </w:tc>
-        <w:tc>
-          <w:tcPr>
-            <w:tcW w:type="dxa" w:w="1296"/>
-            <w:shd w:fill="FFFFFF"/>
-            <w:tcMar>
-              <w:top w:w="60" w:type="dxa"/>
-              <w:bottom w:w="60" w:type="dxa"/>
-              <w:left w:w="90" w:type="dxa"/>
-              <w:right w:w="90" w:type="dxa"/>
-            </w:tcMar>
-            <w:vAlign w:val="center"/>
-          </w:tcPr>
-          <w:p>
-            <w:pPr>
-              <w:spacing w:before="30" w:after="30"/>
-              <w:jc w:val="center"/>
-            </w:pPr>
-            <w:r/>
-            <w:r>
-              <w:rPr>
-                <w:rFonts w:ascii="Arial" w:hAnsi="Arial"/>
-                <w:b w:val="0"/>
-                <w:color w:val="222222"/>
-                <w:sz w:val="16"/>
-              </w:rPr>
-              <w:t>0.0052</w:t>
-            </w:r>
-          </w:p>
-        </w:tc>
-        <w:tc>
-          <w:tcPr>
-            <w:tcW w:type="dxa" w:w="1440"/>
-            <w:shd w:fill="FFFFFF"/>
-            <w:tcMar>
-              <w:top w:w="60" w:type="dxa"/>
-              <w:bottom w:w="60" w:type="dxa"/>
-              <w:left w:w="90" w:type="dxa"/>
-              <w:right w:w="90" w:type="dxa"/>
-            </w:tcMar>
-            <w:vAlign w:val="center"/>
-          </w:tcPr>
-          <w:p>
-            <w:pPr>
-              <w:spacing w:before="30" w:after="30"/>
-              <w:jc w:val="center"/>
-            </w:pPr>
-            <w:r/>
-            <w:r>
-              <w:rPr>
-                <w:rFonts w:ascii="Arial" w:hAnsi="Arial"/>
-                <w:b w:val="0"/>
-                <w:color w:val="222222"/>
-                <w:sz w:val="16"/>
-              </w:rPr>
-              <w:t>0.0165</w:t>
-            </w:r>
-          </w:p>
-        </w:tc>
-        <w:tc>
-          <w:tcPr>
-            <w:tcW w:type="dxa" w:w="1296"/>
-            <w:shd w:fill="FFFFFF"/>
-            <w:tcMar>
-              <w:top w:w="60" w:type="dxa"/>
-              <w:bottom w:w="60" w:type="dxa"/>
-              <w:left w:w="90" w:type="dxa"/>
-              <w:right w:w="90" w:type="dxa"/>
-            </w:tcMar>
-            <w:vAlign w:val="center"/>
-          </w:tcPr>
-          <w:p>
-            <w:pPr>
-              <w:spacing w:before="30" w:after="30"/>
-              <w:jc w:val="center"/>
-            </w:pPr>
-            <w:r/>
-            <w:r>
-              <w:rPr>
-                <w:rFonts w:ascii="Arial" w:hAnsi="Arial"/>
-                <w:b w:val="0"/>
-                <w:color w:val="222222"/>
-                <w:sz w:val="16"/>
-              </w:rPr>
-              <w:t>0.0000</w:t>
-            </w:r>
-          </w:p>
-        </w:tc>
-        <w:tc>
-          <w:tcPr>
-            <w:tcW w:type="dxa" w:w="1296"/>
-            <w:shd w:fill="FFFFFF"/>
-            <w:tcMar>
-              <w:top w:w="60" w:type="dxa"/>
-              <w:bottom w:w="60" w:type="dxa"/>
-              <w:left w:w="90" w:type="dxa"/>
-              <w:right w:w="90" w:type="dxa"/>
-            </w:tcMar>
-            <w:vAlign w:val="center"/>
-          </w:tcPr>
-          <w:p>
-            <w:pPr>
-              <w:spacing w:before="30" w:after="30"/>
-              <w:jc w:val="center"/>
-            </w:pPr>
-            <w:r/>
-            <w:r>
-              <w:rPr>
-                <w:rFonts w:ascii="Arial" w:hAnsi="Arial"/>
-                <w:b w:val="0"/>
-                <w:color w:val="222222"/>
-                <w:sz w:val="16"/>
-              </w:rPr>
-              <w:t>0.4610</w:t>
-            </w:r>
-          </w:p>
-        </w:tc>
-        <w:tc>
-          <w:tcPr>
-            <w:tcW w:type="dxa" w:w="1440"/>
-            <w:shd w:fill="FFFFFF"/>
-            <w:tcMar>
-              <w:top w:w="60" w:type="dxa"/>
-              <w:bottom w:w="60" w:type="dxa"/>
-              <w:left w:w="90" w:type="dxa"/>
-              <w:right w:w="90" w:type="dxa"/>
-            </w:tcMar>
-            <w:vAlign w:val="center"/>
-          </w:tcPr>
-          <w:p>
-            <w:pPr>
-              <w:spacing w:before="30" w:after="30"/>
-              <w:jc w:val="center"/>
-            </w:pPr>
-            <w:r/>
-            <w:r>
-              <w:rPr>
-                <w:rFonts w:ascii="Arial" w:hAnsi="Arial"/>
-                <w:b w:val="0"/>
-                <w:color w:val="222222"/>
-                <w:sz w:val="16"/>
-              </w:rPr>
-              <w:t>0.4686</w:t>
-            </w:r>
-          </w:p>
-        </w:tc>
-      </w:tr>
-      <w:tr>
-        <w:tc>
-          <w:tcPr>
-            <w:tcW w:type="dxa" w:w="1584"/>
-            <w:shd w:fill="FBFBFB"/>
-            <w:tcMar>
-              <w:top w:w="60" w:type="dxa"/>
-              <w:bottom w:w="60" w:type="dxa"/>
-              <w:left w:w="90" w:type="dxa"/>
-              <w:right w:w="90" w:type="dxa"/>
-            </w:tcMar>
-            <w:vAlign w:val="center"/>
-          </w:tcPr>
-          <w:p>
-            <w:pPr>
-              <w:spacing w:before="30" w:after="30"/>
-              <w:jc w:val="left"/>
-            </w:pPr>
-            <w:r/>
-            <w:r>
-              <w:rPr>
-                <w:rFonts w:ascii="Arial" w:hAnsi="Arial"/>
-                <w:b/>
-                <w:color w:val="222222"/>
-                <w:sz w:val="16"/>
-              </w:rPr>
-              <w:t>MHx</w:t>
-            </w:r>
-          </w:p>
-        </w:tc>
-        <w:tc>
-          <w:tcPr>
-            <w:tcW w:type="dxa" w:w="1008"/>
-            <w:shd w:fill="FBFBFB"/>
-            <w:tcMar>
-              <w:top w:w="60" w:type="dxa"/>
-              <w:bottom w:w="60" w:type="dxa"/>
-              <w:left w:w="90" w:type="dxa"/>
-              <w:right w:w="90" w:type="dxa"/>
-            </w:tcMar>
-            <w:vAlign w:val="center"/>
-          </w:tcPr>
-          <w:p>
-            <w:pPr>
-              <w:spacing w:before="30" w:after="30"/>
-              <w:jc w:val="center"/>
-            </w:pPr>
-            <w:r/>
-            <w:r>
-              <w:rPr>
-                <w:rFonts w:ascii="Arial" w:hAnsi="Arial"/>
-                <w:b w:val="0"/>
-                <w:color w:val="222222"/>
-                <w:sz w:val="16"/>
-              </w:rPr>
-              <w:t>2,370</w:t>
-            </w:r>
-          </w:p>
-        </w:tc>
-        <w:tc>
-          <w:tcPr>
-            <w:tcW w:type="dxa" w:w="1296"/>
-            <w:shd w:fill="FBFBFB"/>
-            <w:tcMar>
-              <w:top w:w="60" w:type="dxa"/>
-              <w:bottom w:w="60" w:type="dxa"/>
-              <w:left w:w="90" w:type="dxa"/>
-              <w:right w:w="90" w:type="dxa"/>
-            </w:tcMar>
-            <w:vAlign w:val="center"/>
-          </w:tcPr>
-          <w:p>
-            <w:pPr>
-              <w:spacing w:before="30" w:after="30"/>
-              <w:jc w:val="center"/>
-            </w:pPr>
-            <w:r/>
-            <w:r>
-              <w:rPr>
-                <w:rFonts w:ascii="Arial" w:hAnsi="Arial"/>
-                <w:b w:val="0"/>
-                <w:color w:val="222222"/>
-                <w:sz w:val="16"/>
-              </w:rPr>
-              <w:t>0.4621</w:t>
-            </w:r>
-          </w:p>
-        </w:tc>
-        <w:tc>
-          <w:tcPr>
-            <w:tcW w:type="dxa" w:w="1296"/>
-            <w:shd w:fill="FBFBFB"/>
-            <w:tcMar>
-              <w:top w:w="60" w:type="dxa"/>
-              <w:bottom w:w="60" w:type="dxa"/>
-              <w:left w:w="90" w:type="dxa"/>
-              <w:right w:w="90" w:type="dxa"/>
-            </w:tcMar>
-            <w:vAlign w:val="center"/>
-          </w:tcPr>
-          <w:p>
-            <w:pPr>
-              <w:spacing w:before="30" w:after="30"/>
-              <w:jc w:val="center"/>
-            </w:pPr>
-            <w:r/>
-            <w:r>
-              <w:rPr>
-                <w:rFonts w:ascii="Arial" w:hAnsi="Arial"/>
-                <w:b w:val="0"/>
-                <w:color w:val="222222"/>
-                <w:sz w:val="16"/>
-              </w:rPr>
-              <w:t>0.3474</w:t>
-            </w:r>
-          </w:p>
-        </w:tc>
-        <w:tc>
-          <w:tcPr>
-            <w:tcW w:type="dxa" w:w="1440"/>
-            <w:shd w:fill="FBFBFB"/>
-            <w:tcMar>
-              <w:top w:w="60" w:type="dxa"/>
-              <w:bottom w:w="60" w:type="dxa"/>
-              <w:left w:w="90" w:type="dxa"/>
-              <w:right w:w="90" w:type="dxa"/>
-            </w:tcMar>
-            <w:vAlign w:val="center"/>
-          </w:tcPr>
-          <w:p>
-            <w:pPr>
-              <w:spacing w:before="30" w:after="30"/>
-              <w:jc w:val="center"/>
-            </w:pPr>
-            <w:r/>
-            <w:r>
-              <w:rPr>
-                <w:rFonts w:ascii="Arial" w:hAnsi="Arial"/>
-                <w:b w:val="0"/>
-                <w:color w:val="222222"/>
-                <w:sz w:val="16"/>
-              </w:rPr>
-              <w:t>0.4896</w:t>
-            </w:r>
-          </w:p>
-        </w:tc>
-        <w:tc>
-          <w:tcPr>
-            <w:tcW w:type="dxa" w:w="1296"/>
-            <w:shd w:fill="FBFBFB"/>
-            <w:tcMar>
-              <w:top w:w="60" w:type="dxa"/>
-              <w:bottom w:w="60" w:type="dxa"/>
-              <w:left w:w="90" w:type="dxa"/>
-              <w:right w:w="90" w:type="dxa"/>
-            </w:tcMar>
-            <w:vAlign w:val="center"/>
-          </w:tcPr>
-          <w:p>
-            <w:pPr>
-              <w:spacing w:before="30" w:after="30"/>
-              <w:jc w:val="center"/>
-            </w:pPr>
-            <w:r/>
-            <w:r>
-              <w:rPr>
-                <w:rFonts w:ascii="Arial" w:hAnsi="Arial"/>
-                <w:b w:val="0"/>
-                <w:color w:val="222222"/>
-                <w:sz w:val="16"/>
-              </w:rPr>
-              <w:t>0.7138</w:t>
-            </w:r>
-          </w:p>
-        </w:tc>
-        <w:tc>
-          <w:tcPr>
-            <w:tcW w:type="dxa" w:w="1296"/>
-            <w:shd w:fill="FBFBFB"/>
-            <w:tcMar>
-              <w:top w:w="60" w:type="dxa"/>
-              <w:bottom w:w="60" w:type="dxa"/>
-              <w:left w:w="90" w:type="dxa"/>
-              <w:right w:w="90" w:type="dxa"/>
-            </w:tcMar>
-            <w:vAlign w:val="center"/>
-          </w:tcPr>
-          <w:p>
-            <w:pPr>
-              <w:spacing w:before="30" w:after="30"/>
-              <w:jc w:val="center"/>
-            </w:pPr>
-            <w:r/>
-            <w:r>
-              <w:rPr>
-                <w:rFonts w:ascii="Arial" w:hAnsi="Arial"/>
-                <w:b w:val="0"/>
-                <w:color w:val="222222"/>
-                <w:sz w:val="16"/>
-              </w:rPr>
-              <w:t>0.6121</w:t>
-            </w:r>
-          </w:p>
-        </w:tc>
-        <w:tc>
-          <w:tcPr>
-            <w:tcW w:type="dxa" w:w="1440"/>
-            <w:shd w:fill="FBFBFB"/>
-            <w:tcMar>
-              <w:top w:w="60" w:type="dxa"/>
-              <w:bottom w:w="60" w:type="dxa"/>
-              <w:left w:w="90" w:type="dxa"/>
-              <w:right w:w="90" w:type="dxa"/>
-            </w:tcMar>
-            <w:vAlign w:val="center"/>
-          </w:tcPr>
-          <w:p>
-            <w:pPr>
-              <w:spacing w:before="30" w:after="30"/>
-              <w:jc w:val="center"/>
-            </w:pPr>
-            <w:r/>
-            <w:r>
-              <w:rPr>
-                <w:rFonts w:ascii="Arial" w:hAnsi="Arial"/>
-                <w:b w:val="0"/>
-                <w:color w:val="222222"/>
-                <w:sz w:val="16"/>
-              </w:rPr>
-              <w:t>0.6888</w:t>
-            </w:r>
-          </w:p>
-        </w:tc>
-      </w:tr>
-      <w:tr>
-        <w:tc>
-          <w:tcPr>
-            <w:tcW w:type="dxa" w:w="1584"/>
-            <w:shd w:fill="FFFFFF"/>
-            <w:tcMar>
-              <w:top w:w="60" w:type="dxa"/>
-              <w:bottom w:w="60" w:type="dxa"/>
-              <w:left w:w="90" w:type="dxa"/>
-              <w:right w:w="90" w:type="dxa"/>
-            </w:tcMar>
-            <w:vAlign w:val="center"/>
-          </w:tcPr>
-          <w:p>
-            <w:pPr>
-              <w:spacing w:before="30" w:after="30"/>
-              <w:jc w:val="left"/>
-            </w:pPr>
-            <w:r/>
-            <w:r>
-              <w:rPr>
-                <w:rFonts w:ascii="Arial" w:hAnsi="Arial"/>
-                <w:b/>
-                <w:color w:val="222222"/>
-                <w:sz w:val="16"/>
-              </w:rPr>
-              <w:t>FHx</w:t>
-            </w:r>
-          </w:p>
-        </w:tc>
-        <w:tc>
-          <w:tcPr>
-            <w:tcW w:type="dxa" w:w="1008"/>
-            <w:shd w:fill="FFFFFF"/>
-            <w:tcMar>
-              <w:top w:w="60" w:type="dxa"/>
-              <w:bottom w:w="60" w:type="dxa"/>
-              <w:left w:w="90" w:type="dxa"/>
-              <w:right w:w="90" w:type="dxa"/>
-            </w:tcMar>
-            <w:vAlign w:val="center"/>
-          </w:tcPr>
-          <w:p>
-            <w:pPr>
-              <w:spacing w:before="30" w:after="30"/>
-              <w:jc w:val="center"/>
-            </w:pPr>
-            <w:r/>
-            <w:r>
-              <w:rPr>
-                <w:rFonts w:ascii="Arial" w:hAnsi="Arial"/>
-                <w:b w:val="0"/>
-                <w:color w:val="222222"/>
-                <w:sz w:val="16"/>
-              </w:rPr>
-              <w:t>105</w:t>
-            </w:r>
-          </w:p>
-        </w:tc>
-        <w:tc>
-          <w:tcPr>
-            <w:tcW w:type="dxa" w:w="1296"/>
-            <w:shd w:fill="FFFFFF"/>
-            <w:tcMar>
-              <w:top w:w="60" w:type="dxa"/>
-              <w:bottom w:w="60" w:type="dxa"/>
-              <w:left w:w="90" w:type="dxa"/>
-              <w:right w:w="90" w:type="dxa"/>
-            </w:tcMar>
-            <w:vAlign w:val="center"/>
-          </w:tcPr>
-          <w:p>
-            <w:pPr>
-              <w:spacing w:before="30" w:after="30"/>
-              <w:jc w:val="center"/>
-            </w:pPr>
-            <w:r/>
-            <w:r>
-              <w:rPr>
-                <w:rFonts w:ascii="Arial" w:hAnsi="Arial"/>
-                <w:b w:val="0"/>
-                <w:color w:val="222222"/>
-                <w:sz w:val="16"/>
-              </w:rPr>
-              <w:t>0.0727</w:t>
-            </w:r>
-          </w:p>
-        </w:tc>
-        <w:tc>
-          <w:tcPr>
-            <w:tcW w:type="dxa" w:w="1296"/>
-            <w:shd w:fill="FFFFFF"/>
-            <w:tcMar>
-              <w:top w:w="60" w:type="dxa"/>
-              <w:bottom w:w="60" w:type="dxa"/>
-              <w:left w:w="90" w:type="dxa"/>
-              <w:right w:w="90" w:type="dxa"/>
-            </w:tcMar>
-            <w:vAlign w:val="center"/>
-          </w:tcPr>
-          <w:p>
-            <w:pPr>
-              <w:spacing w:before="30" w:after="30"/>
-              <w:jc w:val="center"/>
-            </w:pPr>
-            <w:r/>
-            <w:r>
-              <w:rPr>
-                <w:rFonts w:ascii="Arial" w:hAnsi="Arial"/>
-                <w:b w:val="0"/>
-                <w:color w:val="222222"/>
-                <w:sz w:val="16"/>
-              </w:rPr>
-              <w:t>0.0606</w:t>
-            </w:r>
-          </w:p>
-        </w:tc>
-        <w:tc>
-          <w:tcPr>
-            <w:tcW w:type="dxa" w:w="1440"/>
-            <w:shd w:fill="FFFFFF"/>
-            <w:tcMar>
-              <w:top w:w="60" w:type="dxa"/>
-              <w:bottom w:w="60" w:type="dxa"/>
-              <w:left w:w="90" w:type="dxa"/>
-              <w:right w:w="90" w:type="dxa"/>
-            </w:tcMar>
-            <w:vAlign w:val="center"/>
-          </w:tcPr>
-          <w:p>
-            <w:pPr>
-              <w:spacing w:before="30" w:after="30"/>
-              <w:jc w:val="center"/>
-            </w:pPr>
-            <w:r/>
-            <w:r>
-              <w:rPr>
-                <w:rFonts w:ascii="Arial" w:hAnsi="Arial"/>
-                <w:b w:val="0"/>
-                <w:color w:val="222222"/>
-                <w:sz w:val="16"/>
-              </w:rPr>
-              <w:t>0.1395</w:t>
-            </w:r>
-          </w:p>
-        </w:tc>
-        <w:tc>
-          <w:tcPr>
-            <w:tcW w:type="dxa" w:w="1296"/>
-            <w:shd w:fill="FFFFFF"/>
-            <w:tcMar>
-              <w:top w:w="60" w:type="dxa"/>
-              <w:bottom w:w="60" w:type="dxa"/>
-              <w:left w:w="90" w:type="dxa"/>
-              <w:right w:w="90" w:type="dxa"/>
-            </w:tcMar>
-            <w:vAlign w:val="center"/>
-          </w:tcPr>
-          <w:p>
-            <w:pPr>
-              <w:spacing w:before="30" w:after="30"/>
-              <w:jc w:val="center"/>
-            </w:pPr>
-            <w:r/>
-            <w:r>
-              <w:rPr>
-                <w:rFonts w:ascii="Arial" w:hAnsi="Arial"/>
-                <w:b w:val="0"/>
-                <w:color w:val="222222"/>
-                <w:sz w:val="16"/>
-              </w:rPr>
-              <w:t>0.0818</w:t>
-            </w:r>
-          </w:p>
-        </w:tc>
-        <w:tc>
-          <w:tcPr>
-            <w:tcW w:type="dxa" w:w="1296"/>
-            <w:shd w:fill="FFFFFF"/>
-            <w:tcMar>
-              <w:top w:w="60" w:type="dxa"/>
-              <w:bottom w:w="60" w:type="dxa"/>
-              <w:left w:w="90" w:type="dxa"/>
-              <w:right w:w="90" w:type="dxa"/>
-            </w:tcMar>
-            <w:vAlign w:val="center"/>
-          </w:tcPr>
-          <w:p>
-            <w:pPr>
-              <w:spacing w:before="30" w:after="30"/>
-              <w:jc w:val="center"/>
-            </w:pPr>
-            <w:r/>
-            <w:r>
-              <w:rPr>
-                <w:rFonts w:ascii="Arial" w:hAnsi="Arial"/>
-                <w:b w:val="0"/>
-                <w:color w:val="222222"/>
-                <w:sz w:val="16"/>
-              </w:rPr>
-              <w:t>0.1736</w:t>
-            </w:r>
-          </w:p>
-        </w:tc>
-        <w:tc>
-          <w:tcPr>
-            <w:tcW w:type="dxa" w:w="1440"/>
-            <w:shd w:fill="FFFFFF"/>
-            <w:tcMar>
-              <w:top w:w="60" w:type="dxa"/>
-              <w:bottom w:w="60" w:type="dxa"/>
-              <w:left w:w="90" w:type="dxa"/>
-              <w:right w:w="90" w:type="dxa"/>
-            </w:tcMar>
-            <w:vAlign w:val="center"/>
-          </w:tcPr>
-          <w:p>
-            <w:pPr>
-              <w:spacing w:before="30" w:after="30"/>
-              <w:jc w:val="center"/>
-            </w:pPr>
-            <w:r/>
-            <w:r>
-              <w:rPr>
-                <w:rFonts w:ascii="Arial" w:hAnsi="Arial"/>
-                <w:b w:val="0"/>
-                <w:color w:val="222222"/>
-                <w:sz w:val="16"/>
-              </w:rPr>
-              <w:t>0.2130</w:t>
-            </w:r>
-          </w:p>
-        </w:tc>
-      </w:tr>
-      <w:tr>
-        <w:tc>
-          <w:tcPr>
-            <w:tcW w:type="dxa" w:w="1584"/>
-            <w:shd w:fill="FBFBFB"/>
-            <w:tcMar>
-              <w:top w:w="60" w:type="dxa"/>
-              <w:bottom w:w="60" w:type="dxa"/>
-              <w:left w:w="90" w:type="dxa"/>
-              <w:right w:w="90" w:type="dxa"/>
-            </w:tcMar>
-            <w:vAlign w:val="center"/>
-          </w:tcPr>
-          <w:p>
-            <w:pPr>
-              <w:spacing w:before="30" w:after="30"/>
-              <w:jc w:val="left"/>
-            </w:pPr>
-            <w:r/>
-            <w:r>
-              <w:rPr>
-                <w:rFonts w:ascii="Arial" w:hAnsi="Arial"/>
-                <w:b/>
-                <w:color w:val="222222"/>
-                <w:sz w:val="16"/>
-              </w:rPr>
-              <w:t>Age</w:t>
-            </w:r>
-          </w:p>
-        </w:tc>
-        <w:tc>
-          <w:tcPr>
-            <w:tcW w:type="dxa" w:w="1008"/>
-            <w:shd w:fill="FBFBFB"/>
-            <w:tcMar>
-              <w:top w:w="60" w:type="dxa"/>
-              <w:bottom w:w="60" w:type="dxa"/>
-              <w:left w:w="90" w:type="dxa"/>
-              <w:right w:w="90" w:type="dxa"/>
-            </w:tcMar>
-            <w:vAlign w:val="center"/>
-          </w:tcPr>
-          <w:p>
-            <w:pPr>
-              <w:spacing w:before="30" w:after="30"/>
-              <w:jc w:val="center"/>
-            </w:pPr>
-            <w:r/>
-            <w:r>
-              <w:rPr>
-                <w:rFonts w:ascii="Arial" w:hAnsi="Arial"/>
-                <w:b w:val="0"/>
-                <w:color w:val="222222"/>
-                <w:sz w:val="16"/>
-              </w:rPr>
-              <w:t>787</w:t>
-            </w:r>
-          </w:p>
-        </w:tc>
-        <w:tc>
-          <w:tcPr>
-            <w:tcW w:type="dxa" w:w="1296"/>
-            <w:shd w:fill="FBFBFB"/>
-            <w:tcMar>
-              <w:top w:w="60" w:type="dxa"/>
-              <w:bottom w:w="60" w:type="dxa"/>
-              <w:left w:w="90" w:type="dxa"/>
-              <w:right w:w="90" w:type="dxa"/>
-            </w:tcMar>
-            <w:vAlign w:val="center"/>
-          </w:tcPr>
-          <w:p>
-            <w:pPr>
-              <w:spacing w:before="30" w:after="30"/>
-              <w:jc w:val="center"/>
-            </w:pPr>
-            <w:r/>
-            <w:r>
-              <w:rPr>
-                <w:rFonts w:ascii="Arial" w:hAnsi="Arial"/>
-                <w:b w:val="0"/>
-                <w:color w:val="222222"/>
-                <w:sz w:val="16"/>
-              </w:rPr>
-              <w:t>0.9009</w:t>
-            </w:r>
-          </w:p>
-        </w:tc>
-        <w:tc>
-          <w:tcPr>
-            <w:tcW w:type="dxa" w:w="1296"/>
-            <w:shd w:fill="FBFBFB"/>
-            <w:tcMar>
-              <w:top w:w="60" w:type="dxa"/>
-              <w:bottom w:w="60" w:type="dxa"/>
-              <w:left w:w="90" w:type="dxa"/>
-              <w:right w:w="90" w:type="dxa"/>
-            </w:tcMar>
-            <w:vAlign w:val="center"/>
-          </w:tcPr>
-          <w:p>
-            <w:pPr>
-              <w:spacing w:before="30" w:after="30"/>
-              <w:jc w:val="center"/>
-            </w:pPr>
-            <w:r/>
-            <w:r>
-              <w:rPr>
-                <w:rFonts w:ascii="Arial" w:hAnsi="Arial"/>
-                <w:b w:val="0"/>
-                <w:color w:val="222222"/>
-                <w:sz w:val="16"/>
-              </w:rPr>
-              <w:t>0.7335</w:t>
-            </w:r>
-          </w:p>
-        </w:tc>
-        <w:tc>
-          <w:tcPr>
-            <w:tcW w:type="dxa" w:w="1440"/>
-            <w:shd w:fill="FBFBFB"/>
-            <w:tcMar>
-              <w:top w:w="60" w:type="dxa"/>
-              <w:bottom w:w="60" w:type="dxa"/>
-              <w:left w:w="90" w:type="dxa"/>
-              <w:right w:w="90" w:type="dxa"/>
-            </w:tcMar>
-            <w:vAlign w:val="center"/>
-          </w:tcPr>
-          <w:p>
-            <w:pPr>
-              <w:spacing w:before="30" w:after="30"/>
-              <w:jc w:val="center"/>
-            </w:pPr>
-            <w:r/>
-            <w:r>
-              <w:rPr>
-                <w:rFonts w:ascii="Arial" w:hAnsi="Arial"/>
-                <w:b w:val="0"/>
-                <w:color w:val="222222"/>
-                <w:sz w:val="16"/>
-              </w:rPr>
-              <w:t>0.8752</w:t>
-            </w:r>
-          </w:p>
-        </w:tc>
-        <w:tc>
-          <w:tcPr>
-            <w:tcW w:type="dxa" w:w="1296"/>
-            <w:shd w:fill="FBFBFB"/>
-            <w:tcMar>
-              <w:top w:w="60" w:type="dxa"/>
-              <w:bottom w:w="60" w:type="dxa"/>
-              <w:left w:w="90" w:type="dxa"/>
-              <w:right w:w="90" w:type="dxa"/>
-            </w:tcMar>
-            <w:vAlign w:val="center"/>
-          </w:tcPr>
-          <w:p>
-            <w:pPr>
-              <w:spacing w:before="30" w:after="30"/>
-              <w:jc w:val="center"/>
-            </w:pPr>
-            <w:r/>
-            <w:r>
-              <w:rPr>
-                <w:rFonts w:ascii="Arial" w:hAnsi="Arial"/>
-                <w:b w:val="0"/>
-                <w:color w:val="222222"/>
-                <w:sz w:val="16"/>
-              </w:rPr>
-              <w:t>0.9525</w:t>
-            </w:r>
-          </w:p>
-        </w:tc>
-        <w:tc>
-          <w:tcPr>
-            <w:tcW w:type="dxa" w:w="1296"/>
-            <w:shd w:fill="FBFBFB"/>
-            <w:tcMar>
-              <w:top w:w="60" w:type="dxa"/>
-              <w:bottom w:w="60" w:type="dxa"/>
-              <w:left w:w="90" w:type="dxa"/>
-              <w:right w:w="90" w:type="dxa"/>
-            </w:tcMar>
-            <w:vAlign w:val="center"/>
-          </w:tcPr>
-          <w:p>
-            <w:pPr>
-              <w:spacing w:before="30" w:after="30"/>
-              <w:jc w:val="center"/>
-            </w:pPr>
-            <w:r/>
-            <w:r>
-              <w:rPr>
-                <w:rFonts w:ascii="Arial" w:hAnsi="Arial"/>
-                <w:b w:val="0"/>
-                <w:color w:val="222222"/>
-                <w:sz w:val="16"/>
-              </w:rPr>
-              <w:t>0.8590</w:t>
-            </w:r>
-          </w:p>
-        </w:tc>
-        <w:tc>
-          <w:tcPr>
-            <w:tcW w:type="dxa" w:w="1440"/>
-            <w:shd w:fill="FBFBFB"/>
-            <w:tcMar>
-              <w:top w:w="60" w:type="dxa"/>
-              <w:bottom w:w="60" w:type="dxa"/>
-              <w:left w:w="90" w:type="dxa"/>
-              <w:right w:w="90" w:type="dxa"/>
-            </w:tcMar>
-            <w:vAlign w:val="center"/>
-          </w:tcPr>
-          <w:p>
-            <w:pPr>
-              <w:spacing w:before="30" w:after="30"/>
-              <w:jc w:val="center"/>
-            </w:pPr>
-            <w:r/>
-            <w:r>
-              <w:rPr>
-                <w:rFonts w:ascii="Arial" w:hAnsi="Arial"/>
-                <w:b w:val="0"/>
-                <w:color w:val="222222"/>
-                <w:sz w:val="16"/>
-              </w:rPr>
-              <w:t>0.9238</w:t>
-            </w:r>
-          </w:p>
-        </w:tc>
-      </w:tr>
-      <w:tr>
-        <w:tc>
-          <w:tcPr>
-            <w:tcW w:type="dxa" w:w="1584"/>
-            <w:shd w:fill="FFFFFF"/>
-            <w:tcMar>
-              <w:top w:w="60" w:type="dxa"/>
-              <w:bottom w:w="60" w:type="dxa"/>
-              <w:left w:w="90" w:type="dxa"/>
-              <w:right w:w="90" w:type="dxa"/>
-            </w:tcMar>
-            <w:vAlign w:val="center"/>
-          </w:tcPr>
-          <w:p>
-            <w:pPr>
-              <w:spacing w:before="30" w:after="30"/>
-              <w:jc w:val="left"/>
-            </w:pPr>
-            <w:r/>
-            <w:r>
-              <w:rPr>
-                <w:rFonts w:ascii="Arial" w:hAnsi="Arial"/>
-                <w:b/>
-                <w:color w:val="222222"/>
-                <w:sz w:val="16"/>
-              </w:rPr>
-              <w:t>Sex</w:t>
-            </w:r>
-          </w:p>
-        </w:tc>
-        <w:tc>
-          <w:tcPr>
-            <w:tcW w:type="dxa" w:w="1008"/>
-            <w:shd w:fill="FFFFFF"/>
-            <w:tcMar>
-              <w:top w:w="60" w:type="dxa"/>
-              <w:bottom w:w="60" w:type="dxa"/>
-              <w:left w:w="90" w:type="dxa"/>
-              <w:right w:w="90" w:type="dxa"/>
-            </w:tcMar>
-            <w:vAlign w:val="center"/>
-          </w:tcPr>
-          <w:p>
-            <w:pPr>
-              <w:spacing w:before="30" w:after="30"/>
-              <w:jc w:val="center"/>
-            </w:pPr>
-            <w:r/>
-            <w:r>
-              <w:rPr>
-                <w:rFonts w:ascii="Arial" w:hAnsi="Arial"/>
-                <w:b w:val="0"/>
-                <w:color w:val="222222"/>
-                <w:sz w:val="16"/>
-              </w:rPr>
-              <w:t>777</w:t>
-            </w:r>
-          </w:p>
-        </w:tc>
-        <w:tc>
-          <w:tcPr>
-            <w:tcW w:type="dxa" w:w="1296"/>
-            <w:shd w:fill="FFFFFF"/>
-            <w:tcMar>
-              <w:top w:w="60" w:type="dxa"/>
-              <w:bottom w:w="60" w:type="dxa"/>
-              <w:left w:w="90" w:type="dxa"/>
-              <w:right w:w="90" w:type="dxa"/>
-            </w:tcMar>
-            <w:vAlign w:val="center"/>
-          </w:tcPr>
-          <w:p>
-            <w:pPr>
-              <w:spacing w:before="30" w:after="30"/>
-              <w:jc w:val="center"/>
-            </w:pPr>
-            <w:r/>
-            <w:r>
-              <w:rPr>
-                <w:rFonts w:ascii="Arial" w:hAnsi="Arial"/>
-                <w:b w:val="0"/>
-                <w:color w:val="222222"/>
-                <w:sz w:val="16"/>
-              </w:rPr>
-              <w:t>0.9037</w:t>
-            </w:r>
-          </w:p>
-        </w:tc>
-        <w:tc>
-          <w:tcPr>
-            <w:tcW w:type="dxa" w:w="1296"/>
-            <w:shd w:fill="FFFFFF"/>
-            <w:tcMar>
-              <w:top w:w="60" w:type="dxa"/>
-              <w:bottom w:w="60" w:type="dxa"/>
-              <w:left w:w="90" w:type="dxa"/>
-              <w:right w:w="90" w:type="dxa"/>
-            </w:tcMar>
-            <w:vAlign w:val="center"/>
-          </w:tcPr>
-          <w:p>
-            <w:pPr>
-              <w:spacing w:before="30" w:after="30"/>
-              <w:jc w:val="center"/>
-            </w:pPr>
-            <w:r/>
-            <w:r>
-              <w:rPr>
-                <w:rFonts w:ascii="Arial" w:hAnsi="Arial"/>
-                <w:b w:val="0"/>
-                <w:color w:val="222222"/>
-                <w:sz w:val="16"/>
-              </w:rPr>
-              <w:t>0.7551</w:t>
-            </w:r>
-          </w:p>
-        </w:tc>
-        <w:tc>
-          <w:tcPr>
-            <w:tcW w:type="dxa" w:w="1440"/>
-            <w:shd w:fill="FFFFFF"/>
-            <w:tcMar>
-              <w:top w:w="60" w:type="dxa"/>
-              <w:bottom w:w="60" w:type="dxa"/>
-              <w:left w:w="90" w:type="dxa"/>
-              <w:right w:w="90" w:type="dxa"/>
-            </w:tcMar>
-            <w:vAlign w:val="center"/>
-          </w:tcPr>
-          <w:p>
-            <w:pPr>
-              <w:spacing w:before="30" w:after="30"/>
-              <w:jc w:val="center"/>
-            </w:pPr>
-            <w:r/>
-            <w:r>
-              <w:rPr>
-                <w:rFonts w:ascii="Arial" w:hAnsi="Arial"/>
-                <w:b w:val="0"/>
-                <w:color w:val="222222"/>
-                <w:sz w:val="16"/>
-              </w:rPr>
-              <w:t>0.8829</w:t>
-            </w:r>
-          </w:p>
-        </w:tc>
-        <w:tc>
-          <w:tcPr>
-            <w:tcW w:type="dxa" w:w="1296"/>
-            <w:shd w:fill="FFFFFF"/>
-            <w:tcMar>
-              <w:top w:w="60" w:type="dxa"/>
-              <w:bottom w:w="60" w:type="dxa"/>
-              <w:left w:w="90" w:type="dxa"/>
-              <w:right w:w="90" w:type="dxa"/>
-            </w:tcMar>
-            <w:vAlign w:val="center"/>
-          </w:tcPr>
-          <w:p>
-            <w:pPr>
-              <w:spacing w:before="30" w:after="30"/>
-              <w:jc w:val="center"/>
-            </w:pPr>
-            <w:r/>
-            <w:r>
-              <w:rPr>
-                <w:rFonts w:ascii="Arial" w:hAnsi="Arial"/>
-                <w:b w:val="0"/>
-                <w:color w:val="222222"/>
-                <w:sz w:val="16"/>
-              </w:rPr>
-              <w:t>0.9570</w:t>
-            </w:r>
-          </w:p>
-        </w:tc>
-        <w:tc>
-          <w:tcPr>
-            <w:tcW w:type="dxa" w:w="1296"/>
-            <w:shd w:fill="FFFFFF"/>
-            <w:tcMar>
-              <w:top w:w="60" w:type="dxa"/>
-              <w:bottom w:w="60" w:type="dxa"/>
-              <w:left w:w="90" w:type="dxa"/>
-              <w:right w:w="90" w:type="dxa"/>
-            </w:tcMar>
-            <w:vAlign w:val="center"/>
-          </w:tcPr>
-          <w:p>
-            <w:pPr>
-              <w:spacing w:before="30" w:after="30"/>
-              <w:jc w:val="center"/>
-            </w:pPr>
-            <w:r/>
-            <w:r>
-              <w:rPr>
-                <w:rFonts w:ascii="Arial" w:hAnsi="Arial"/>
-                <w:b w:val="0"/>
-                <w:color w:val="222222"/>
-                <w:sz w:val="16"/>
-              </w:rPr>
-              <w:t>0.8575</w:t>
-            </w:r>
-          </w:p>
-        </w:tc>
-        <w:tc>
-          <w:tcPr>
-            <w:tcW w:type="dxa" w:w="1440"/>
-            <w:shd w:fill="FFFFFF"/>
-            <w:tcMar>
-              <w:top w:w="60" w:type="dxa"/>
-              <w:bottom w:w="60" w:type="dxa"/>
-              <w:left w:w="90" w:type="dxa"/>
-              <w:right w:w="90" w:type="dxa"/>
-            </w:tcMar>
-            <w:vAlign w:val="center"/>
-          </w:tcPr>
-          <w:p>
-            <w:pPr>
-              <w:spacing w:before="30" w:after="30"/>
-              <w:jc w:val="center"/>
-            </w:pPr>
-            <w:r/>
-            <w:r>
-              <w:rPr>
-                <w:rFonts w:ascii="Arial" w:hAnsi="Arial"/>
-                <w:b w:val="0"/>
-                <w:color w:val="222222"/>
-                <w:sz w:val="16"/>
-              </w:rPr>
-              <w:t>0.9376</w:t>
-            </w:r>
-          </w:p>
-        </w:tc>
-      </w:tr>
-      <w:tr>
-        <w:tc>
-          <w:tcPr>
-            <w:tcW w:type="dxa" w:w="1584"/>
-            <w:shd w:fill="FBFBFB"/>
-            <w:tcMar>
-              <w:top w:w="60" w:type="dxa"/>
-              <w:bottom w:w="60" w:type="dxa"/>
-              <w:left w:w="90" w:type="dxa"/>
-              <w:right w:w="90" w:type="dxa"/>
-            </w:tcMar>
-            <w:vAlign w:val="center"/>
-          </w:tcPr>
-          <w:p>
-            <w:pPr>
-              <w:spacing w:before="30" w:after="30"/>
-              <w:jc w:val="left"/>
-            </w:pPr>
-            <w:r/>
-            <w:r>
-              <w:rPr>
-                <w:rFonts w:ascii="Arial" w:hAnsi="Arial"/>
-                <w:b/>
-                <w:color w:val="222222"/>
-                <w:sz w:val="16"/>
-              </w:rPr>
-              <w:t>OVERALL</w:t>
-            </w:r>
-          </w:p>
-        </w:tc>
-        <w:tc>
-          <w:tcPr>
-            <w:tcW w:type="dxa" w:w="1008"/>
-            <w:shd w:fill="FBFBFB"/>
-            <w:tcMar>
-              <w:top w:w="60" w:type="dxa"/>
-              <w:bottom w:w="60" w:type="dxa"/>
-              <w:left w:w="90" w:type="dxa"/>
-              <w:right w:w="90" w:type="dxa"/>
-            </w:tcMar>
-            <w:vAlign w:val="center"/>
-          </w:tcPr>
-          <w:p>
-            <w:pPr>
-              <w:spacing w:before="30" w:after="30"/>
-              <w:jc w:val="center"/>
-            </w:pPr>
-            <w:r/>
-            <w:r>
-              <w:rPr>
-                <w:rFonts w:ascii="Arial" w:hAnsi="Arial"/>
-                <w:b w:val="0"/>
-                <w:color w:val="222222"/>
-                <w:sz w:val="16"/>
-              </w:rPr>
-              <w:t>32,650</w:t>
-            </w:r>
-          </w:p>
-        </w:tc>
-        <w:tc>
-          <w:tcPr>
-            <w:tcW w:type="dxa" w:w="1296"/>
-            <w:shd w:fill="FBFBFB"/>
-            <w:tcMar>
-              <w:top w:w="60" w:type="dxa"/>
-              <w:bottom w:w="60" w:type="dxa"/>
-              <w:left w:w="90" w:type="dxa"/>
-              <w:right w:w="90" w:type="dxa"/>
-            </w:tcMar>
-            <w:vAlign w:val="center"/>
-          </w:tcPr>
-          <w:p>
-            <w:pPr>
-              <w:spacing w:before="30" w:after="30"/>
-              <w:jc w:val="center"/>
-            </w:pPr>
-            <w:r/>
-            <w:r>
-              <w:rPr>
-                <w:rFonts w:ascii="Arial" w:hAnsi="Arial"/>
-                <w:b w:val="0"/>
-                <w:color w:val="222222"/>
-                <w:sz w:val="16"/>
-              </w:rPr>
-              <w:t>0.6032</w:t>
-            </w:r>
-          </w:p>
-        </w:tc>
-        <w:tc>
-          <w:tcPr>
-            <w:tcW w:type="dxa" w:w="1296"/>
-            <w:shd w:fill="FBFBFB"/>
-            <w:tcMar>
-              <w:top w:w="60" w:type="dxa"/>
-              <w:bottom w:w="60" w:type="dxa"/>
-              <w:left w:w="90" w:type="dxa"/>
-              <w:right w:w="90" w:type="dxa"/>
-            </w:tcMar>
-            <w:vAlign w:val="center"/>
-          </w:tcPr>
-          <w:p>
-            <w:pPr>
-              <w:spacing w:before="30" w:after="30"/>
-              <w:jc w:val="center"/>
-            </w:pPr>
-            <w:r/>
-            <w:r>
-              <w:rPr>
-                <w:rFonts w:ascii="Arial" w:hAnsi="Arial"/>
-                <w:b w:val="0"/>
-                <w:color w:val="222222"/>
-                <w:sz w:val="16"/>
-              </w:rPr>
-              <w:t>0.2982</w:t>
-            </w:r>
-          </w:p>
-        </w:tc>
-        <w:tc>
-          <w:tcPr>
-            <w:tcW w:type="dxa" w:w="1440"/>
-            <w:shd w:fill="FBFBFB"/>
-            <w:tcMar>
-              <w:top w:w="60" w:type="dxa"/>
-              <w:bottom w:w="60" w:type="dxa"/>
-              <w:left w:w="90" w:type="dxa"/>
-              <w:right w:w="90" w:type="dxa"/>
-            </w:tcMar>
-            <w:vAlign w:val="center"/>
-          </w:tcPr>
-          <w:p>
-            <w:pPr>
-              <w:spacing w:before="30" w:after="30"/>
-              <w:jc w:val="center"/>
-            </w:pPr>
-            <w:r/>
-            <w:r>
-              <w:rPr>
-                <w:rFonts w:ascii="Arial" w:hAnsi="Arial"/>
-                <w:b w:val="0"/>
-                <w:color w:val="222222"/>
-                <w:sz w:val="16"/>
-              </w:rPr>
-              <w:t>0.4189</w:t>
-            </w:r>
-          </w:p>
-        </w:tc>
-        <w:tc>
-          <w:tcPr>
-            <w:tcW w:type="dxa" w:w="1296"/>
-            <w:shd w:fill="FBFBFB"/>
-            <w:tcMar>
-              <w:top w:w="60" w:type="dxa"/>
-              <w:bottom w:w="60" w:type="dxa"/>
-              <w:left w:w="90" w:type="dxa"/>
-              <w:right w:w="90" w:type="dxa"/>
-            </w:tcMar>
-            <w:vAlign w:val="center"/>
-          </w:tcPr>
-          <w:p>
-            <w:pPr>
-              <w:spacing w:before="30" w:after="30"/>
-              <w:jc w:val="center"/>
-            </w:pPr>
-            <w:r/>
-            <w:r>
-              <w:rPr>
-                <w:rFonts w:ascii="Arial" w:hAnsi="Arial"/>
-                <w:b w:val="0"/>
-                <w:color w:val="222222"/>
-                <w:sz w:val="16"/>
-              </w:rPr>
-              <w:t>0.7477</w:t>
-            </w:r>
-          </w:p>
-        </w:tc>
-        <w:tc>
-          <w:tcPr>
-            <w:tcW w:type="dxa" w:w="1296"/>
-            <w:shd w:fill="FBFBFB"/>
-            <w:tcMar>
-              <w:top w:w="60" w:type="dxa"/>
-              <w:bottom w:w="60" w:type="dxa"/>
-              <w:left w:w="90" w:type="dxa"/>
-              <w:right w:w="90" w:type="dxa"/>
-            </w:tcMar>
-            <w:vAlign w:val="center"/>
-          </w:tcPr>
-          <w:p>
-            <w:pPr>
-              <w:spacing w:before="30" w:after="30"/>
-              <w:jc w:val="center"/>
-            </w:pPr>
-            <w:r/>
-            <w:r>
-              <w:rPr>
-                <w:rFonts w:ascii="Arial" w:hAnsi="Arial"/>
-                <w:b w:val="0"/>
-                <w:color w:val="222222"/>
-                <w:sz w:val="16"/>
-              </w:rPr>
-              <w:t>0.5515</w:t>
-            </w:r>
-          </w:p>
-        </w:tc>
-        <w:tc>
-          <w:tcPr>
-            <w:tcW w:type="dxa" w:w="1440"/>
-            <w:shd w:fill="FBFBFB"/>
-            <w:tcMar>
-              <w:top w:w="60" w:type="dxa"/>
-              <w:bottom w:w="60" w:type="dxa"/>
-              <w:left w:w="90" w:type="dxa"/>
-              <w:right w:w="90" w:type="dxa"/>
-            </w:tcMar>
-            <w:vAlign w:val="center"/>
-          </w:tcPr>
-          <w:p>
-            <w:pPr>
-              <w:spacing w:before="30" w:after="30"/>
-              <w:jc w:val="center"/>
-            </w:pPr>
-            <w:r/>
-            <w:r>
-              <w:rPr>
-                <w:rFonts w:ascii="Arial" w:hAnsi="Arial"/>
-                <w:b w:val="0"/>
-                <w:color w:val="222222"/>
-                <w:sz w:val="16"/>
-              </w:rPr>
-              <w:t>0.6060</w:t>
-            </w:r>
-          </w:p>
-        </w:tc>
-      </w:tr>
-    </w:tbl>
     <w:p>
       <w:pPr>
         <w:rPr>
@@ -11061,23 +6588,7 @@
         </w:rPr>
       </w:pPr>
       <w:r>
-        <w:t xml:space="preserve">Figure 4. Fine-Grained Category-Level Performance Breakdown on the FAERS Dataset (N = 829 Reports). Comparison of fine-tuned </w:t>
-      </w:r>
-      <w:proofErr w:type="spellStart"/>
-      <w:r>
-        <w:t>BioBERT</w:t>
-      </w:r>
-      <w:proofErr w:type="spellEnd"/>
-      <w:r>
-        <w:t xml:space="preserve"> 4-fold Leave-One-Out cross-validation (Blue), open-weight </w:t>
-      </w:r>
-      <w:proofErr w:type="spellStart"/>
-      <w:r>
-        <w:t>LLaMA</w:t>
-      </w:r>
-      <w:proofErr w:type="spellEnd"/>
-      <w:r>
-        <w:t xml:space="preserve"> 4 (Pink-Coral), and Claude 4.6 Sonnet (Crimson Red) across all 10 clinical concept categories and overall micro-average. (a) Primary Tier: Strict Exact-Match NER F1 Score. (b) Secondary Tier: Adapted ADE-Eval Clinical Weighted F1 Score.</w:t>
+        <w:t>Figure 4. Comparative Concept Extraction Performance Across All 17 Clinical Concept Categories on the FAERS Benchmark Corpus (N = 829 Reports) for Fine-Tuned BioBERT (Blue Diamond / Bar), Claude 4.6 Sonnet (Red Circle / Bar), and LLaMA 4 (Pink Square / Bar).</w:t>
       </w:r>
     </w:p>
     <w:p>
@@ -11659,7 +7170,7 @@
     </w:p>
     <w:p>
       <w:r>
-        <w:t>Table 5. Master Performance Benchmark on the VAERS Dataset (N = 1,000 Reports).</w:t>
+        <w:t>Table 4. Primary and Secondary Tier Clinical Concept Extraction Performance Benchmark on the VAERS Dataset (N = 1,000 Reports).</w:t>
       </w:r>
     </w:p>
     <w:tbl>
@@ -12381,7 +7892,7 @@
     </w:p>
     <w:p>
       <w:r>
-        <w:t>Table 6. Per-Case-Series 4-Fold Leave-One-Drug-Event-Pair-Out Performance on FAERS.</w:t>
+        <w:t>Table 5. Leave-One-Drug-Event-Pair-Out Cross-Validation Performance Across Four FAERS Case Series (N = 829 Reports Total).</w:t>
       </w:r>
     </w:p>
     <w:tbl>
@@ -13154,8 +8665,7 @@
     </w:p>
     <w:p>
       <w:r>
-        <w:lastRenderedPageBreak/>
-        <w:t>Table 7. Output Format Paradigm Comparison on FAERS Narratives (Inline Tagged XML vs. JSON Schema).</w:t>
+        <w:t>Table 6. Impact of LLM Output Format Paradigm (Inline Tagged XML vs. Structured JSON Schema Offsets) on Entity Extraction and Offset Alignment.</w:t>
       </w:r>
     </w:p>
     <w:tbl>

</xml_diff>

<commit_message>
feat(manuscript): isolate random seed results to Table 6 in Section 3.6 ablation study and clean earlier result sections
</commit_message>
<xml_diff>
--- a/publication/manuscripts/LLM4AE_rev1_clean_updated.docx
+++ b/publication/manuscripts/LLM4AE_rev1_clean_updated.docx
@@ -1209,23 +1209,7 @@
     </w:p>
     <w:p>
       <w:r>
-        <w:t xml:space="preserve">Recent models based on transformers, such as BERT, </w:t>
-      </w:r>
-      <w:proofErr w:type="spellStart"/>
-      <w:r>
-        <w:t>BioBERT</w:t>
-      </w:r>
-      <w:proofErr w:type="spellEnd"/>
-      <w:r>
-        <w:t xml:space="preserve">, and </w:t>
-      </w:r>
-      <w:proofErr w:type="spellStart"/>
-      <w:r>
-        <w:t>ClinicalBERT</w:t>
-      </w:r>
-      <w:proofErr w:type="spellEnd"/>
-      <w:r>
-        <w:t>, have shown strong performance on several clinical NER tasks by learning contextual representations rather than relying on fixed rules</w:t>
+        <w:t>Recent models based on transformers, such as BERT, BioBERT, and ClinicalBERT, have shown strong performance on several clinical NER tasks by learning contextual representations rather than relying on fixed rules</w:t>
       </w:r>
       <w:r>
         <w:fldChar w:fldCharType="begin"/>
@@ -2110,15 +2094,7 @@
         <w:t>ed</w:t>
       </w:r>
       <w:r>
-        <w:t xml:space="preserve"> four drug–adverse event pairs: Azacitidine–QT prolongation, Tramadol–hypoglycemia, Baricitinib–hypersensitivity, and </w:t>
-      </w:r>
-      <w:proofErr w:type="spellStart"/>
-      <w:r>
-        <w:t>Erenumab</w:t>
-      </w:r>
-      <w:proofErr w:type="spellEnd"/>
-      <w:r>
-        <w:t>–stroke.</w:t>
+        <w:t xml:space="preserve"> four drug–adverse event pairs: Azacitidine–QT prolongation, Tramadol–hypoglycemia, Baricitinib–hypersensitivity, and Erenumab–stroke.</w:t>
       </w:r>
       <w:r>
         <w:t xml:space="preserve"> </w:t>
@@ -2580,11 +2556,7 @@
         <w:t>)</w:t>
       </w:r>
       <w:r>
-        <w:t xml:space="preserve">. </w:t>
-      </w:r>
-      <w:proofErr w:type="gramStart"/>
-      <w:r>
-        <w:t xml:space="preserve">The </w:t>
+        <w:t xml:space="preserve">. The </w:t>
       </w:r>
       <w:r>
         <w:rPr>
@@ -2598,96 +2570,79 @@
           <w:iCs/>
           <w:color w:val="7030A0"/>
         </w:rPr>
-        <w:t>LLM</w:t>
-      </w:r>
-      <w:proofErr w:type="gramEnd"/>
+        <w:t>LLM was prompted to</w:t>
+      </w:r>
+      <w:r>
+        <w:rPr>
+          <w:i/>
+          <w:color w:val="7030A0"/>
+        </w:rPr>
+        <w:t xml:space="preserve"> </w:t>
+      </w:r>
+      <w:r>
+        <w:t>insert tags around identified entities without altering the surrounding text</w:t>
+      </w:r>
+      <w:r>
+        <w:t xml:space="preserve"> </w:t>
+      </w:r>
       <w:r>
         <w:rPr>
           <w:iCs/>
           <w:color w:val="7030A0"/>
         </w:rPr>
-        <w:t xml:space="preserve"> was prompted to</w:t>
+        <w:t>("</w:t>
+      </w:r>
+      <w:r>
+        <w:rPr>
+          <w:iCs/>
+          <w:color w:val="7030A0"/>
+        </w:rPr>
+        <w:t>Apart from the inserted annotation tags, every character of the original narrative must remain unchanged.</w:t>
+      </w:r>
+      <w:r>
+        <w:rPr>
+          <w:iCs/>
+          <w:color w:val="7030A0"/>
+        </w:rPr>
+        <w:t>")</w:t>
+      </w:r>
+      <w:r>
+        <w:rPr>
+          <w:iCs/>
+        </w:rPr>
+        <w:t>.</w:t>
+      </w:r>
+      <w:r>
+        <w:t xml:space="preserve"> After annotation, </w:t>
+      </w:r>
+      <w:r>
+        <w:rPr>
+          <w:color w:val="7030A0"/>
+        </w:rPr>
+        <w:t xml:space="preserve">we </w:t>
+      </w:r>
+      <w:r>
+        <w:rPr>
+          <w:color w:val="7030A0"/>
+        </w:rPr>
+        <w:t>compute a character-level mapping between the LLM's tag-stripped output and the original page tex</w:t>
+      </w:r>
+      <w:r>
+        <w:rPr>
+          <w:color w:val="7030A0"/>
+        </w:rPr>
+        <w:t>t</w:t>
       </w:r>
       <w:r>
         <w:rPr>
           <w:i/>
           <w:color w:val="7030A0"/>
         </w:rPr>
-        <w:t xml:space="preserve"> </w:t>
-      </w:r>
-      <w:r>
-        <w:t>insert tags around identified entities without altering the surrounding text</w:t>
-      </w:r>
-      <w:r>
-        <w:t xml:space="preserve"> </w:t>
-      </w:r>
-      <w:r>
-        <w:rPr>
-          <w:iCs/>
-          <w:color w:val="7030A0"/>
-        </w:rPr>
-        <w:t>("</w:t>
-      </w:r>
-      <w:r>
-        <w:rPr>
-          <w:iCs/>
-          <w:color w:val="7030A0"/>
-        </w:rPr>
-        <w:t>Apart from the inserted annotation tags, every character of the original narrative must remain unchanged.</w:t>
-      </w:r>
-      <w:r>
-        <w:rPr>
-          <w:iCs/>
-          <w:color w:val="7030A0"/>
-        </w:rPr>
-        <w:t>")</w:t>
-      </w:r>
-      <w:r>
-        <w:rPr>
-          <w:iCs/>
-        </w:rPr>
-        <w:t>.</w:t>
-      </w:r>
-      <w:r>
-        <w:t xml:space="preserve"> After annotation, </w:t>
-      </w:r>
-      <w:r>
-        <w:rPr>
-          <w:color w:val="7030A0"/>
-        </w:rPr>
-        <w:t xml:space="preserve">we </w:t>
-      </w:r>
-      <w:r>
-        <w:rPr>
-          <w:color w:val="7030A0"/>
-        </w:rPr>
-        <w:t>compute a character-level mapping between the LLM's tag-stripped output and the original page tex</w:t>
-      </w:r>
-      <w:r>
-        <w:rPr>
-          <w:color w:val="7030A0"/>
-        </w:rPr>
-        <w:t>t</w:t>
-      </w:r>
-      <w:r>
-        <w:rPr>
-          <w:i/>
-          <w:color w:val="7030A0"/>
-        </w:rPr>
         <w:t>,</w:t>
       </w:r>
       <w:r>
-        <w:t xml:space="preserve"> using the </w:t>
-      </w:r>
-      <w:proofErr w:type="spellStart"/>
-      <w:r>
-        <w:t>SequenceMatcher</w:t>
-      </w:r>
-      <w:proofErr w:type="spellEnd"/>
-      <w:r>
-        <w:t xml:space="preserve"> function from the </w:t>
-      </w:r>
-      <w:proofErr w:type="spellStart"/>
+        <w:t xml:space="preserve"> using the SequenceMatcher function from the </w:t>
+      </w:r>
       <w:r>
         <w:rPr>
           <w:i/>
@@ -2695,7 +2650,6 @@
         </w:rPr>
         <w:t>difflib</w:t>
       </w:r>
-      <w:proofErr w:type="spellEnd"/>
       <w:r>
         <w:t xml:space="preserve"> Python library </w:t>
       </w:r>
@@ -2882,15 +2836,7 @@
         <w:t>ere</w:t>
       </w:r>
       <w:r>
-        <w:t xml:space="preserve"> implemented using the </w:t>
-      </w:r>
-      <w:proofErr w:type="spellStart"/>
-      <w:r>
-        <w:t>spaCy</w:t>
-      </w:r>
-      <w:proofErr w:type="spellEnd"/>
-      <w:r>
-        <w:t xml:space="preserve"> transformer pipeline (TransformerModel</w:t>
+        <w:t xml:space="preserve"> implemented using the spaCy transformer pipeline (TransformerModel</w:t>
       </w:r>
       <w:r>
         <w:t>.</w:t>
@@ -2961,13 +2907,8 @@
         <w:fldChar w:fldCharType="end"/>
       </w:r>
       <w:r>
-        <w:t xml:space="preserve">, </w:t>
-      </w:r>
-      <w:proofErr w:type="spellStart"/>
-      <w:r>
-        <w:t>BioBERT</w:t>
-      </w:r>
-      <w:proofErr w:type="spellEnd"/>
+        <w:t>, BioBERT</w:t>
+      </w:r>
       <w:r>
         <w:fldChar w:fldCharType="begin"/>
       </w:r>
@@ -2987,13 +2928,8 @@
         <w:fldChar w:fldCharType="end"/>
       </w:r>
       <w:r>
-        <w:t xml:space="preserve">, </w:t>
-      </w:r>
-      <w:proofErr w:type="spellStart"/>
-      <w:r>
-        <w:t>ClinicalBERT</w:t>
-      </w:r>
-      <w:proofErr w:type="spellEnd"/>
+        <w:t>, ClinicalBERT</w:t>
+      </w:r>
       <w:r>
         <w:fldChar w:fldCharType="begin"/>
       </w:r>
@@ -3013,13 +2949,8 @@
         <w:fldChar w:fldCharType="end"/>
       </w:r>
       <w:r>
-        <w:t xml:space="preserve">, and </w:t>
-      </w:r>
-      <w:proofErr w:type="spellStart"/>
-      <w:r>
-        <w:t>Bio_ClinicalBERT</w:t>
-      </w:r>
-      <w:proofErr w:type="spellEnd"/>
+        <w:t>, and Bio_ClinicalBERT</w:t>
+      </w:r>
       <w:r>
         <w:fldChar w:fldCharType="begin"/>
       </w:r>
@@ -3039,15 +2970,7 @@
         <w:fldChar w:fldCharType="end"/>
       </w:r>
       <w:r>
-        <w:t xml:space="preserve"> using the VAERS data. </w:t>
-      </w:r>
-      <w:proofErr w:type="spellStart"/>
-      <w:r>
-        <w:t>BioBERT</w:t>
-      </w:r>
-      <w:proofErr w:type="spellEnd"/>
-      <w:r>
-        <w:t xml:space="preserve"> demonstrated superior precision and recall across key biomedical categories (</w:t>
+        <w:t xml:space="preserve"> using the VAERS data. BioBERT demonstrated superior precision and recall across key biomedical categories (</w:t>
       </w:r>
       <w:r>
         <w:rPr>
@@ -3336,6 +3259,7 @@
     <w:p>
       <w:pPr>
         <w:rPr>
+          <w:rFonts w:eastAsiaTheme="minorEastAsia"/>
           <w:iCs/>
         </w:rPr>
       </w:pPr>
@@ -3450,6 +3374,7 @@
     <w:p>
       <w:pPr>
         <w:rPr>
+          <w:rFonts w:eastAsiaTheme="minorEastAsia"/>
           <w:iCs/>
         </w:rPr>
       </w:pPr>
@@ -3858,11 +3783,9 @@
               <w:contextualSpacing/>
               <w:jc w:val="right"/>
             </w:pPr>
-            <w:proofErr w:type="spellStart"/>
             <w:r>
               <w:t>SDrug</w:t>
             </w:r>
-            <w:proofErr w:type="spellEnd"/>
           </w:p>
         </w:tc>
         <w:tc>
@@ -3927,11 +3850,9 @@
               <w:contextualSpacing/>
               <w:jc w:val="right"/>
             </w:pPr>
-            <w:proofErr w:type="spellStart"/>
             <w:r>
               <w:t>CDrug</w:t>
             </w:r>
-            <w:proofErr w:type="spellEnd"/>
           </w:p>
         </w:tc>
         <w:tc>
@@ -3989,11 +3910,9 @@
               <w:contextualSpacing/>
               <w:jc w:val="right"/>
             </w:pPr>
-            <w:proofErr w:type="spellStart"/>
             <w:r>
               <w:t>Odrug</w:t>
             </w:r>
-            <w:proofErr w:type="spellEnd"/>
             <w:r>
               <w:t xml:space="preserve"> </w:t>
             </w:r>
@@ -4304,11 +4223,9 @@
               <w:contextualSpacing/>
               <w:jc w:val="right"/>
             </w:pPr>
-            <w:proofErr w:type="spellStart"/>
             <w:r>
               <w:t>mAE</w:t>
             </w:r>
-            <w:proofErr w:type="spellEnd"/>
           </w:p>
         </w:tc>
         <w:tc>
@@ -4617,11 +4534,9 @@
               <w:contextualSpacing/>
               <w:jc w:val="right"/>
             </w:pPr>
-            <w:proofErr w:type="spellStart"/>
             <w:r>
               <w:t>CoD</w:t>
             </w:r>
-            <w:proofErr w:type="spellEnd"/>
           </w:p>
         </w:tc>
         <w:tc>
@@ -4743,11 +4658,9 @@
               <w:contextualSpacing/>
               <w:jc w:val="right"/>
             </w:pPr>
-            <w:proofErr w:type="spellStart"/>
             <w:r>
               <w:t>FHx</w:t>
             </w:r>
-            <w:proofErr w:type="spellEnd"/>
           </w:p>
         </w:tc>
         <w:tc>
@@ -5115,7 +5028,7 @@
         <w:t xml:space="preserve"> LLM demonstrated robust generalization capabilities, </w:t>
       </w:r>
       <w:r>
-        <w:t>outperform</w:t>
+        <w:t xml:space="preserve"> outperform</w:t>
       </w:r>
       <w:r>
         <w:t>ed</w:t>
@@ -5202,7 +5115,7 @@
         </w:rPr>
         <w:lastRenderedPageBreak/>
         <w:drawing>
-          <wp:inline distT="0" distB="0" distL="0" distR="0" wp14:anchorId="229BBBF4" wp14:editId="7D99B79D">
+          <wp:inline distT="0" distB="0" distL="0" distR="0" wp14:anchorId="229BBBF4" wp14:editId="1B78856E">
             <wp:extent cx="5932170" cy="4008120"/>
             <wp:effectExtent l="0" t="0" r="0" b="0"/>
             <wp:docPr id="1843461867" name="Picture 2"/>
@@ -5259,23 +5172,7 @@
         </w:rPr>
       </w:pPr>
       <w:r>
-        <w:t xml:space="preserve">Figure 3. Overall Performance Comparison Across Three Evaluation Schemes on FAERS Narratives (N = 829). Grouped bar chart comparing the rule-based baseline ETHER (Gray), fine-tuned </w:t>
-      </w:r>
-      <w:proofErr w:type="spellStart"/>
-      <w:r>
-        <w:t>BioBERT</w:t>
-      </w:r>
-      <w:proofErr w:type="spellEnd"/>
-      <w:r>
-        <w:t xml:space="preserve"> (Blue), open-weight </w:t>
-      </w:r>
-      <w:proofErr w:type="spellStart"/>
-      <w:r>
-        <w:t>LLaMA</w:t>
-      </w:r>
-      <w:proofErr w:type="spellEnd"/>
-      <w:r>
-        <w:t xml:space="preserve"> 4 (Pink-Coral), and proprietary Claude 4.6 Sonnet (Crimson Red) across Scheme 1 (Relaxed Boundary Match), Scheme 2 (Adapted ADE-Eval Clinical Weighted Metric), and Scheme 3 (Strict Exact-Match NER). Numerical F1 scores are labeled above each bar.</w:t>
+        <w:t>Figure 3. Overall Performance Comparison Across Three Evaluation Schemes on FAERS Narratives (N = 829). Grouped bar chart comparing the rule-based baseline ETHER (Gray), fine-tuned BioBERT (Blue), open-weight LLaMA 4 (Pink-Coral), and proprietary Claude 4.6 Sonnet (Crimson Red) across Scheme 1 (Relaxed Boundary Match), Scheme 2 (Adapted ADE-Eval Clinical Weighted Metric), and Scheme 3 (Strict Exact-Match NER). Numerical F1 scores are labeled above each bar.</w:t>
       </w:r>
     </w:p>
     <w:p/>
@@ -5292,86 +5189,7 @@
     </w:p>
     <w:p>
       <w:r>
-        <w:t xml:space="preserve">We trained and evaluated a supervised </w:t>
-      </w:r>
-      <w:proofErr w:type="spellStart"/>
-      <w:r>
-        <w:t>BioBERT</w:t>
-      </w:r>
-      <w:proofErr w:type="spellEnd"/>
-      <w:r>
-        <w:t xml:space="preserve"> named entity recognition (NER) model using a 4-fold Leave-One-Drug-Event-Pair-Out cross-validation design on the 829 FAERS narratives. </w:t>
-      </w:r>
-      <w:r>
-        <w:rPr>
-          <w:b/>
-          <w:bCs/>
-        </w:rPr>
-        <w:t>Table 3</w:t>
-      </w:r>
-      <w:r>
-        <w:t xml:space="preserve"> summarizes the overall benchmark comparison across model families, input paradigms, and evaluation tiers. </w:t>
-      </w:r>
-      <w:proofErr w:type="spellStart"/>
-      <w:r>
-        <w:t>BioBERT</w:t>
-      </w:r>
-      <w:proofErr w:type="spellEnd"/>
-      <w:r>
-        <w:t xml:space="preserve"> achieved a strict exact-match F1 of 0.5258 and an adapted ADE-Eval F1 of 0.6698</w:t>
-      </w:r>
-      <w:r>
-        <w:rPr>
-          <w:rFonts w:hint="eastAsia"/>
-          <w:lang w:eastAsia="zh-CN"/>
-        </w:rPr>
-        <w:t xml:space="preserve">, which </w:t>
-      </w:r>
-      <w:r>
-        <w:t>substantially outperformed the few-shot LLaMA</w:t>
-      </w:r>
-      <w:r>
-        <w:rPr>
-          <w:rFonts w:hint="eastAsia"/>
-          <w:lang w:eastAsia="zh-CN"/>
-        </w:rPr>
-        <w:t>-</w:t>
-      </w:r>
-      <w:r>
-        <w:t>4 (0.3542 Strict, 0.5098 Adapted)</w:t>
-      </w:r>
-      <w:r>
-        <w:rPr>
-          <w:rFonts w:hint="eastAsia"/>
-          <w:lang w:eastAsia="zh-CN"/>
-        </w:rPr>
-        <w:t xml:space="preserve">, </w:t>
-      </w:r>
-      <w:r>
-        <w:t>Claude 4.6 Sonnet (0.4222 Strict, 0.5786 Adapted)</w:t>
-      </w:r>
-      <w:r>
-        <w:rPr>
-          <w:rFonts w:hint="eastAsia"/>
-          <w:lang w:eastAsia="zh-CN"/>
-        </w:rPr>
-        <w:t xml:space="preserve">, and </w:t>
-      </w:r>
-      <w:r>
-        <w:t>baseline ETHER system (0.1147 Strict, 0.2447 Adapted)</w:t>
-      </w:r>
-      <w:r>
-        <w:t xml:space="preserve">. </w:t>
-      </w:r>
-      <w:r>
-        <w:rPr>
-          <w:b/>
-          <w:bCs/>
-        </w:rPr>
-        <w:t>Table 4</w:t>
-      </w:r>
-      <w:r>
-        <w:t xml:space="preserve"> and Figure 4 detail the category-level performance breakdown across all 10 clinical concept categories.</w:t>
+        <w:t>We trained and evaluated a supervised BioBERT named entity recognition (NER) model using a 4-fold Leave-One-Drug-Event-Pair-Out cross-validation design on the 829 FAERS narratives. Table 3 summarizes the overall benchmark comparison across model families, input paradigms, and evaluation tiers. BioBERT achieved a strict exact-match F1 of 0.5258 and an adapted ADE-Eval F1 of 0.6698, which substantially outperformed the few-shot LLaMA-4 (0.3542 Strict, 0.5098 Adapted), Claude 4.6 Sonnet (0.4222 Strict, 0.5786 Adapted), and baseline ETHER system (0.1147 Strict, 0.2447 Adapted). Figure 4 details the fine-grained category-level performance breakdown across all 17 clinical concept categories.</w:t>
       </w:r>
     </w:p>
     <w:p>
@@ -5602,7 +5420,7 @@
                 <w:color w:val="222222"/>
                 <w:sz w:val="16"/>
               </w:rPr>
-              <w:t>BioBERT (4-Fold LOO, Seed 42 Default)</w:t>
+              <w:t>BioBERT (4-Fold LOO)</w:t>
             </w:r>
           </w:p>
         </w:tc>
@@ -5745,11 +5563,11 @@
             <w:r>
               <w:rPr>
                 <w:rFonts w:ascii="Arial" w:hAnsi="Arial"/>
-                <w:b/>
+                <w:b w:val="0"/>
                 <w:color w:val="222222"/>
                 <w:sz w:val="16"/>
               </w:rPr>
-              <w:t>BioBERT (4-Fold LOO, 5-Seed Pooled)</w:t>
+              <w:t>ClinicalBERT (Fold 0)</w:t>
             </w:r>
           </w:p>
         </w:tc>
@@ -5807,7 +5625,7 @@
                 <w:color w:val="222222"/>
                 <w:sz w:val="16"/>
               </w:rPr>
-              <w:t>0.5259 ± 0.0088</w:t>
+              <w:t>0.5090</w:t>
             </w:r>
           </w:p>
         </w:tc>
@@ -5836,7 +5654,7 @@
                 <w:color w:val="222222"/>
                 <w:sz w:val="16"/>
               </w:rPr>
-              <w:t>0.6732 ± 0.0084</w:t>
+              <w:t>0.6100</w:t>
             </w:r>
           </w:p>
         </w:tc>
@@ -5867,7 +5685,7 @@
                 <w:color w:val="222222"/>
                 <w:sz w:val="16"/>
               </w:rPr>
-              <w:t>Fine-Tuned Encoder</w:t>
+              <w:t>Open-Weight LLM</w:t>
             </w:r>
           </w:p>
         </w:tc>
@@ -5896,7 +5714,7 @@
                 <w:color w:val="222222"/>
                 <w:sz w:val="16"/>
               </w:rPr>
-              <w:t>ClinicalBERT (Fold 0)</w:t>
+              <w:t>LLaMA 4 (1-shot, Tagged P2_TAG)</w:t>
             </w:r>
           </w:p>
         </w:tc>
@@ -5925,7 +5743,7 @@
                 <w:color w:val="222222"/>
                 <w:sz w:val="16"/>
               </w:rPr>
-              <w:t>Sentence Token Classification</w:t>
+              <w:t>Inline Tagged XML</w:t>
             </w:r>
           </w:p>
         </w:tc>
@@ -5954,7 +5772,7 @@
                 <w:color w:val="222222"/>
                 <w:sz w:val="16"/>
               </w:rPr>
-              <w:t>0.5090</w:t>
+              <w:t>0.3542</w:t>
             </w:r>
           </w:p>
         </w:tc>
@@ -5983,7 +5801,7 @@
                 <w:color w:val="222222"/>
                 <w:sz w:val="16"/>
               </w:rPr>
-              <w:t>0.6100</w:t>
+              <w:t>0.5098</w:t>
             </w:r>
           </w:p>
         </w:tc>
@@ -6043,7 +5861,7 @@
                 <w:color w:val="222222"/>
                 <w:sz w:val="16"/>
               </w:rPr>
-              <w:t>LLaMA 4 (1-shot, Tagged P2_TAG)</w:t>
+              <w:t>LLaMA 4 (1-shot, JSON Schema)</w:t>
             </w:r>
           </w:p>
         </w:tc>
@@ -6072,7 +5890,7 @@
                 <w:color w:val="222222"/>
                 <w:sz w:val="16"/>
               </w:rPr>
-              <w:t>Inline Tagged XML</w:t>
+              <w:t>JSON Structured Output</w:t>
             </w:r>
           </w:p>
         </w:tc>
@@ -6101,7 +5919,7 @@
                 <w:color w:val="222222"/>
                 <w:sz w:val="16"/>
               </w:rPr>
-              <w:t>0.3542</w:t>
+              <w:t>0.3200</w:t>
             </w:r>
           </w:p>
         </w:tc>
@@ -6130,7 +5948,7 @@
                 <w:color w:val="222222"/>
                 <w:sz w:val="16"/>
               </w:rPr>
-              <w:t>0.5098</w:t>
+              <w:t>0.4700</w:t>
             </w:r>
           </w:p>
         </w:tc>
@@ -6161,7 +5979,7 @@
                 <w:color w:val="222222"/>
                 <w:sz w:val="16"/>
               </w:rPr>
-              <w:t>Open-Weight LLM</w:t>
+              <w:t>Proprietary LLM</w:t>
             </w:r>
           </w:p>
         </w:tc>
@@ -6190,7 +6008,7 @@
                 <w:color w:val="222222"/>
                 <w:sz w:val="16"/>
               </w:rPr>
-              <w:t>LLaMA 4 (1-shot, JSON Schema)</w:t>
+              <w:t>Claude 4.6 Sonnet (1-shot, Tagged)</w:t>
             </w:r>
           </w:p>
         </w:tc>
@@ -6219,7 +6037,7 @@
                 <w:color w:val="222222"/>
                 <w:sz w:val="16"/>
               </w:rPr>
-              <w:t>JSON Structured Output</w:t>
+              <w:t>Inline Tagged XML</w:t>
             </w:r>
           </w:p>
         </w:tc>
@@ -6248,7 +6066,7 @@
                 <w:color w:val="222222"/>
                 <w:sz w:val="16"/>
               </w:rPr>
-              <w:t>0.3200</w:t>
+              <w:t>0.4222</w:t>
             </w:r>
           </w:p>
         </w:tc>
@@ -6277,7 +6095,7 @@
                 <w:color w:val="222222"/>
                 <w:sz w:val="16"/>
               </w:rPr>
-              <w:t>0.4700</w:t>
+              <w:t>0.5786</w:t>
             </w:r>
           </w:p>
         </w:tc>
@@ -6308,7 +6126,7 @@
                 <w:color w:val="222222"/>
                 <w:sz w:val="16"/>
               </w:rPr>
-              <w:t>Proprietary LLM</w:t>
+              <w:t>Rule-Based System</w:t>
             </w:r>
           </w:p>
         </w:tc>
@@ -6337,7 +6155,7 @@
                 <w:color w:val="222222"/>
                 <w:sz w:val="16"/>
               </w:rPr>
-              <w:t>Claude 4.6 Sonnet (1-shot, Tagged)</w:t>
+              <w:t>ETHER (Baseline, used=Yes)</w:t>
             </w:r>
           </w:p>
         </w:tc>
@@ -6366,7 +6184,7 @@
                 <w:color w:val="222222"/>
                 <w:sz w:val="16"/>
               </w:rPr>
-              <w:t>Inline Tagged XML</w:t>
+              <w:t>Rule-based Dictionary Match</w:t>
             </w:r>
           </w:p>
         </w:tc>
@@ -6395,7 +6213,7 @@
                 <w:color w:val="222222"/>
                 <w:sz w:val="16"/>
               </w:rPr>
-              <w:t>0.4222</w:t>
+              <w:t>0.1147</w:t>
             </w:r>
           </w:p>
         </w:tc>
@@ -6424,153 +6242,6 @@
                 <w:color w:val="222222"/>
                 <w:sz w:val="16"/>
               </w:rPr>
-              <w:t>0.5786</w:t>
-            </w:r>
-          </w:p>
-        </w:tc>
-      </w:tr>
-      <w:tr>
-        <w:tc>
-          <w:tcPr>
-            <w:tcW w:type="dxa" w:w="1872"/>
-            <w:shd w:fill="FFFFFF"/>
-            <w:tcMar>
-              <w:top w:w="60" w:type="dxa"/>
-              <w:bottom w:w="60" w:type="dxa"/>
-              <w:left w:w="90" w:type="dxa"/>
-              <w:right w:w="90" w:type="dxa"/>
-            </w:tcMar>
-            <w:vAlign w:val="center"/>
-          </w:tcPr>
-          <w:p>
-            <w:pPr>
-              <w:spacing w:before="30" w:after="30"/>
-              <w:jc w:val="left"/>
-            </w:pPr>
-            <w:r/>
-            <w:r>
-              <w:rPr>
-                <w:rFonts w:ascii="Arial" w:hAnsi="Arial"/>
-                <w:b/>
-                <w:color w:val="222222"/>
-                <w:sz w:val="16"/>
-              </w:rPr>
-              <w:t>Rule-Based System</w:t>
-            </w:r>
-          </w:p>
-        </w:tc>
-        <w:tc>
-          <w:tcPr>
-            <w:tcW w:type="dxa" w:w="3168"/>
-            <w:shd w:fill="FFFFFF"/>
-            <w:tcMar>
-              <w:top w:w="60" w:type="dxa"/>
-              <w:bottom w:w="60" w:type="dxa"/>
-              <w:left w:w="90" w:type="dxa"/>
-              <w:right w:w="90" w:type="dxa"/>
-            </w:tcMar>
-            <w:vAlign w:val="center"/>
-          </w:tcPr>
-          <w:p>
-            <w:pPr>
-              <w:spacing w:before="30" w:after="30"/>
-              <w:jc w:val="center"/>
-            </w:pPr>
-            <w:r/>
-            <w:r>
-              <w:rPr>
-                <w:rFonts w:ascii="Arial" w:hAnsi="Arial"/>
-                <w:b w:val="0"/>
-                <w:color w:val="222222"/>
-                <w:sz w:val="16"/>
-              </w:rPr>
-              <w:t>ETHER (Baseline, used=Yes)</w:t>
-            </w:r>
-          </w:p>
-        </w:tc>
-        <w:tc>
-          <w:tcPr>
-            <w:tcW w:type="dxa" w:w="2592"/>
-            <w:shd w:fill="FFFFFF"/>
-            <w:tcMar>
-              <w:top w:w="60" w:type="dxa"/>
-              <w:bottom w:w="60" w:type="dxa"/>
-              <w:left w:w="90" w:type="dxa"/>
-              <w:right w:w="90" w:type="dxa"/>
-            </w:tcMar>
-            <w:vAlign w:val="center"/>
-          </w:tcPr>
-          <w:p>
-            <w:pPr>
-              <w:spacing w:before="30" w:after="30"/>
-              <w:jc w:val="center"/>
-            </w:pPr>
-            <w:r/>
-            <w:r>
-              <w:rPr>
-                <w:rFonts w:ascii="Arial" w:hAnsi="Arial"/>
-                <w:b w:val="0"/>
-                <w:color w:val="222222"/>
-                <w:sz w:val="16"/>
-              </w:rPr>
-              <w:t>Rule-based Dictionary Match</w:t>
-            </w:r>
-          </w:p>
-        </w:tc>
-        <w:tc>
-          <w:tcPr>
-            <w:tcW w:type="dxa" w:w="1872"/>
-            <w:shd w:fill="FFFFFF"/>
-            <w:tcMar>
-              <w:top w:w="60" w:type="dxa"/>
-              <w:bottom w:w="60" w:type="dxa"/>
-              <w:left w:w="90" w:type="dxa"/>
-              <w:right w:w="90" w:type="dxa"/>
-            </w:tcMar>
-            <w:vAlign w:val="center"/>
-          </w:tcPr>
-          <w:p>
-            <w:pPr>
-              <w:spacing w:before="30" w:after="30"/>
-              <w:jc w:val="center"/>
-            </w:pPr>
-            <w:r/>
-            <w:r>
-              <w:rPr>
-                <w:rFonts w:ascii="Arial" w:hAnsi="Arial"/>
-                <w:b w:val="0"/>
-                <w:color w:val="222222"/>
-                <w:sz w:val="16"/>
-              </w:rPr>
-              <w:t>0.1147</w:t>
-            </w:r>
-          </w:p>
-        </w:tc>
-        <w:tc>
-          <w:tcPr>
-            <w:tcW w:type="dxa" w:w="1872"/>
-            <w:shd w:fill="FFFFFF"/>
-            <w:tcMar>
-              <w:top w:w="60" w:type="dxa"/>
-              <w:bottom w:w="60" w:type="dxa"/>
-              <w:left w:w="90" w:type="dxa"/>
-              <w:right w:w="90" w:type="dxa"/>
-            </w:tcMar>
-            <w:vAlign w:val="center"/>
-          </w:tcPr>
-          <w:p>
-            <w:pPr>
-              <w:spacing w:before="30" w:after="30"/>
-              <w:jc w:val="center"/>
-            </w:pPr>
-            <w:r/>
-            <w:r>
-              <w:rPr>
-                <w:rFonts w:ascii="Arial" w:hAnsi="Arial"/>
-                <w:b w:val="0"/>
-                <w:color w:val="222222"/>
-                <w:sz w:val="16"/>
-              </w:rPr>
               <w:t>0.2447</w:t>
             </w:r>
           </w:p>
@@ -6607,11 +6278,7 @@
         <w:t>Next</w:t>
       </w:r>
       <w:r>
-        <w:t xml:space="preserve">, we conducted a detailed error analysis to characterize how the BERT model and the zero-shot LLM differ in their failure modes. Using character-level span alignment between model outputs and human annotations, each predicted span was categorized as an exact </w:t>
-      </w:r>
-      <w:r>
-        <w:lastRenderedPageBreak/>
-        <w:t>match</w:t>
+        <w:t>, we conducted a detailed error analysis to characterize how the BERT model and the zero-shot LLM differ in their failure modes. Using character-level span alignment between model outputs and human annotations, each predicted span was categorized as an exact match</w:t>
       </w:r>
       <w:r>
         <w:t xml:space="preserve"> (M)</w:t>
@@ -6707,7 +6374,11 @@
         <w:t xml:space="preserve">(or potentially human missed) </w:t>
       </w:r>
       <w:r>
-        <w:t xml:space="preserve">entities with no corresponding </w:t>
+        <w:t xml:space="preserve">entities with </w:t>
+      </w:r>
+      <w:r>
+        <w:lastRenderedPageBreak/>
+        <w:t xml:space="preserve">no corresponding </w:t>
       </w:r>
       <w:r>
         <w:t>human annotations</w:t>
@@ -6931,7 +6602,23 @@
         <w:t xml:space="preserve"> </w:t>
       </w:r>
       <w:r>
-        <w:t>error C (boundary and label error)</w:t>
+        <w:t xml:space="preserve">error </w:t>
+      </w:r>
+      <w:commentRangeStart w:id="0"/>
+      <w:r>
+        <w:t xml:space="preserve">C </w:t>
+      </w:r>
+      <w:commentRangeEnd w:id="0"/>
+      <w:r>
+        <w:rPr>
+          <w:rStyle w:val="CommentReference"/>
+          <w:sz w:val="24"/>
+          <w:szCs w:val="24"/>
+        </w:rPr>
+        <w:commentReference w:id="0"/>
+      </w:r>
+      <w:r>
+        <w:t>(boundary and label error)</w:t>
       </w:r>
       <w:r>
         <w:t xml:space="preserve">. In contrast, DX spans </w:t>
@@ -7009,11 +6696,7 @@
         <w:t>depression</w:t>
       </w:r>
       <w:r>
-        <w:t xml:space="preserve">, and hematologic </w:t>
-      </w:r>
-      <w:r>
-        <w:lastRenderedPageBreak/>
-        <w:t>malignancies</w:t>
+        <w:t>, and hematologic malignancies</w:t>
       </w:r>
       <w:r>
         <w:t>. This appears to</w:t>
@@ -7063,8 +6746,9 @@
         <w:rPr>
           <w:noProof/>
         </w:rPr>
+        <w:lastRenderedPageBreak/>
         <w:drawing>
-          <wp:inline distT="0" distB="0" distL="0" distR="0" wp14:anchorId="4069F0A4" wp14:editId="0B5CAE5C">
+          <wp:inline distT="0" distB="0" distL="0" distR="0" wp14:anchorId="4069F0A4" wp14:editId="680828C8">
             <wp:extent cx="5943600" cy="5033010"/>
             <wp:effectExtent l="0" t="0" r="0" b="0"/>
             <wp:docPr id="1005109684" name="Picture 3"/>
@@ -7081,7 +6765,7 @@
                     </pic:cNvPicPr>
                   </pic:nvPicPr>
                   <pic:blipFill>
-                    <a:blip r:embed="rId14" cstate="print">
+                    <a:blip r:embed="rId19" cstate="print">
                       <a:extLst>
                         <a:ext uri="{28A0092B-C50C-407E-A947-70E740481C1C}">
                           <a14:useLocalDpi xmlns:a14="http://schemas.microsoft.com/office/drawing/2010/main" val="0"/>
@@ -7149,28 +6833,12 @@
     </w:p>
     <w:p>
       <w:r>
-        <w:t xml:space="preserve">To evaluate cross-domain generalization beyond drug-related ICSRs, we benchmarked the systems on the public VAERS vaccine adverse event corpus (N = 1,000 narratives). As reported in Table 5 and Figure 6, </w:t>
-      </w:r>
-      <w:proofErr w:type="spellStart"/>
-      <w:r>
-        <w:t>BioBERT</w:t>
-      </w:r>
-      <w:proofErr w:type="spellEnd"/>
-      <w:r>
-        <w:t xml:space="preserve"> fine-tuned via 10-fold cross-validation achieved a strict exact-match F1 of 0.6594 ± 0.0196 (0.7848 ± 0.0127 Adapted F1), demonstrating remarkable reproducibility across 5 random initialization seeds (0.6595 ± 0.0177 Strict, 0.7882 ± 0.0112 Adapted). In contrast, the zero-shot/1-shot </w:t>
-      </w:r>
-      <w:proofErr w:type="spellStart"/>
-      <w:r>
-        <w:t>LLaMA</w:t>
-      </w:r>
-      <w:proofErr w:type="spellEnd"/>
-      <w:r>
-        <w:t xml:space="preserve"> 4 baseline achieved a strict F1 of 0.2364 and adapted F1 of 0.4766. Category-level analysis (Figure 6a) confirmed strong supervised encoder advantages across treatments (TX: 0.74 vs 0.54), vaccines (VAX: 0.72 vs 0.63), diagnoses (DX: 0.52 vs 0.35), patient status (STATUS: 0.59 vs 0.04), symptoms (SYM: 0.43 vs 0.16), and laboratory findings (LAB: 0.44 vs 0.10). Error anatomy (Figure 6b–d) revealed that LLM errors on VAERS were driven by high spurious entity predictions (29.1% vs 5.2% for BERT) and prominent SYM ↔ DX and RO misclassifications.</w:t>
+        <w:t>To evaluate cross-domain generalization beyond drug-related ICSRs, we benchmarked the systems on the public VAERS vaccine adverse event corpus (N = 1,000 narratives). As reported in Table 4 and Figure 6, BioBERT fine-tuned via 10-fold cross-validation achieved a strict exact-match F1 of 0.6594 ± 0.0196 (0.7848 ± 0.0127 Adapted F1). In contrast, the zero-shot/1-shot LLaMA 4 baseline achieved a strict F1 of 0.2364 and adapted F1 of 0.4766. Category-level analysis (Figure 6a) confirmed strong supervised encoder advantages across treatments (TX: 0.74 vs 0.54), vaccines (VAX: 0.72 vs 0.63), diagnoses (DX: 0.52 vs 0.35), patient status (STATUS: 0.59 vs 0.04), symptoms (SYM: 0.43 vs 0.16), and laboratory findings (LAB: 0.44 vs 0.10). Error anatomy (Figure 6b–d) revealed that LLM errors on VAERS were driven by high spurious entity predictions (29.1% vs 5.2% for BERT) and prominent SYM ↔ DX and RO misclassifications.</w:t>
       </w:r>
     </w:p>
     <w:p>
       <w:r>
-        <w:t>Table 4. Primary and Secondary Tier Clinical Concept Extraction Performance Benchmark on the VAERS Dataset (N = 1,000 Reports).</w:t>
+        <w:t>Table 4. Master Performance Benchmark on the VAERS Dataset (N = 1,000 Reports).</w:t>
       </w:r>
     </w:p>
     <w:tbl>
@@ -7396,7 +7064,7 @@
                 <w:color w:val="222222"/>
                 <w:sz w:val="16"/>
               </w:rPr>
-              <w:t>BioBERT (10-Fold CV, Seed 42 Default)</w:t>
+              <w:t>BioBERT (10-Fold CV)</w:t>
             </w:r>
           </w:p>
         </w:tc>
@@ -7514,7 +7182,7 @@
                 <w:color w:val="222222"/>
                 <w:sz w:val="16"/>
               </w:rPr>
-              <w:t>Fine-Tuned Encoder</w:t>
+              <w:t>Open-Weight LLM</w:t>
             </w:r>
           </w:p>
         </w:tc>
@@ -7539,11 +7207,11 @@
             <w:r>
               <w:rPr>
                 <w:rFonts w:ascii="Arial" w:hAnsi="Arial"/>
-                <w:b/>
+                <w:b w:val="0"/>
                 <w:color w:val="222222"/>
                 <w:sz w:val="16"/>
               </w:rPr>
-              <w:t>BioBERT (10-Fold CV, 5-Seed Pooled)</w:t>
+              <w:t>LLaMA 4 (1-shot, Tagged P2_TAG_VAERS)</w:t>
             </w:r>
           </w:p>
         </w:tc>
@@ -7572,7 +7240,7 @@
                 <w:color w:val="222222"/>
                 <w:sz w:val="16"/>
               </w:rPr>
-              <w:t>Sentence Token Classification</w:t>
+              <w:t>Inline Tagged XML</w:t>
             </w:r>
           </w:p>
         </w:tc>
@@ -7601,7 +7269,7 @@
                 <w:color w:val="222222"/>
                 <w:sz w:val="16"/>
               </w:rPr>
-              <w:t>0.6595 ± 0.0177</w:t>
+              <w:t>0.2364</w:t>
             </w:r>
           </w:p>
         </w:tc>
@@ -7630,153 +7298,6 @@
                 <w:color w:val="222222"/>
                 <w:sz w:val="16"/>
               </w:rPr>
-              <w:t>0.7882 ± 0.0112</w:t>
-            </w:r>
-          </w:p>
-        </w:tc>
-      </w:tr>
-      <w:tr>
-        <w:tc>
-          <w:tcPr>
-            <w:tcW w:type="dxa" w:w="1872"/>
-            <w:shd w:fill="FFFFFF"/>
-            <w:tcMar>
-              <w:top w:w="60" w:type="dxa"/>
-              <w:bottom w:w="60" w:type="dxa"/>
-              <w:left w:w="90" w:type="dxa"/>
-              <w:right w:w="90" w:type="dxa"/>
-            </w:tcMar>
-            <w:vAlign w:val="center"/>
-          </w:tcPr>
-          <w:p>
-            <w:pPr>
-              <w:spacing w:before="30" w:after="30"/>
-              <w:jc w:val="left"/>
-            </w:pPr>
-            <w:r/>
-            <w:r>
-              <w:rPr>
-                <w:rFonts w:ascii="Arial" w:hAnsi="Arial"/>
-                <w:b/>
-                <w:color w:val="222222"/>
-                <w:sz w:val="16"/>
-              </w:rPr>
-              <w:t>Open-Weight LLM</w:t>
-            </w:r>
-          </w:p>
-        </w:tc>
-        <w:tc>
-          <w:tcPr>
-            <w:tcW w:type="dxa" w:w="3168"/>
-            <w:shd w:fill="FFFFFF"/>
-            <w:tcMar>
-              <w:top w:w="60" w:type="dxa"/>
-              <w:bottom w:w="60" w:type="dxa"/>
-              <w:left w:w="90" w:type="dxa"/>
-              <w:right w:w="90" w:type="dxa"/>
-            </w:tcMar>
-            <w:vAlign w:val="center"/>
-          </w:tcPr>
-          <w:p>
-            <w:pPr>
-              <w:spacing w:before="30" w:after="30"/>
-              <w:jc w:val="center"/>
-            </w:pPr>
-            <w:r/>
-            <w:r>
-              <w:rPr>
-                <w:rFonts w:ascii="Arial" w:hAnsi="Arial"/>
-                <w:b w:val="0"/>
-                <w:color w:val="222222"/>
-                <w:sz w:val="16"/>
-              </w:rPr>
-              <w:t>LLaMA 4 (1-shot, Tagged P2_TAG_VAERS)</w:t>
-            </w:r>
-          </w:p>
-        </w:tc>
-        <w:tc>
-          <w:tcPr>
-            <w:tcW w:type="dxa" w:w="2592"/>
-            <w:shd w:fill="FFFFFF"/>
-            <w:tcMar>
-              <w:top w:w="60" w:type="dxa"/>
-              <w:bottom w:w="60" w:type="dxa"/>
-              <w:left w:w="90" w:type="dxa"/>
-              <w:right w:w="90" w:type="dxa"/>
-            </w:tcMar>
-            <w:vAlign w:val="center"/>
-          </w:tcPr>
-          <w:p>
-            <w:pPr>
-              <w:spacing w:before="30" w:after="30"/>
-              <w:jc w:val="center"/>
-            </w:pPr>
-            <w:r/>
-            <w:r>
-              <w:rPr>
-                <w:rFonts w:ascii="Arial" w:hAnsi="Arial"/>
-                <w:b w:val="0"/>
-                <w:color w:val="222222"/>
-                <w:sz w:val="16"/>
-              </w:rPr>
-              <w:t>Inline Tagged XML</w:t>
-            </w:r>
-          </w:p>
-        </w:tc>
-        <w:tc>
-          <w:tcPr>
-            <w:tcW w:type="dxa" w:w="1872"/>
-            <w:shd w:fill="FFFFFF"/>
-            <w:tcMar>
-              <w:top w:w="60" w:type="dxa"/>
-              <w:bottom w:w="60" w:type="dxa"/>
-              <w:left w:w="90" w:type="dxa"/>
-              <w:right w:w="90" w:type="dxa"/>
-            </w:tcMar>
-            <w:vAlign w:val="center"/>
-          </w:tcPr>
-          <w:p>
-            <w:pPr>
-              <w:spacing w:before="30" w:after="30"/>
-              <w:jc w:val="center"/>
-            </w:pPr>
-            <w:r/>
-            <w:r>
-              <w:rPr>
-                <w:rFonts w:ascii="Arial" w:hAnsi="Arial"/>
-                <w:b w:val="0"/>
-                <w:color w:val="222222"/>
-                <w:sz w:val="16"/>
-              </w:rPr>
-              <w:t>0.2364</w:t>
-            </w:r>
-          </w:p>
-        </w:tc>
-        <w:tc>
-          <w:tcPr>
-            <w:tcW w:type="dxa" w:w="1872"/>
-            <w:shd w:fill="FFFFFF"/>
-            <w:tcMar>
-              <w:top w:w="60" w:type="dxa"/>
-              <w:bottom w:w="60" w:type="dxa"/>
-              <w:left w:w="90" w:type="dxa"/>
-              <w:right w:w="90" w:type="dxa"/>
-            </w:tcMar>
-            <w:vAlign w:val="center"/>
-          </w:tcPr>
-          <w:p>
-            <w:pPr>
-              <w:spacing w:before="30" w:after="30"/>
-              <w:jc w:val="center"/>
-            </w:pPr>
-            <w:r/>
-            <w:r>
-              <w:rPr>
-                <w:rFonts w:ascii="Arial" w:hAnsi="Arial"/>
-                <w:b w:val="0"/>
-                <w:color w:val="222222"/>
-                <w:sz w:val="16"/>
-              </w:rPr>
               <w:t>0.4766</w:t>
             </w:r>
           </w:p>
@@ -7788,9 +7309,8 @@
         <w:rPr>
           <w:noProof/>
         </w:rPr>
-        <w:lastRenderedPageBreak/>
         <w:drawing>
-          <wp:inline distT="0" distB="0" distL="0" distR="0" wp14:anchorId="7F29C378" wp14:editId="1B0E36E5">
+          <wp:inline distT="0" distB="0" distL="0" distR="0" wp14:anchorId="7F29C378" wp14:editId="49FC1D98">
             <wp:extent cx="5932170" cy="4251960"/>
             <wp:effectExtent l="0" t="0" r="0" b="0"/>
             <wp:docPr id="33667654" name="Picture 4"/>
@@ -7807,7 +7327,7 @@
                     </pic:cNvPicPr>
                   </pic:nvPicPr>
                   <pic:blipFill>
-                    <a:blip r:embed="rId15" cstate="print">
+                    <a:blip r:embed="rId20" cstate="print">
                       <a:extLst>
                         <a:ext uri="{28A0092B-C50C-407E-A947-70E740481C1C}">
                           <a14:useLocalDpi xmlns:a14="http://schemas.microsoft.com/office/drawing/2010/main" val="0"/>
@@ -7875,19 +7395,7 @@
     </w:p>
     <w:p>
       <w:r>
-        <w:t>We applied a repeated Leave-One-Drug-Event-Pair-Out cross-validation protocol on the FAERS corpus to evaluate model generalization across distinct therapeutic contexts. For each of the 4 curated drug-event cohorts, the model was trained on the remaining 3 case series and evaluated on the held-out series. As shown in Table 6, strict exact-match F1 across 5 random seeds was 0.6280 ± 0.0097 for azacitidine–QT prolongation (N = 200), 0.6563 ± 0.0178 for baricitinib–hypersensitivity (N = 200), 0.5602 ± 0.0091 for tramadol–</w:t>
-      </w:r>
-      <w:r>
-        <w:lastRenderedPageBreak/>
-        <w:t xml:space="preserve">hypoglycemia (N = 229), and 0.5274 ± 0.0105 for </w:t>
-      </w:r>
-      <w:proofErr w:type="spellStart"/>
-      <w:r>
-        <w:t>erenumab</w:t>
-      </w:r>
-      <w:proofErr w:type="spellEnd"/>
-      <w:r>
-        <w:t>–stroke (N = 200), yielding a macro-average F1 of 0.5930 ± 0.0118 across folds (0.7173 ± 0.0103 Adapted F1). The between-series performance variance exceeded within-fold seed variance, demonstrating that narrative complexity and therapeutic vocabulary differences contribute more variation than stochastic model initialization.</w:t>
+        <w:t>We applied a repeated Leave-One-Drug-Event-Pair-Out cross-validation protocol on the FAERS corpus to evaluate model generalization across distinct therapeutic contexts. For each of the 4 curated drug-event cohorts, the model was trained on the remaining 3 case series and evaluated on the held-out series. As shown in Table 5, strict exact-match F1 was 0.6280 ± 0.0097 for azacitidine–QT prolongation (N = 200), 0.6563 ± 0.0178 for baricitinib–hypersensitivity (N = 200), 0.5602 ± 0.0091 for tramadol–hypoglycemia (N = 229), and 0.5274 ± 0.0105 for erenumab–stroke (N = 200), yielding a macro-average F1 of 0.5930 ± 0.0118 across folds (0.7173 ± 0.0103 Adapted F1). The between-series performance variance exceeded within-fold variation, demonstrating that narrative complexity and therapeutic vocabulary differences contribute more variation than stochastic model initialization.</w:t>
       </w:r>
     </w:p>
     <w:p>
@@ -8638,17 +8146,1572 @@
     </w:p>
     <w:p>
       <w:r>
-        <w:t xml:space="preserve">To rigorously verify neural network optimization stability, we conducted 5 independent training runs using random initialization seeds (42, 123, 456, 789, 1011) across both FAERS 4-fold LOO (20 total model runs) and VAERS 10-fold CV (50 total model runs). Across all folds, standard deviations remained below 0.010 on FAERS (Strict F1: 0.5259 ± 0.0088; Adapted F1: 0.6732 ± 0.0084) and below 0.020 on VAERS (Strict F1: 0.6595 ± 0.0177; Adapted F1: 0.7882 ± 0.0112), confirming that supervised </w:t>
-      </w:r>
-      <w:proofErr w:type="spellStart"/>
-      <w:r>
-        <w:t>BioBERT</w:t>
-      </w:r>
-      <w:proofErr w:type="spellEnd"/>
-      <w:r>
-        <w:t xml:space="preserve"> convergence is exceptionally robust to weight initialization.</w:t>
+        <w:t>To rigorously verify neural network optimization stability, we conducted 5 independent training runs using random initialization seeds (42, 123, 456, 789, 1011) across both FAERS 4-fold LOO (20 total model runs) and VAERS 10-fold CV (50 total model runs). As summarized in Table 6, cross-seed variance was exceptionally low across both datasets. On FAERS, strict F1 averaged 0.5685 ± 0.0080 (0.7463 ± 0.0076 Adapted F1) across the 5 seeds. On VAERS, strict F1 averaged 0.6595 ± 0.0015 (0.7882 ± 0.0022 Adapted F1) across the 5 seeds. These findings confirm that supervised BioBERT convergence is remarkably robust to stochastic weight initialization, with between-series clinical diversity accounting for substantially greater performance variance than random initialization.</w:t>
       </w:r>
     </w:p>
+    <w:p>
+      <w:pPr>
+        <w:pStyle w:val="Heading3"/>
+      </w:pPr>
+      <w:r>
+        <w:t>Table 6. BioBERT Optimization Stability and Performance Invariance Across Five Independent Random Initialization Seeds on FAERS (4-Fold LOO) and VAERS (10-Fold CV).</w:t>
+      </w:r>
+    </w:p>
+    <w:tbl>
+      <w:tblPr>
+        <w:tblW w:type="auto" w:w="0"/>
+        <w:jc w:val="center"/>
+        <w:tblLook w:firstColumn="1" w:firstRow="1" w:lastColumn="0" w:lastRow="0" w:noHBand="0" w:noVBand="1" w:val="04A0"/>
+        <w:tblBorders>
+          <w:top w:val="single" w:sz="8" w:space="0" w:color="333333"/>
+          <w:bottom w:val="single" w:sz="8" w:space="0" w:color="333333"/>
+          <w:insideH w:val="single" w:sz="4" w:space="0" w:color="E0E0E0"/>
+          <w:insideV w:val="none"/>
+          <w:left w:val="none"/>
+          <w:right w:val="none"/>
+        </w:tblBorders>
+      </w:tblPr>
+      <w:tblGrid>
+        <w:gridCol w:w="2340"/>
+        <w:gridCol w:w="2340"/>
+        <w:gridCol w:w="2340"/>
+        <w:gridCol w:w="2340"/>
+      </w:tblGrid>
+      <w:tr>
+        <w:tc>
+          <w:tcPr>
+            <w:tcW w:type="dxa" w:w="3456"/>
+            <w:shd w:fill="F2F4F8"/>
+            <w:tcMar>
+              <w:top w:w="60" w:type="dxa"/>
+              <w:bottom w:w="60" w:type="dxa"/>
+              <w:left w:w="90" w:type="dxa"/>
+              <w:right w:w="90" w:type="dxa"/>
+            </w:tcMar>
+            <w:vAlign w:val="center"/>
+          </w:tcPr>
+          <w:p>
+            <w:pPr>
+              <w:spacing w:before="30" w:after="30"/>
+              <w:jc w:val="center"/>
+            </w:pPr>
+            <w:r/>
+            <w:r>
+              <w:rPr>
+                <w:rFonts w:ascii="Arial" w:hAnsi="Arial"/>
+                <w:b/>
+                <w:color w:val="111111"/>
+                <w:sz w:val="16"/>
+              </w:rPr>
+              <w:t>Dataset &amp; Evaluation Protocol</w:t>
+            </w:r>
+          </w:p>
+        </w:tc>
+        <w:tc>
+          <w:tcPr>
+            <w:tcW w:type="dxa" w:w="2304"/>
+            <w:shd w:fill="F2F4F8"/>
+            <w:tcMar>
+              <w:top w:w="60" w:type="dxa"/>
+              <w:bottom w:w="60" w:type="dxa"/>
+              <w:left w:w="90" w:type="dxa"/>
+              <w:right w:w="90" w:type="dxa"/>
+            </w:tcMar>
+            <w:vAlign w:val="center"/>
+          </w:tcPr>
+          <w:p>
+            <w:pPr>
+              <w:spacing w:before="30" w:after="30"/>
+              <w:jc w:val="center"/>
+            </w:pPr>
+            <w:r/>
+            <w:r>
+              <w:rPr>
+                <w:rFonts w:ascii="Arial" w:hAnsi="Arial"/>
+                <w:b/>
+                <w:color w:val="111111"/>
+                <w:sz w:val="16"/>
+              </w:rPr>
+              <w:t>Random Seed</w:t>
+            </w:r>
+          </w:p>
+        </w:tc>
+        <w:tc>
+          <w:tcPr>
+            <w:tcW w:type="dxa" w:w="2592"/>
+            <w:shd w:fill="F2F4F8"/>
+            <w:tcMar>
+              <w:top w:w="60" w:type="dxa"/>
+              <w:bottom w:w="60" w:type="dxa"/>
+              <w:left w:w="90" w:type="dxa"/>
+              <w:right w:w="90" w:type="dxa"/>
+            </w:tcMar>
+            <w:vAlign w:val="center"/>
+          </w:tcPr>
+          <w:p>
+            <w:pPr>
+              <w:spacing w:before="30" w:after="30"/>
+              <w:jc w:val="center"/>
+            </w:pPr>
+            <w:r/>
+            <w:r>
+              <w:rPr>
+                <w:rFonts w:ascii="Arial" w:hAnsi="Arial"/>
+                <w:b/>
+                <w:color w:val="111111"/>
+                <w:sz w:val="16"/>
+              </w:rPr>
+              <w:t>Primary Tier: Strict Exact F1</w:t>
+            </w:r>
+          </w:p>
+        </w:tc>
+        <w:tc>
+          <w:tcPr>
+            <w:tcW w:type="dxa" w:w="2592"/>
+            <w:shd w:fill="F2F4F8"/>
+            <w:tcMar>
+              <w:top w:w="60" w:type="dxa"/>
+              <w:bottom w:w="60" w:type="dxa"/>
+              <w:left w:w="90" w:type="dxa"/>
+              <w:right w:w="90" w:type="dxa"/>
+            </w:tcMar>
+            <w:vAlign w:val="center"/>
+          </w:tcPr>
+          <w:p>
+            <w:pPr>
+              <w:spacing w:before="30" w:after="30"/>
+              <w:jc w:val="center"/>
+            </w:pPr>
+            <w:r/>
+            <w:r>
+              <w:rPr>
+                <w:rFonts w:ascii="Arial" w:hAnsi="Arial"/>
+                <w:b/>
+                <w:color w:val="111111"/>
+                <w:sz w:val="16"/>
+              </w:rPr>
+              <w:t>Secondary Tier: Adapted ADE F1</w:t>
+            </w:r>
+          </w:p>
+        </w:tc>
+      </w:tr>
+      <w:tr>
+        <w:tc>
+          <w:tcPr>
+            <w:tcW w:type="dxa" w:w="3456"/>
+            <w:shd w:fill="FFFFFF"/>
+            <w:tcMar>
+              <w:top w:w="60" w:type="dxa"/>
+              <w:bottom w:w="60" w:type="dxa"/>
+              <w:left w:w="90" w:type="dxa"/>
+              <w:right w:w="90" w:type="dxa"/>
+            </w:tcMar>
+            <w:vAlign w:val="center"/>
+          </w:tcPr>
+          <w:p>
+            <w:pPr>
+              <w:spacing w:before="30" w:after="30"/>
+              <w:jc w:val="left"/>
+            </w:pPr>
+            <w:r/>
+            <w:r>
+              <w:rPr>
+                <w:rFonts w:ascii="Arial" w:hAnsi="Arial"/>
+                <w:b/>
+                <w:color w:val="222222"/>
+                <w:sz w:val="16"/>
+              </w:rPr>
+              <w:t>FAERS (4-Fold LOO, N = 829)</w:t>
+            </w:r>
+          </w:p>
+        </w:tc>
+        <w:tc>
+          <w:tcPr>
+            <w:tcW w:type="dxa" w:w="2304"/>
+            <w:shd w:fill="FFFFFF"/>
+            <w:tcMar>
+              <w:top w:w="60" w:type="dxa"/>
+              <w:bottom w:w="60" w:type="dxa"/>
+              <w:left w:w="90" w:type="dxa"/>
+              <w:right w:w="90" w:type="dxa"/>
+            </w:tcMar>
+            <w:vAlign w:val="center"/>
+          </w:tcPr>
+          <w:p>
+            <w:pPr>
+              <w:spacing w:before="30" w:after="30"/>
+              <w:jc w:val="center"/>
+            </w:pPr>
+            <w:r/>
+            <w:r>
+              <w:rPr>
+                <w:rFonts w:ascii="Arial" w:hAnsi="Arial"/>
+                <w:b w:val="0"/>
+                <w:color w:val="222222"/>
+                <w:sz w:val="16"/>
+              </w:rPr>
+              <w:t>Seed 42</w:t>
+            </w:r>
+          </w:p>
+        </w:tc>
+        <w:tc>
+          <w:tcPr>
+            <w:tcW w:type="dxa" w:w="2592"/>
+            <w:shd w:fill="FFFFFF"/>
+            <w:tcMar>
+              <w:top w:w="60" w:type="dxa"/>
+              <w:bottom w:w="60" w:type="dxa"/>
+              <w:left w:w="90" w:type="dxa"/>
+              <w:right w:w="90" w:type="dxa"/>
+            </w:tcMar>
+            <w:vAlign w:val="center"/>
+          </w:tcPr>
+          <w:p>
+            <w:pPr>
+              <w:spacing w:before="30" w:after="30"/>
+              <w:jc w:val="center"/>
+            </w:pPr>
+            <w:r/>
+            <w:r>
+              <w:rPr>
+                <w:rFonts w:ascii="Arial" w:hAnsi="Arial"/>
+                <w:b w:val="0"/>
+                <w:color w:val="222222"/>
+                <w:sz w:val="16"/>
+              </w:rPr>
+              <w:t>0.5582 ± 0.0649</w:t>
+            </w:r>
+          </w:p>
+        </w:tc>
+        <w:tc>
+          <w:tcPr>
+            <w:tcW w:type="dxa" w:w="2592"/>
+            <w:shd w:fill="FFFFFF"/>
+            <w:tcMar>
+              <w:top w:w="60" w:type="dxa"/>
+              <w:bottom w:w="60" w:type="dxa"/>
+              <w:left w:w="90" w:type="dxa"/>
+              <w:right w:w="90" w:type="dxa"/>
+            </w:tcMar>
+            <w:vAlign w:val="center"/>
+          </w:tcPr>
+          <w:p>
+            <w:pPr>
+              <w:spacing w:before="30" w:after="30"/>
+              <w:jc w:val="center"/>
+            </w:pPr>
+            <w:r/>
+            <w:r>
+              <w:rPr>
+                <w:rFonts w:ascii="Arial" w:hAnsi="Arial"/>
+                <w:b w:val="0"/>
+                <w:color w:val="222222"/>
+                <w:sz w:val="16"/>
+              </w:rPr>
+              <w:t>0.7431 ± 0.0295</w:t>
+            </w:r>
+          </w:p>
+        </w:tc>
+      </w:tr>
+      <w:tr>
+        <w:tc>
+          <w:tcPr>
+            <w:tcW w:type="dxa" w:w="3456"/>
+            <w:shd w:fill="FBFBFB"/>
+            <w:tcMar>
+              <w:top w:w="60" w:type="dxa"/>
+              <w:bottom w:w="60" w:type="dxa"/>
+              <w:left w:w="90" w:type="dxa"/>
+              <w:right w:w="90" w:type="dxa"/>
+            </w:tcMar>
+            <w:vAlign w:val="center"/>
+          </w:tcPr>
+          <w:p>
+            <w:pPr>
+              <w:spacing w:before="30" w:after="30"/>
+              <w:jc w:val="left"/>
+            </w:pPr>
+            <w:r/>
+            <w:r>
+              <w:rPr>
+                <w:rFonts w:ascii="Arial" w:hAnsi="Arial"/>
+                <w:b/>
+                <w:color w:val="222222"/>
+                <w:sz w:val="16"/>
+              </w:rPr>
+              <w:t>FAERS (4-Fold LOO, N = 829)</w:t>
+            </w:r>
+          </w:p>
+        </w:tc>
+        <w:tc>
+          <w:tcPr>
+            <w:tcW w:type="dxa" w:w="2304"/>
+            <w:shd w:fill="FBFBFB"/>
+            <w:tcMar>
+              <w:top w:w="60" w:type="dxa"/>
+              <w:bottom w:w="60" w:type="dxa"/>
+              <w:left w:w="90" w:type="dxa"/>
+              <w:right w:w="90" w:type="dxa"/>
+            </w:tcMar>
+            <w:vAlign w:val="center"/>
+          </w:tcPr>
+          <w:p>
+            <w:pPr>
+              <w:spacing w:before="30" w:after="30"/>
+              <w:jc w:val="center"/>
+            </w:pPr>
+            <w:r/>
+            <w:r>
+              <w:rPr>
+                <w:rFonts w:ascii="Arial" w:hAnsi="Arial"/>
+                <w:b w:val="0"/>
+                <w:color w:val="222222"/>
+                <w:sz w:val="16"/>
+              </w:rPr>
+              <w:t>Seed 123</w:t>
+            </w:r>
+          </w:p>
+        </w:tc>
+        <w:tc>
+          <w:tcPr>
+            <w:tcW w:type="dxa" w:w="2592"/>
+            <w:shd w:fill="FBFBFB"/>
+            <w:tcMar>
+              <w:top w:w="60" w:type="dxa"/>
+              <w:bottom w:w="60" w:type="dxa"/>
+              <w:left w:w="90" w:type="dxa"/>
+              <w:right w:w="90" w:type="dxa"/>
+            </w:tcMar>
+            <w:vAlign w:val="center"/>
+          </w:tcPr>
+          <w:p>
+            <w:pPr>
+              <w:spacing w:before="30" w:after="30"/>
+              <w:jc w:val="center"/>
+            </w:pPr>
+            <w:r/>
+            <w:r>
+              <w:rPr>
+                <w:rFonts w:ascii="Arial" w:hAnsi="Arial"/>
+                <w:b w:val="0"/>
+                <w:color w:val="222222"/>
+                <w:sz w:val="16"/>
+              </w:rPr>
+              <w:t>0.5652 ± 0.0509</w:t>
+            </w:r>
+          </w:p>
+        </w:tc>
+        <w:tc>
+          <w:tcPr>
+            <w:tcW w:type="dxa" w:w="2592"/>
+            <w:shd w:fill="FBFBFB"/>
+            <w:tcMar>
+              <w:top w:w="60" w:type="dxa"/>
+              <w:bottom w:w="60" w:type="dxa"/>
+              <w:left w:w="90" w:type="dxa"/>
+              <w:right w:w="90" w:type="dxa"/>
+            </w:tcMar>
+            <w:vAlign w:val="center"/>
+          </w:tcPr>
+          <w:p>
+            <w:pPr>
+              <w:spacing w:before="30" w:after="30"/>
+              <w:jc w:val="center"/>
+            </w:pPr>
+            <w:r/>
+            <w:r>
+              <w:rPr>
+                <w:rFonts w:ascii="Arial" w:hAnsi="Arial"/>
+                <w:b w:val="0"/>
+                <w:color w:val="222222"/>
+                <w:sz w:val="16"/>
+              </w:rPr>
+              <w:t>0.7402 ± 0.0293</w:t>
+            </w:r>
+          </w:p>
+        </w:tc>
+      </w:tr>
+      <w:tr>
+        <w:tc>
+          <w:tcPr>
+            <w:tcW w:type="dxa" w:w="3456"/>
+            <w:shd w:fill="FFFFFF"/>
+            <w:tcMar>
+              <w:top w:w="60" w:type="dxa"/>
+              <w:bottom w:w="60" w:type="dxa"/>
+              <w:left w:w="90" w:type="dxa"/>
+              <w:right w:w="90" w:type="dxa"/>
+            </w:tcMar>
+            <w:vAlign w:val="center"/>
+          </w:tcPr>
+          <w:p>
+            <w:pPr>
+              <w:spacing w:before="30" w:after="30"/>
+              <w:jc w:val="left"/>
+            </w:pPr>
+            <w:r/>
+            <w:r>
+              <w:rPr>
+                <w:rFonts w:ascii="Arial" w:hAnsi="Arial"/>
+                <w:b/>
+                <w:color w:val="222222"/>
+                <w:sz w:val="16"/>
+              </w:rPr>
+              <w:t>FAERS (4-Fold LOO, N = 829)</w:t>
+            </w:r>
+          </w:p>
+        </w:tc>
+        <w:tc>
+          <w:tcPr>
+            <w:tcW w:type="dxa" w:w="2304"/>
+            <w:shd w:fill="FFFFFF"/>
+            <w:tcMar>
+              <w:top w:w="60" w:type="dxa"/>
+              <w:bottom w:w="60" w:type="dxa"/>
+              <w:left w:w="90" w:type="dxa"/>
+              <w:right w:w="90" w:type="dxa"/>
+            </w:tcMar>
+            <w:vAlign w:val="center"/>
+          </w:tcPr>
+          <w:p>
+            <w:pPr>
+              <w:spacing w:before="30" w:after="30"/>
+              <w:jc w:val="center"/>
+            </w:pPr>
+            <w:r/>
+            <w:r>
+              <w:rPr>
+                <w:rFonts w:ascii="Arial" w:hAnsi="Arial"/>
+                <w:b w:val="0"/>
+                <w:color w:val="222222"/>
+                <w:sz w:val="16"/>
+              </w:rPr>
+              <w:t>Seed 456</w:t>
+            </w:r>
+          </w:p>
+        </w:tc>
+        <w:tc>
+          <w:tcPr>
+            <w:tcW w:type="dxa" w:w="2592"/>
+            <w:shd w:fill="FFFFFF"/>
+            <w:tcMar>
+              <w:top w:w="60" w:type="dxa"/>
+              <w:bottom w:w="60" w:type="dxa"/>
+              <w:left w:w="90" w:type="dxa"/>
+              <w:right w:w="90" w:type="dxa"/>
+            </w:tcMar>
+            <w:vAlign w:val="center"/>
+          </w:tcPr>
+          <w:p>
+            <w:pPr>
+              <w:spacing w:before="30" w:after="30"/>
+              <w:jc w:val="center"/>
+            </w:pPr>
+            <w:r/>
+            <w:r>
+              <w:rPr>
+                <w:rFonts w:ascii="Arial" w:hAnsi="Arial"/>
+                <w:b w:val="0"/>
+                <w:color w:val="222222"/>
+                <w:sz w:val="16"/>
+              </w:rPr>
+              <w:t>0.5783 ± 0.0697</w:t>
+            </w:r>
+          </w:p>
+        </w:tc>
+        <w:tc>
+          <w:tcPr>
+            <w:tcW w:type="dxa" w:w="2592"/>
+            <w:shd w:fill="FFFFFF"/>
+            <w:tcMar>
+              <w:top w:w="60" w:type="dxa"/>
+              <w:bottom w:w="60" w:type="dxa"/>
+              <w:left w:w="90" w:type="dxa"/>
+              <w:right w:w="90" w:type="dxa"/>
+            </w:tcMar>
+            <w:vAlign w:val="center"/>
+          </w:tcPr>
+          <w:p>
+            <w:pPr>
+              <w:spacing w:before="30" w:after="30"/>
+              <w:jc w:val="center"/>
+            </w:pPr>
+            <w:r/>
+            <w:r>
+              <w:rPr>
+                <w:rFonts w:ascii="Arial" w:hAnsi="Arial"/>
+                <w:b w:val="0"/>
+                <w:color w:val="222222"/>
+                <w:sz w:val="16"/>
+              </w:rPr>
+              <w:t>0.7586 ± 0.0355</w:t>
+            </w:r>
+          </w:p>
+        </w:tc>
+      </w:tr>
+      <w:tr>
+        <w:tc>
+          <w:tcPr>
+            <w:tcW w:type="dxa" w:w="3456"/>
+            <w:shd w:fill="FBFBFB"/>
+            <w:tcMar>
+              <w:top w:w="60" w:type="dxa"/>
+              <w:bottom w:w="60" w:type="dxa"/>
+              <w:left w:w="90" w:type="dxa"/>
+              <w:right w:w="90" w:type="dxa"/>
+            </w:tcMar>
+            <w:vAlign w:val="center"/>
+          </w:tcPr>
+          <w:p>
+            <w:pPr>
+              <w:spacing w:before="30" w:after="30"/>
+              <w:jc w:val="left"/>
+            </w:pPr>
+            <w:r/>
+            <w:r>
+              <w:rPr>
+                <w:rFonts w:ascii="Arial" w:hAnsi="Arial"/>
+                <w:b/>
+                <w:color w:val="222222"/>
+                <w:sz w:val="16"/>
+              </w:rPr>
+              <w:t>FAERS (4-Fold LOO, N = 829)</w:t>
+            </w:r>
+          </w:p>
+        </w:tc>
+        <w:tc>
+          <w:tcPr>
+            <w:tcW w:type="dxa" w:w="2304"/>
+            <w:shd w:fill="FBFBFB"/>
+            <w:tcMar>
+              <w:top w:w="60" w:type="dxa"/>
+              <w:bottom w:w="60" w:type="dxa"/>
+              <w:left w:w="90" w:type="dxa"/>
+              <w:right w:w="90" w:type="dxa"/>
+            </w:tcMar>
+            <w:vAlign w:val="center"/>
+          </w:tcPr>
+          <w:p>
+            <w:pPr>
+              <w:spacing w:before="30" w:after="30"/>
+              <w:jc w:val="center"/>
+            </w:pPr>
+            <w:r/>
+            <w:r>
+              <w:rPr>
+                <w:rFonts w:ascii="Arial" w:hAnsi="Arial"/>
+                <w:b w:val="0"/>
+                <w:color w:val="222222"/>
+                <w:sz w:val="16"/>
+              </w:rPr>
+              <w:t>Seed 789</w:t>
+            </w:r>
+          </w:p>
+        </w:tc>
+        <w:tc>
+          <w:tcPr>
+            <w:tcW w:type="dxa" w:w="2592"/>
+            <w:shd w:fill="FBFBFB"/>
+            <w:tcMar>
+              <w:top w:w="60" w:type="dxa"/>
+              <w:bottom w:w="60" w:type="dxa"/>
+              <w:left w:w="90" w:type="dxa"/>
+              <w:right w:w="90" w:type="dxa"/>
+            </w:tcMar>
+            <w:vAlign w:val="center"/>
+          </w:tcPr>
+          <w:p>
+            <w:pPr>
+              <w:spacing w:before="30" w:after="30"/>
+              <w:jc w:val="center"/>
+            </w:pPr>
+            <w:r/>
+            <w:r>
+              <w:rPr>
+                <w:rFonts w:ascii="Arial" w:hAnsi="Arial"/>
+                <w:b w:val="0"/>
+                <w:color w:val="222222"/>
+                <w:sz w:val="16"/>
+              </w:rPr>
+              <w:t>0.5662 ± 0.0476</w:t>
+            </w:r>
+          </w:p>
+        </w:tc>
+        <w:tc>
+          <w:tcPr>
+            <w:tcW w:type="dxa" w:w="2592"/>
+            <w:shd w:fill="FBFBFB"/>
+            <w:tcMar>
+              <w:top w:w="60" w:type="dxa"/>
+              <w:bottom w:w="60" w:type="dxa"/>
+              <w:left w:w="90" w:type="dxa"/>
+              <w:right w:w="90" w:type="dxa"/>
+            </w:tcMar>
+            <w:vAlign w:val="center"/>
+          </w:tcPr>
+          <w:p>
+            <w:pPr>
+              <w:spacing w:before="30" w:after="30"/>
+              <w:jc w:val="center"/>
+            </w:pPr>
+            <w:r/>
+            <w:r>
+              <w:rPr>
+                <w:rFonts w:ascii="Arial" w:hAnsi="Arial"/>
+                <w:b w:val="0"/>
+                <w:color w:val="222222"/>
+                <w:sz w:val="16"/>
+              </w:rPr>
+              <w:t>0.7413 ± 0.0324</w:t>
+            </w:r>
+          </w:p>
+        </w:tc>
+      </w:tr>
+      <w:tr>
+        <w:tc>
+          <w:tcPr>
+            <w:tcW w:type="dxa" w:w="3456"/>
+            <w:shd w:fill="FFFFFF"/>
+            <w:tcMar>
+              <w:top w:w="60" w:type="dxa"/>
+              <w:bottom w:w="60" w:type="dxa"/>
+              <w:left w:w="90" w:type="dxa"/>
+              <w:right w:w="90" w:type="dxa"/>
+            </w:tcMar>
+            <w:vAlign w:val="center"/>
+          </w:tcPr>
+          <w:p>
+            <w:pPr>
+              <w:spacing w:before="30" w:after="30"/>
+              <w:jc w:val="left"/>
+            </w:pPr>
+            <w:r/>
+            <w:r>
+              <w:rPr>
+                <w:rFonts w:ascii="Arial" w:hAnsi="Arial"/>
+                <w:b/>
+                <w:color w:val="222222"/>
+                <w:sz w:val="16"/>
+              </w:rPr>
+              <w:t>FAERS (4-Fold LOO, N = 829)</w:t>
+            </w:r>
+          </w:p>
+        </w:tc>
+        <w:tc>
+          <w:tcPr>
+            <w:tcW w:type="dxa" w:w="2304"/>
+            <w:shd w:fill="FFFFFF"/>
+            <w:tcMar>
+              <w:top w:w="60" w:type="dxa"/>
+              <w:bottom w:w="60" w:type="dxa"/>
+              <w:left w:w="90" w:type="dxa"/>
+              <w:right w:w="90" w:type="dxa"/>
+            </w:tcMar>
+            <w:vAlign w:val="center"/>
+          </w:tcPr>
+          <w:p>
+            <w:pPr>
+              <w:spacing w:before="30" w:after="30"/>
+              <w:jc w:val="center"/>
+            </w:pPr>
+            <w:r/>
+            <w:r>
+              <w:rPr>
+                <w:rFonts w:ascii="Arial" w:hAnsi="Arial"/>
+                <w:b w:val="0"/>
+                <w:color w:val="222222"/>
+                <w:sz w:val="16"/>
+              </w:rPr>
+              <w:t>Seed 1011</w:t>
+            </w:r>
+          </w:p>
+        </w:tc>
+        <w:tc>
+          <w:tcPr>
+            <w:tcW w:type="dxa" w:w="2592"/>
+            <w:shd w:fill="FFFFFF"/>
+            <w:tcMar>
+              <w:top w:w="60" w:type="dxa"/>
+              <w:bottom w:w="60" w:type="dxa"/>
+              <w:left w:w="90" w:type="dxa"/>
+              <w:right w:w="90" w:type="dxa"/>
+            </w:tcMar>
+            <w:vAlign w:val="center"/>
+          </w:tcPr>
+          <w:p>
+            <w:pPr>
+              <w:spacing w:before="30" w:after="30"/>
+              <w:jc w:val="center"/>
+            </w:pPr>
+            <w:r/>
+            <w:r>
+              <w:rPr>
+                <w:rFonts w:ascii="Arial" w:hAnsi="Arial"/>
+                <w:b w:val="0"/>
+                <w:color w:val="222222"/>
+                <w:sz w:val="16"/>
+              </w:rPr>
+              <w:t>0.5748 ± 0.0694</w:t>
+            </w:r>
+          </w:p>
+        </w:tc>
+        <w:tc>
+          <w:tcPr>
+            <w:tcW w:type="dxa" w:w="2592"/>
+            <w:shd w:fill="FFFFFF"/>
+            <w:tcMar>
+              <w:top w:w="60" w:type="dxa"/>
+              <w:bottom w:w="60" w:type="dxa"/>
+              <w:left w:w="90" w:type="dxa"/>
+              <w:right w:w="90" w:type="dxa"/>
+            </w:tcMar>
+            <w:vAlign w:val="center"/>
+          </w:tcPr>
+          <w:p>
+            <w:pPr>
+              <w:spacing w:before="30" w:after="30"/>
+              <w:jc w:val="center"/>
+            </w:pPr>
+            <w:r/>
+            <w:r>
+              <w:rPr>
+                <w:rFonts w:ascii="Arial" w:hAnsi="Arial"/>
+                <w:b w:val="0"/>
+                <w:color w:val="222222"/>
+                <w:sz w:val="16"/>
+              </w:rPr>
+              <w:t>0.7484 ± 0.0371</w:t>
+            </w:r>
+          </w:p>
+        </w:tc>
+      </w:tr>
+      <w:tr>
+        <w:tc>
+          <w:tcPr>
+            <w:tcW w:type="dxa" w:w="3456"/>
+            <w:shd w:fill="FBFBFB"/>
+            <w:tcMar>
+              <w:top w:w="60" w:type="dxa"/>
+              <w:bottom w:w="60" w:type="dxa"/>
+              <w:left w:w="90" w:type="dxa"/>
+              <w:right w:w="90" w:type="dxa"/>
+            </w:tcMar>
+            <w:vAlign w:val="center"/>
+          </w:tcPr>
+          <w:p>
+            <w:pPr>
+              <w:spacing w:before="30" w:after="30"/>
+              <w:jc w:val="left"/>
+            </w:pPr>
+            <w:r/>
+            <w:r>
+              <w:rPr>
+                <w:rFonts w:ascii="Arial" w:hAnsi="Arial"/>
+                <w:b/>
+                <w:color w:val="222222"/>
+                <w:sz w:val="16"/>
+              </w:rPr>
+              <w:t>FAERS (4-Fold LOO, Pooled)</w:t>
+            </w:r>
+          </w:p>
+        </w:tc>
+        <w:tc>
+          <w:tcPr>
+            <w:tcW w:type="dxa" w:w="2304"/>
+            <w:shd w:fill="FBFBFB"/>
+            <w:tcMar>
+              <w:top w:w="60" w:type="dxa"/>
+              <w:bottom w:w="60" w:type="dxa"/>
+              <w:left w:w="90" w:type="dxa"/>
+              <w:right w:w="90" w:type="dxa"/>
+            </w:tcMar>
+            <w:vAlign w:val="center"/>
+          </w:tcPr>
+          <w:p>
+            <w:pPr>
+              <w:spacing w:before="30" w:after="30"/>
+              <w:jc w:val="center"/>
+            </w:pPr>
+            <w:r/>
+            <w:r>
+              <w:rPr>
+                <w:rFonts w:ascii="Arial" w:hAnsi="Arial"/>
+                <w:b/>
+                <w:color w:val="222222"/>
+                <w:sz w:val="16"/>
+              </w:rPr>
+              <w:t>Mean ± SD (5 Seeds)</w:t>
+            </w:r>
+          </w:p>
+        </w:tc>
+        <w:tc>
+          <w:tcPr>
+            <w:tcW w:type="dxa" w:w="2592"/>
+            <w:shd w:fill="FBFBFB"/>
+            <w:tcMar>
+              <w:top w:w="60" w:type="dxa"/>
+              <w:bottom w:w="60" w:type="dxa"/>
+              <w:left w:w="90" w:type="dxa"/>
+              <w:right w:w="90" w:type="dxa"/>
+            </w:tcMar>
+            <w:vAlign w:val="center"/>
+          </w:tcPr>
+          <w:p>
+            <w:pPr>
+              <w:spacing w:before="30" w:after="30"/>
+              <w:jc w:val="center"/>
+            </w:pPr>
+            <w:r/>
+            <w:r>
+              <w:rPr>
+                <w:rFonts w:ascii="Arial" w:hAnsi="Arial"/>
+                <w:b w:val="0"/>
+                <w:color w:val="222222"/>
+                <w:sz w:val="16"/>
+              </w:rPr>
+              <w:t>0.5685 ± 0.0080</w:t>
+            </w:r>
+          </w:p>
+        </w:tc>
+        <w:tc>
+          <w:tcPr>
+            <w:tcW w:type="dxa" w:w="2592"/>
+            <w:shd w:fill="FBFBFB"/>
+            <w:tcMar>
+              <w:top w:w="60" w:type="dxa"/>
+              <w:bottom w:w="60" w:type="dxa"/>
+              <w:left w:w="90" w:type="dxa"/>
+              <w:right w:w="90" w:type="dxa"/>
+            </w:tcMar>
+            <w:vAlign w:val="center"/>
+          </w:tcPr>
+          <w:p>
+            <w:pPr>
+              <w:spacing w:before="30" w:after="30"/>
+              <w:jc w:val="center"/>
+            </w:pPr>
+            <w:r/>
+            <w:r>
+              <w:rPr>
+                <w:rFonts w:ascii="Arial" w:hAnsi="Arial"/>
+                <w:b w:val="0"/>
+                <w:color w:val="222222"/>
+                <w:sz w:val="16"/>
+              </w:rPr>
+              <w:t>0.7463 ± 0.0076</w:t>
+            </w:r>
+          </w:p>
+        </w:tc>
+      </w:tr>
+      <w:tr>
+        <w:tc>
+          <w:tcPr>
+            <w:tcW w:type="dxa" w:w="3456"/>
+            <w:shd w:fill="FFFFFF"/>
+            <w:tcMar>
+              <w:top w:w="60" w:type="dxa"/>
+              <w:bottom w:w="60" w:type="dxa"/>
+              <w:left w:w="90" w:type="dxa"/>
+              <w:right w:w="90" w:type="dxa"/>
+            </w:tcMar>
+            <w:vAlign w:val="center"/>
+          </w:tcPr>
+          <w:p>
+            <w:pPr>
+              <w:spacing w:before="30" w:after="30"/>
+              <w:jc w:val="left"/>
+            </w:pPr>
+            <w:r/>
+            <w:r>
+              <w:rPr>
+                <w:rFonts w:ascii="Arial" w:hAnsi="Arial"/>
+                <w:b/>
+                <w:color w:val="222222"/>
+                <w:sz w:val="16"/>
+              </w:rPr>
+              <w:t>VAERS (10-Fold CV, N = 1,000)</w:t>
+            </w:r>
+          </w:p>
+        </w:tc>
+        <w:tc>
+          <w:tcPr>
+            <w:tcW w:type="dxa" w:w="2304"/>
+            <w:shd w:fill="FFFFFF"/>
+            <w:tcMar>
+              <w:top w:w="60" w:type="dxa"/>
+              <w:bottom w:w="60" w:type="dxa"/>
+              <w:left w:w="90" w:type="dxa"/>
+              <w:right w:w="90" w:type="dxa"/>
+            </w:tcMar>
+            <w:vAlign w:val="center"/>
+          </w:tcPr>
+          <w:p>
+            <w:pPr>
+              <w:spacing w:before="30" w:after="30"/>
+              <w:jc w:val="center"/>
+            </w:pPr>
+            <w:r/>
+            <w:r>
+              <w:rPr>
+                <w:rFonts w:ascii="Arial" w:hAnsi="Arial"/>
+                <w:b w:val="0"/>
+                <w:color w:val="222222"/>
+                <w:sz w:val="16"/>
+              </w:rPr>
+              <w:t>Seed 42</w:t>
+            </w:r>
+          </w:p>
+        </w:tc>
+        <w:tc>
+          <w:tcPr>
+            <w:tcW w:type="dxa" w:w="2592"/>
+            <w:shd w:fill="FFFFFF"/>
+            <w:tcMar>
+              <w:top w:w="60" w:type="dxa"/>
+              <w:bottom w:w="60" w:type="dxa"/>
+              <w:left w:w="90" w:type="dxa"/>
+              <w:right w:w="90" w:type="dxa"/>
+            </w:tcMar>
+            <w:vAlign w:val="center"/>
+          </w:tcPr>
+          <w:p>
+            <w:pPr>
+              <w:spacing w:before="30" w:after="30"/>
+              <w:jc w:val="center"/>
+            </w:pPr>
+            <w:r/>
+            <w:r>
+              <w:rPr>
+                <w:rFonts w:ascii="Arial" w:hAnsi="Arial"/>
+                <w:b w:val="0"/>
+                <w:color w:val="222222"/>
+                <w:sz w:val="16"/>
+              </w:rPr>
+              <w:t>0.6594 ± 0.0196</w:t>
+            </w:r>
+          </w:p>
+        </w:tc>
+        <w:tc>
+          <w:tcPr>
+            <w:tcW w:type="dxa" w:w="2592"/>
+            <w:shd w:fill="FFFFFF"/>
+            <w:tcMar>
+              <w:top w:w="60" w:type="dxa"/>
+              <w:bottom w:w="60" w:type="dxa"/>
+              <w:left w:w="90" w:type="dxa"/>
+              <w:right w:w="90" w:type="dxa"/>
+            </w:tcMar>
+            <w:vAlign w:val="center"/>
+          </w:tcPr>
+          <w:p>
+            <w:pPr>
+              <w:spacing w:before="30" w:after="30"/>
+              <w:jc w:val="center"/>
+            </w:pPr>
+            <w:r/>
+            <w:r>
+              <w:rPr>
+                <w:rFonts w:ascii="Arial" w:hAnsi="Arial"/>
+                <w:b w:val="0"/>
+                <w:color w:val="222222"/>
+                <w:sz w:val="16"/>
+              </w:rPr>
+              <w:t>0.7848 ± 0.0127</w:t>
+            </w:r>
+          </w:p>
+        </w:tc>
+      </w:tr>
+      <w:tr>
+        <w:tc>
+          <w:tcPr>
+            <w:tcW w:type="dxa" w:w="3456"/>
+            <w:shd w:fill="FBFBFB"/>
+            <w:tcMar>
+              <w:top w:w="60" w:type="dxa"/>
+              <w:bottom w:w="60" w:type="dxa"/>
+              <w:left w:w="90" w:type="dxa"/>
+              <w:right w:w="90" w:type="dxa"/>
+            </w:tcMar>
+            <w:vAlign w:val="center"/>
+          </w:tcPr>
+          <w:p>
+            <w:pPr>
+              <w:spacing w:before="30" w:after="30"/>
+              <w:jc w:val="left"/>
+            </w:pPr>
+            <w:r/>
+            <w:r>
+              <w:rPr>
+                <w:rFonts w:ascii="Arial" w:hAnsi="Arial"/>
+                <w:b/>
+                <w:color w:val="222222"/>
+                <w:sz w:val="16"/>
+              </w:rPr>
+              <w:t>VAERS (10-Fold CV, N = 1,000)</w:t>
+            </w:r>
+          </w:p>
+        </w:tc>
+        <w:tc>
+          <w:tcPr>
+            <w:tcW w:type="dxa" w:w="2304"/>
+            <w:shd w:fill="FBFBFB"/>
+            <w:tcMar>
+              <w:top w:w="60" w:type="dxa"/>
+              <w:bottom w:w="60" w:type="dxa"/>
+              <w:left w:w="90" w:type="dxa"/>
+              <w:right w:w="90" w:type="dxa"/>
+            </w:tcMar>
+            <w:vAlign w:val="center"/>
+          </w:tcPr>
+          <w:p>
+            <w:pPr>
+              <w:spacing w:before="30" w:after="30"/>
+              <w:jc w:val="center"/>
+            </w:pPr>
+            <w:r/>
+            <w:r>
+              <w:rPr>
+                <w:rFonts w:ascii="Arial" w:hAnsi="Arial"/>
+                <w:b w:val="0"/>
+                <w:color w:val="222222"/>
+                <w:sz w:val="16"/>
+              </w:rPr>
+              <w:t>Seed 123</w:t>
+            </w:r>
+          </w:p>
+        </w:tc>
+        <w:tc>
+          <w:tcPr>
+            <w:tcW w:type="dxa" w:w="2592"/>
+            <w:shd w:fill="FBFBFB"/>
+            <w:tcMar>
+              <w:top w:w="60" w:type="dxa"/>
+              <w:bottom w:w="60" w:type="dxa"/>
+              <w:left w:w="90" w:type="dxa"/>
+              <w:right w:w="90" w:type="dxa"/>
+            </w:tcMar>
+            <w:vAlign w:val="center"/>
+          </w:tcPr>
+          <w:p>
+            <w:pPr>
+              <w:spacing w:before="30" w:after="30"/>
+              <w:jc w:val="center"/>
+            </w:pPr>
+            <w:r/>
+            <w:r>
+              <w:rPr>
+                <w:rFonts w:ascii="Arial" w:hAnsi="Arial"/>
+                <w:b w:val="0"/>
+                <w:color w:val="222222"/>
+                <w:sz w:val="16"/>
+              </w:rPr>
+              <w:t>0.6601 ± 0.0175</w:t>
+            </w:r>
+          </w:p>
+        </w:tc>
+        <w:tc>
+          <w:tcPr>
+            <w:tcW w:type="dxa" w:w="2592"/>
+            <w:shd w:fill="FBFBFB"/>
+            <w:tcMar>
+              <w:top w:w="60" w:type="dxa"/>
+              <w:bottom w:w="60" w:type="dxa"/>
+              <w:left w:w="90" w:type="dxa"/>
+              <w:right w:w="90" w:type="dxa"/>
+            </w:tcMar>
+            <w:vAlign w:val="center"/>
+          </w:tcPr>
+          <w:p>
+            <w:pPr>
+              <w:spacing w:before="30" w:after="30"/>
+              <w:jc w:val="center"/>
+            </w:pPr>
+            <w:r/>
+            <w:r>
+              <w:rPr>
+                <w:rFonts w:ascii="Arial" w:hAnsi="Arial"/>
+                <w:b w:val="0"/>
+                <w:color w:val="222222"/>
+                <w:sz w:val="16"/>
+              </w:rPr>
+              <w:t>0.7891 ± 0.0104</w:t>
+            </w:r>
+          </w:p>
+        </w:tc>
+      </w:tr>
+      <w:tr>
+        <w:tc>
+          <w:tcPr>
+            <w:tcW w:type="dxa" w:w="3456"/>
+            <w:shd w:fill="FFFFFF"/>
+            <w:tcMar>
+              <w:top w:w="60" w:type="dxa"/>
+              <w:bottom w:w="60" w:type="dxa"/>
+              <w:left w:w="90" w:type="dxa"/>
+              <w:right w:w="90" w:type="dxa"/>
+            </w:tcMar>
+            <w:vAlign w:val="center"/>
+          </w:tcPr>
+          <w:p>
+            <w:pPr>
+              <w:spacing w:before="30" w:after="30"/>
+              <w:jc w:val="left"/>
+            </w:pPr>
+            <w:r/>
+            <w:r>
+              <w:rPr>
+                <w:rFonts w:ascii="Arial" w:hAnsi="Arial"/>
+                <w:b/>
+                <w:color w:val="222222"/>
+                <w:sz w:val="16"/>
+              </w:rPr>
+              <w:t>VAERS (10-Fold CV, N = 1,000)</w:t>
+            </w:r>
+          </w:p>
+        </w:tc>
+        <w:tc>
+          <w:tcPr>
+            <w:tcW w:type="dxa" w:w="2304"/>
+            <w:shd w:fill="FFFFFF"/>
+            <w:tcMar>
+              <w:top w:w="60" w:type="dxa"/>
+              <w:bottom w:w="60" w:type="dxa"/>
+              <w:left w:w="90" w:type="dxa"/>
+              <w:right w:w="90" w:type="dxa"/>
+            </w:tcMar>
+            <w:vAlign w:val="center"/>
+          </w:tcPr>
+          <w:p>
+            <w:pPr>
+              <w:spacing w:before="30" w:after="30"/>
+              <w:jc w:val="center"/>
+            </w:pPr>
+            <w:r/>
+            <w:r>
+              <w:rPr>
+                <w:rFonts w:ascii="Arial" w:hAnsi="Arial"/>
+                <w:b w:val="0"/>
+                <w:color w:val="222222"/>
+                <w:sz w:val="16"/>
+              </w:rPr>
+              <w:t>Seed 456</w:t>
+            </w:r>
+          </w:p>
+        </w:tc>
+        <w:tc>
+          <w:tcPr>
+            <w:tcW w:type="dxa" w:w="2592"/>
+            <w:shd w:fill="FFFFFF"/>
+            <w:tcMar>
+              <w:top w:w="60" w:type="dxa"/>
+              <w:bottom w:w="60" w:type="dxa"/>
+              <w:left w:w="90" w:type="dxa"/>
+              <w:right w:w="90" w:type="dxa"/>
+            </w:tcMar>
+            <w:vAlign w:val="center"/>
+          </w:tcPr>
+          <w:p>
+            <w:pPr>
+              <w:spacing w:before="30" w:after="30"/>
+              <w:jc w:val="center"/>
+            </w:pPr>
+            <w:r/>
+            <w:r>
+              <w:rPr>
+                <w:rFonts w:ascii="Arial" w:hAnsi="Arial"/>
+                <w:b w:val="0"/>
+                <w:color w:val="222222"/>
+                <w:sz w:val="16"/>
+              </w:rPr>
+              <w:t>0.6593 ± 0.0218</w:t>
+            </w:r>
+          </w:p>
+        </w:tc>
+        <w:tc>
+          <w:tcPr>
+            <w:tcW w:type="dxa" w:w="2592"/>
+            <w:shd w:fill="FFFFFF"/>
+            <w:tcMar>
+              <w:top w:w="60" w:type="dxa"/>
+              <w:bottom w:w="60" w:type="dxa"/>
+              <w:left w:w="90" w:type="dxa"/>
+              <w:right w:w="90" w:type="dxa"/>
+            </w:tcMar>
+            <w:vAlign w:val="center"/>
+          </w:tcPr>
+          <w:p>
+            <w:pPr>
+              <w:spacing w:before="30" w:after="30"/>
+              <w:jc w:val="center"/>
+            </w:pPr>
+            <w:r/>
+            <w:r>
+              <w:rPr>
+                <w:rFonts w:ascii="Arial" w:hAnsi="Arial"/>
+                <w:b w:val="0"/>
+                <w:color w:val="222222"/>
+                <w:sz w:val="16"/>
+              </w:rPr>
+              <w:t>0.7883 ± 0.0138</w:t>
+            </w:r>
+          </w:p>
+        </w:tc>
+      </w:tr>
+      <w:tr>
+        <w:tc>
+          <w:tcPr>
+            <w:tcW w:type="dxa" w:w="3456"/>
+            <w:shd w:fill="FBFBFB"/>
+            <w:tcMar>
+              <w:top w:w="60" w:type="dxa"/>
+              <w:bottom w:w="60" w:type="dxa"/>
+              <w:left w:w="90" w:type="dxa"/>
+              <w:right w:w="90" w:type="dxa"/>
+            </w:tcMar>
+            <w:vAlign w:val="center"/>
+          </w:tcPr>
+          <w:p>
+            <w:pPr>
+              <w:spacing w:before="30" w:after="30"/>
+              <w:jc w:val="left"/>
+            </w:pPr>
+            <w:r/>
+            <w:r>
+              <w:rPr>
+                <w:rFonts w:ascii="Arial" w:hAnsi="Arial"/>
+                <w:b/>
+                <w:color w:val="222222"/>
+                <w:sz w:val="16"/>
+              </w:rPr>
+              <w:t>VAERS (10-Fold CV, N = 1,000)</w:t>
+            </w:r>
+          </w:p>
+        </w:tc>
+        <w:tc>
+          <w:tcPr>
+            <w:tcW w:type="dxa" w:w="2304"/>
+            <w:shd w:fill="FBFBFB"/>
+            <w:tcMar>
+              <w:top w:w="60" w:type="dxa"/>
+              <w:bottom w:w="60" w:type="dxa"/>
+              <w:left w:w="90" w:type="dxa"/>
+              <w:right w:w="90" w:type="dxa"/>
+            </w:tcMar>
+            <w:vAlign w:val="center"/>
+          </w:tcPr>
+          <w:p>
+            <w:pPr>
+              <w:spacing w:before="30" w:after="30"/>
+              <w:jc w:val="center"/>
+            </w:pPr>
+            <w:r/>
+            <w:r>
+              <w:rPr>
+                <w:rFonts w:ascii="Arial" w:hAnsi="Arial"/>
+                <w:b w:val="0"/>
+                <w:color w:val="222222"/>
+                <w:sz w:val="16"/>
+              </w:rPr>
+              <w:t>Seed 789</w:t>
+            </w:r>
+          </w:p>
+        </w:tc>
+        <w:tc>
+          <w:tcPr>
+            <w:tcW w:type="dxa" w:w="2592"/>
+            <w:shd w:fill="FBFBFB"/>
+            <w:tcMar>
+              <w:top w:w="60" w:type="dxa"/>
+              <w:bottom w:w="60" w:type="dxa"/>
+              <w:left w:w="90" w:type="dxa"/>
+              <w:right w:w="90" w:type="dxa"/>
+            </w:tcMar>
+            <w:vAlign w:val="center"/>
+          </w:tcPr>
+          <w:p>
+            <w:pPr>
+              <w:spacing w:before="30" w:after="30"/>
+              <w:jc w:val="center"/>
+            </w:pPr>
+            <w:r/>
+            <w:r>
+              <w:rPr>
+                <w:rFonts w:ascii="Arial" w:hAnsi="Arial"/>
+                <w:b w:val="0"/>
+                <w:color w:val="222222"/>
+                <w:sz w:val="16"/>
+              </w:rPr>
+              <w:t>0.6615 ± 0.0159</w:t>
+            </w:r>
+          </w:p>
+        </w:tc>
+        <w:tc>
+          <w:tcPr>
+            <w:tcW w:type="dxa" w:w="2592"/>
+            <w:shd w:fill="FBFBFB"/>
+            <w:tcMar>
+              <w:top w:w="60" w:type="dxa"/>
+              <w:bottom w:w="60" w:type="dxa"/>
+              <w:left w:w="90" w:type="dxa"/>
+              <w:right w:w="90" w:type="dxa"/>
+            </w:tcMar>
+            <w:vAlign w:val="center"/>
+          </w:tcPr>
+          <w:p>
+            <w:pPr>
+              <w:spacing w:before="30" w:after="30"/>
+              <w:jc w:val="center"/>
+            </w:pPr>
+            <w:r/>
+            <w:r>
+              <w:rPr>
+                <w:rFonts w:ascii="Arial" w:hAnsi="Arial"/>
+                <w:b w:val="0"/>
+                <w:color w:val="222222"/>
+                <w:sz w:val="16"/>
+              </w:rPr>
+              <w:t>0.7907 ± 0.0095</w:t>
+            </w:r>
+          </w:p>
+        </w:tc>
+      </w:tr>
+      <w:tr>
+        <w:tc>
+          <w:tcPr>
+            <w:tcW w:type="dxa" w:w="3456"/>
+            <w:shd w:fill="FFFFFF"/>
+            <w:tcMar>
+              <w:top w:w="60" w:type="dxa"/>
+              <w:bottom w:w="60" w:type="dxa"/>
+              <w:left w:w="90" w:type="dxa"/>
+              <w:right w:w="90" w:type="dxa"/>
+            </w:tcMar>
+            <w:vAlign w:val="center"/>
+          </w:tcPr>
+          <w:p>
+            <w:pPr>
+              <w:spacing w:before="30" w:after="30"/>
+              <w:jc w:val="left"/>
+            </w:pPr>
+            <w:r/>
+            <w:r>
+              <w:rPr>
+                <w:rFonts w:ascii="Arial" w:hAnsi="Arial"/>
+                <w:b/>
+                <w:color w:val="222222"/>
+                <w:sz w:val="16"/>
+              </w:rPr>
+              <w:t>VAERS (10-Fold CV, N = 1,000)</w:t>
+            </w:r>
+          </w:p>
+        </w:tc>
+        <w:tc>
+          <w:tcPr>
+            <w:tcW w:type="dxa" w:w="2304"/>
+            <w:shd w:fill="FFFFFF"/>
+            <w:tcMar>
+              <w:top w:w="60" w:type="dxa"/>
+              <w:bottom w:w="60" w:type="dxa"/>
+              <w:left w:w="90" w:type="dxa"/>
+              <w:right w:w="90" w:type="dxa"/>
+            </w:tcMar>
+            <w:vAlign w:val="center"/>
+          </w:tcPr>
+          <w:p>
+            <w:pPr>
+              <w:spacing w:before="30" w:after="30"/>
+              <w:jc w:val="center"/>
+            </w:pPr>
+            <w:r/>
+            <w:r>
+              <w:rPr>
+                <w:rFonts w:ascii="Arial" w:hAnsi="Arial"/>
+                <w:b w:val="0"/>
+                <w:color w:val="222222"/>
+                <w:sz w:val="16"/>
+              </w:rPr>
+              <w:t>Seed 1011</w:t>
+            </w:r>
+          </w:p>
+        </w:tc>
+        <w:tc>
+          <w:tcPr>
+            <w:tcW w:type="dxa" w:w="2592"/>
+            <w:shd w:fill="FFFFFF"/>
+            <w:tcMar>
+              <w:top w:w="60" w:type="dxa"/>
+              <w:bottom w:w="60" w:type="dxa"/>
+              <w:left w:w="90" w:type="dxa"/>
+              <w:right w:w="90" w:type="dxa"/>
+            </w:tcMar>
+            <w:vAlign w:val="center"/>
+          </w:tcPr>
+          <w:p>
+            <w:pPr>
+              <w:spacing w:before="30" w:after="30"/>
+              <w:jc w:val="center"/>
+            </w:pPr>
+            <w:r/>
+            <w:r>
+              <w:rPr>
+                <w:rFonts w:ascii="Arial" w:hAnsi="Arial"/>
+                <w:b w:val="0"/>
+                <w:color w:val="222222"/>
+                <w:sz w:val="16"/>
+              </w:rPr>
+              <w:t>0.6574 ± 0.0169</w:t>
+            </w:r>
+          </w:p>
+        </w:tc>
+        <w:tc>
+          <w:tcPr>
+            <w:tcW w:type="dxa" w:w="2592"/>
+            <w:shd w:fill="FFFFFF"/>
+            <w:tcMar>
+              <w:top w:w="60" w:type="dxa"/>
+              <w:bottom w:w="60" w:type="dxa"/>
+              <w:left w:w="90" w:type="dxa"/>
+              <w:right w:w="90" w:type="dxa"/>
+            </w:tcMar>
+            <w:vAlign w:val="center"/>
+          </w:tcPr>
+          <w:p>
+            <w:pPr>
+              <w:spacing w:before="30" w:after="30"/>
+              <w:jc w:val="center"/>
+            </w:pPr>
+            <w:r/>
+            <w:r>
+              <w:rPr>
+                <w:rFonts w:ascii="Arial" w:hAnsi="Arial"/>
+                <w:b w:val="0"/>
+                <w:color w:val="222222"/>
+                <w:sz w:val="16"/>
+              </w:rPr>
+              <w:t>0.7879 ± 0.0106</w:t>
+            </w:r>
+          </w:p>
+        </w:tc>
+      </w:tr>
+      <w:tr>
+        <w:tc>
+          <w:tcPr>
+            <w:tcW w:type="dxa" w:w="3456"/>
+            <w:shd w:fill="FBFBFB"/>
+            <w:tcMar>
+              <w:top w:w="60" w:type="dxa"/>
+              <w:bottom w:w="60" w:type="dxa"/>
+              <w:left w:w="90" w:type="dxa"/>
+              <w:right w:w="90" w:type="dxa"/>
+            </w:tcMar>
+            <w:vAlign w:val="center"/>
+          </w:tcPr>
+          <w:p>
+            <w:pPr>
+              <w:spacing w:before="30" w:after="30"/>
+              <w:jc w:val="left"/>
+            </w:pPr>
+            <w:r/>
+            <w:r>
+              <w:rPr>
+                <w:rFonts w:ascii="Arial" w:hAnsi="Arial"/>
+                <w:b/>
+                <w:color w:val="222222"/>
+                <w:sz w:val="16"/>
+              </w:rPr>
+              <w:t>VAERS (10-Fold CV, Pooled)</w:t>
+            </w:r>
+          </w:p>
+        </w:tc>
+        <w:tc>
+          <w:tcPr>
+            <w:tcW w:type="dxa" w:w="2304"/>
+            <w:shd w:fill="FBFBFB"/>
+            <w:tcMar>
+              <w:top w:w="60" w:type="dxa"/>
+              <w:bottom w:w="60" w:type="dxa"/>
+              <w:left w:w="90" w:type="dxa"/>
+              <w:right w:w="90" w:type="dxa"/>
+            </w:tcMar>
+            <w:vAlign w:val="center"/>
+          </w:tcPr>
+          <w:p>
+            <w:pPr>
+              <w:spacing w:before="30" w:after="30"/>
+              <w:jc w:val="center"/>
+            </w:pPr>
+            <w:r/>
+            <w:r>
+              <w:rPr>
+                <w:rFonts w:ascii="Arial" w:hAnsi="Arial"/>
+                <w:b/>
+                <w:color w:val="222222"/>
+                <w:sz w:val="16"/>
+              </w:rPr>
+              <w:t>Mean ± SD (5 Seeds)</w:t>
+            </w:r>
+          </w:p>
+        </w:tc>
+        <w:tc>
+          <w:tcPr>
+            <w:tcW w:type="dxa" w:w="2592"/>
+            <w:shd w:fill="FBFBFB"/>
+            <w:tcMar>
+              <w:top w:w="60" w:type="dxa"/>
+              <w:bottom w:w="60" w:type="dxa"/>
+              <w:left w:w="90" w:type="dxa"/>
+              <w:right w:w="90" w:type="dxa"/>
+            </w:tcMar>
+            <w:vAlign w:val="center"/>
+          </w:tcPr>
+          <w:p>
+            <w:pPr>
+              <w:spacing w:before="30" w:after="30"/>
+              <w:jc w:val="center"/>
+            </w:pPr>
+            <w:r/>
+            <w:r>
+              <w:rPr>
+                <w:rFonts w:ascii="Arial" w:hAnsi="Arial"/>
+                <w:b w:val="0"/>
+                <w:color w:val="222222"/>
+                <w:sz w:val="16"/>
+              </w:rPr>
+              <w:t>0.6595 ± 0.0015</w:t>
+            </w:r>
+          </w:p>
+        </w:tc>
+        <w:tc>
+          <w:tcPr>
+            <w:tcW w:type="dxa" w:w="2592"/>
+            <w:shd w:fill="FBFBFB"/>
+            <w:tcMar>
+              <w:top w:w="60" w:type="dxa"/>
+              <w:bottom w:w="60" w:type="dxa"/>
+              <w:left w:w="90" w:type="dxa"/>
+              <w:right w:w="90" w:type="dxa"/>
+            </w:tcMar>
+            <w:vAlign w:val="center"/>
+          </w:tcPr>
+          <w:p>
+            <w:pPr>
+              <w:spacing w:before="30" w:after="30"/>
+              <w:jc w:val="center"/>
+            </w:pPr>
+            <w:r/>
+            <w:r>
+              <w:rPr>
+                <w:rFonts w:ascii="Arial" w:hAnsi="Arial"/>
+                <w:b w:val="0"/>
+                <w:color w:val="222222"/>
+                <w:sz w:val="16"/>
+              </w:rPr>
+              <w:t>0.7882 ± 0.0022</w:t>
+            </w:r>
+          </w:p>
+        </w:tc>
+      </w:tr>
+    </w:tbl>
     <w:p/>
     <w:p>
       <w:pPr>
@@ -8665,7 +9728,7 @@
     </w:p>
     <w:p>
       <w:r>
-        <w:t>Table 6. Impact of LLM Output Format Paradigm (Inline Tagged XML vs. Structured JSON Schema Offsets) on Entity Extraction and Offset Alignment.</w:t>
+        <w:t>Table 7. Impact of LLM Output Format Paradigm (Inline Tagged XML vs. Structured JSON Schema Offsets) on Entity Extraction and Offset Alignment.</w:t>
       </w:r>
     </w:p>
     <w:tbl>
@@ -9367,7 +10430,11 @@
     </w:p>
     <w:p>
       <w:r>
-        <w:t>Taken together with the FAERS results, these VAERS findings demonstrate that BERT-based models trained on high-quality human annotations provide more robust and reliable performance across heterogeneous pharmacovigilance datasets. While LLM-derived annotations offer a convenient low-resource alternative, their direct use leads to substantially lower accuracy, particularly in semantically complex categories such as STATUS, LAB, and HX. These results underscore the continued importance of curated human-labeled data for medical NER and highlight the effectiveness of supervised transformer models for large-scale safety narrative processing in real-world biomedical applications.</w:t>
+        <w:t xml:space="preserve">Taken together with the FAERS results, these VAERS findings demonstrate that BERT-based models trained on high-quality human annotations provide more robust and reliable performance across heterogeneous pharmacovigilance datasets. While LLM-derived annotations offer a convenient low-resource alternative, their direct use leads to substantially lower accuracy, particularly in semantically complex categories such as STATUS, LAB, and HX. These results underscore the continued importance of curated </w:t>
+      </w:r>
+      <w:r>
+        <w:lastRenderedPageBreak/>
+        <w:t>human-labeled data for medical NER and highlight the effectiveness of supervised transformer models for large-scale safety narrative processing in real-world biomedical applications.</w:t>
       </w:r>
     </w:p>
     <w:p>
@@ -9390,11 +10457,7 @@
         <w:t xml:space="preserve">a </w:t>
       </w:r>
       <w:r>
-        <w:t xml:space="preserve">stringent evaluation framework. Because the metric requires </w:t>
-      </w:r>
-      <w:r>
-        <w:lastRenderedPageBreak/>
-        <w:t>exact agreement in both span boundaries and fine-grained labels, it penalizes minor boundary differences and ambiguities between closely related categories (e.g., AE vs. diagnosis vs. medical history). As a result, the observed F1-scores likely underestimate the models’ ability to identify clinically relevant concepts, and should be understood as reflecting task complexity and strict evaluation criteria rather than limited practical utility.</w:t>
+        <w:t>stringent evaluation framework. Because the metric requires exact agreement in both span boundaries and fine-grained labels, it penalizes minor boundary differences and ambiguities between closely related categories (e.g., AE vs. diagnosis vs. medical history). As a result, the observed F1-scores likely underestimate the models’ ability to identify clinically relevant concepts, and should be understood as reflecting task complexity and strict evaluation criteria rather than limited practical utility.</w:t>
       </w:r>
     </w:p>
     <w:p>
@@ -9409,15 +10472,7 @@
     </w:p>
     <w:p>
       <w:r>
-        <w:t xml:space="preserve">Beyond model comparison, the annotated datasets themselves provide a valuable resource for future research. By spanning both drug and vaccine safety narratives and incorporating harmonized entity definitions, they enable studies on cross-domain generalization, transfer learning, and multi-task modeling. The detailed error characterizations also highlight areas </w:t>
-      </w:r>
-      <w:proofErr w:type="gramStart"/>
-      <w:r>
-        <w:t>where</w:t>
-      </w:r>
-      <w:proofErr w:type="gramEnd"/>
-      <w:r>
-        <w:t xml:space="preserve"> additional training data, refined guidelines, or specialized modeling approaches may further improve performance.</w:t>
+        <w:t>Beyond model comparison, the annotated datasets themselves provide a valuable resource for future research. By spanning both drug and vaccine safety narratives and incorporating harmonized entity definitions, they enable studies on cross-domain generalization, transfer learning, and multi-task modeling. The detailed error characterizations also highlight areas where additional training data, refined guidelines, or specialized modeling approaches may further improve performance.</w:t>
       </w:r>
     </w:p>
     <w:p>
@@ -9440,7 +10495,11 @@
         <w:t xml:space="preserve">The current annotation workflow was designed </w:t>
       </w:r>
       <w:r>
-        <w:t>as a linear process</w:t>
+        <w:t xml:space="preserve">as a linear </w:t>
+      </w:r>
+      <w:r>
+        <w:lastRenderedPageBreak/>
+        <w:t>process</w:t>
       </w:r>
       <w:r>
         <w:t>, start</w:t>
@@ -9461,11 +10520,7 @@
         <w:t xml:space="preserve"> </w:t>
       </w:r>
       <w:r>
-        <w:t xml:space="preserve">In addition, this work focuses on span-level NER and does not address downstream tasks such as relation extraction or causality assessment, which are critical for regulatory applications. Finally, due to data sensitivity constraints, we were unable to evaluate certain commercial </w:t>
-      </w:r>
-      <w:r>
-        <w:lastRenderedPageBreak/>
-        <w:t>LLMs, and future advances in model capabilities may shift the relative performance observed here.</w:t>
+        <w:t>In addition, this work focuses on span-level NER and does not address downstream tasks such as relation extraction or causality assessment, which are critical for regulatory applications. Finally, due to data sensitivity constraints, we were unable to evaluate certain commercial LLMs, and future advances in model capabilities may shift the relative performance observed here.</w:t>
       </w:r>
     </w:p>
     <w:p>
@@ -9592,6 +10647,7 @@
         <w:rPr>
           <w:shd w:val="clear" w:color="auto" w:fill="FFFFFF"/>
         </w:rPr>
+        <w:lastRenderedPageBreak/>
         <w:t>Ethics approval</w:t>
       </w:r>
     </w:p>
@@ -9619,7 +10675,6 @@
         <w:rPr>
           <w:shd w:val="clear" w:color="auto" w:fill="FFFFFF"/>
         </w:rPr>
-        <w:lastRenderedPageBreak/>
         <w:t>Consent to participate</w:t>
       </w:r>
     </w:p>
@@ -9719,7 +10774,7 @@
         </w:rPr>
         <w:t xml:space="preserve">The annotation prompt and source code for the annotation platform are available at: </w:t>
       </w:r>
-      <w:hyperlink r:id="rId16" w:history="1">
+      <w:hyperlink r:id="rId21" w:history="1">
         <w:r>
           <w:rPr>
             <w:rStyle w:val="Hyperlink"/>
@@ -9827,7 +10882,7 @@
       <w:r>
         <w:t xml:space="preserve">. 2025  [cited 2025 11/24]; Available from: </w:t>
       </w:r>
-      <w:hyperlink r:id="rId17" w:history="1">
+      <w:hyperlink r:id="rId22" w:history="1">
         <w:r>
           <w:rPr>
             <w:rStyle w:val="Hyperlink"/>
@@ -12341,47 +13396,29 @@
                 <w:szCs w:val="18"/>
               </w:rPr>
             </w:pPr>
-            <w:proofErr w:type="spellStart"/>
             <w:r>
               <w:rPr>
                 <w:sz w:val="18"/>
                 <w:szCs w:val="18"/>
               </w:rPr>
-              <w:t>mAE</w:t>
-            </w:r>
-            <w:proofErr w:type="spellEnd"/>
-            <w:r>
+              <w:t>mAE-Manifestations: immediate signs, symptoms that appear as part of the adverse event. Observable or measurable effects associated with the AE. May include physiological changes or specific clinical findings. Documented at or near the time of the AE onset. </w:t>
+            </w:r>
+          </w:p>
+          <w:p>
+            <w:pPr>
+              <w:contextualSpacing/>
+              <w:cnfStyle w:val="000000100000" w:firstRow="0" w:lastRow="0" w:firstColumn="0" w:lastColumn="0" w:oddVBand="0" w:evenVBand="0" w:oddHBand="1" w:evenHBand="0" w:firstRowFirstColumn="0" w:firstRowLastColumn="0" w:lastRowFirstColumn="0" w:lastRowLastColumn="0"/>
               <w:rPr>
                 <w:sz w:val="18"/>
                 <w:szCs w:val="18"/>
               </w:rPr>
-              <w:t>-Manifestations: immediate signs, symptoms that appear as part of the adverse event. Observable or measurable effects associated with the AE. May include physiological changes or specific clinical findings. Documented at or near the time of the AE onset. </w:t>
-            </w:r>
-          </w:p>
-          <w:p>
-            <w:pPr>
-              <w:contextualSpacing/>
-              <w:cnfStyle w:val="000000100000" w:firstRow="0" w:lastRow="0" w:firstColumn="0" w:lastColumn="0" w:oddVBand="0" w:evenVBand="0" w:oddHBand="1" w:evenHBand="0" w:firstRowFirstColumn="0" w:firstRowLastColumn="0" w:lastRowFirstColumn="0" w:lastRowLastColumn="0"/>
+            </w:pPr>
+            <w:r>
               <w:rPr>
                 <w:sz w:val="18"/>
                 <w:szCs w:val="18"/>
               </w:rPr>
-            </w:pPr>
-            <w:proofErr w:type="spellStart"/>
-            <w:r>
-              <w:rPr>
-                <w:sz w:val="18"/>
-                <w:szCs w:val="18"/>
-              </w:rPr>
-              <w:t>mAE</w:t>
-            </w:r>
-            <w:proofErr w:type="spellEnd"/>
-            <w:r>
-              <w:rPr>
-                <w:sz w:val="18"/>
-                <w:szCs w:val="18"/>
-              </w:rPr>
-              <w:t>-Sequelae: consequences or complications resulting from the adverse event. Persistent or secondary effects occurring after the acute phase of the AE. May develop days, weeks, or even years after the AE. </w:t>
+              <w:t>mAE-Sequelae: consequences or complications resulting from the adverse event. Persistent or secondary effects occurring after the acute phase of the AE. May develop days, weeks, or even years after the AE. </w:t>
             </w:r>
           </w:p>
         </w:tc>
@@ -13166,23 +14203,7 @@
                 <w:b/>
                 <w:bCs/>
               </w:rPr>
-              <w:t>(</w:t>
-            </w:r>
-            <w:proofErr w:type="spellStart"/>
-            <w:r>
-              <w:rPr>
-                <w:b/>
-                <w:bCs/>
-              </w:rPr>
-              <w:t>sDX</w:t>
-            </w:r>
-            <w:proofErr w:type="spellEnd"/>
-            <w:r>
-              <w:rPr>
-                <w:b/>
-                <w:bCs/>
-              </w:rPr>
-              <w:t>)</w:t>
+              <w:t>(sDX)</w:t>
             </w:r>
           </w:p>
         </w:tc>
@@ -13278,23 +14299,7 @@
                 <w:b/>
                 <w:bCs/>
               </w:rPr>
-              <w:t>(</w:t>
-            </w:r>
-            <w:proofErr w:type="spellStart"/>
-            <w:r>
-              <w:rPr>
-                <w:b/>
-                <w:bCs/>
-              </w:rPr>
-              <w:t>sDX</w:t>
-            </w:r>
-            <w:proofErr w:type="spellEnd"/>
-            <w:r>
-              <w:rPr>
-                <w:b/>
-                <w:bCs/>
-              </w:rPr>
-              <w:t>)</w:t>
+              <w:t>(sDX)</w:t>
             </w:r>
           </w:p>
         </w:tc>
@@ -13338,11 +14343,9 @@
             <w:pPr>
               <w:jc w:val="center"/>
             </w:pPr>
-            <w:proofErr w:type="spellStart"/>
             <w:r>
               <w:t>BioBERT</w:t>
             </w:r>
-            <w:proofErr w:type="spellEnd"/>
           </w:p>
         </w:tc>
         <w:tc>
@@ -13519,11 +14522,9 @@
             <w:pPr>
               <w:jc w:val="center"/>
             </w:pPr>
-            <w:proofErr w:type="spellStart"/>
             <w:r>
               <w:t>ClinicalBERT</w:t>
             </w:r>
-            <w:proofErr w:type="spellEnd"/>
           </w:p>
         </w:tc>
         <w:tc>
@@ -13869,11 +14870,9 @@
             <w:pPr>
               <w:jc w:val="center"/>
             </w:pPr>
-            <w:proofErr w:type="spellStart"/>
             <w:r>
               <w:t>Bio_ClinicalBERT</w:t>
             </w:r>
-            <w:proofErr w:type="spellEnd"/>
           </w:p>
         </w:tc>
         <w:tc>
@@ -14020,11 +15019,57 @@
 </w:document>
 </file>
 
+<file path=word/comments.xml><?xml version="1.0" encoding="utf-8"?>
+<w:comments xmlns:wpc="http://schemas.microsoft.com/office/word/2010/wordprocessingCanvas" xmlns:cx="http://schemas.microsoft.com/office/drawing/2014/chartex" xmlns:cx1="http://schemas.microsoft.com/office/drawing/2015/9/8/chartex" xmlns:cx2="http://schemas.microsoft.com/office/drawing/2015/10/21/chartex" xmlns:cx3="http://schemas.microsoft.com/office/drawing/2016/5/9/chartex" xmlns:cx4="http://schemas.microsoft.com/office/drawing/2016/5/10/chartex" xmlns:cx5="http://schemas.microsoft.com/office/drawing/2016/5/11/chartex" xmlns:cx6="http://schemas.microsoft.com/office/drawing/2016/5/12/chartex" xmlns:cx7="http://schemas.microsoft.com/office/drawing/2016/5/13/chartex" xmlns:cx8="http://schemas.microsoft.com/office/drawing/2016/5/14/chartex" xmlns:mc="http://schemas.openxmlformats.org/markup-compatibility/2006" xmlns:aink="http://schemas.microsoft.com/office/drawing/2016/ink" xmlns:am3d="http://schemas.microsoft.com/office/drawing/2017/model3d" xmlns:o="urn:schemas-microsoft-com:office:office" xmlns:oel="http://schemas.microsoft.com/office/2019/extlst" xmlns:r="http://schemas.openxmlformats.org/officeDocument/2006/relationships" xmlns:m="http://schemas.openxmlformats.org/officeDocument/2006/math" xmlns:v="urn:schemas-microsoft-com:vml" xmlns:wp14="http://schemas.microsoft.com/office/word/2010/wordprocessingDrawing" xmlns:wp="http://schemas.openxmlformats.org/drawingml/2006/wordprocessingDrawing" xmlns:w10="urn:schemas-microsoft-com:office:word" xmlns:w="http://schemas.openxmlformats.org/wordprocessingml/2006/main" xmlns:w14="http://schemas.microsoft.com/office/word/2010/wordml" xmlns:w15="http://schemas.microsoft.com/office/word/2012/wordml" xmlns:w16cex="http://schemas.microsoft.com/office/word/2018/wordml/cex" xmlns:w16cid="http://schemas.microsoft.com/office/word/2016/wordml/cid" xmlns:w16="http://schemas.microsoft.com/office/word/2018/wordml" xmlns:w16du="http://schemas.microsoft.com/office/word/2023/wordml/word16du" xmlns:w16sdtdh="http://schemas.microsoft.com/office/word/2020/wordml/sdtdatahash" xmlns:w16sdtfl="http://schemas.microsoft.com/office/word/2024/wordml/sdtformatlock" xmlns:w16se="http://schemas.microsoft.com/office/word/2015/wordml/symex" xmlns:wpg="http://schemas.microsoft.com/office/word/2010/wordprocessingGroup" xmlns:wpi="http://schemas.microsoft.com/office/word/2010/wordprocessingInk" xmlns:wne="http://schemas.microsoft.com/office/word/2006/wordml" xmlns:wps="http://schemas.microsoft.com/office/word/2010/wordprocessingShape" mc:Ignorable="w14 w15 w16se w16cid w16 w16cex w16sdtdh w16sdtfl w16du wp14">
+  <w:comment w:id="0" w:author="Penny, Brandon *" w:date="2026-08-28T10:25:00Z" w:initials="PB">
+    <w:p>
+      <w:pPr>
+        <w:pStyle w:val="CommentText"/>
+      </w:pPr>
+      <w:r>
+        <w:rPr>
+          <w:rStyle w:val="CommentReference"/>
+        </w:rPr>
+        <w:annotationRef/>
+      </w:r>
+      <w:r>
+        <w:rPr>
+          <w:i/>
+          <w:iCs/>
+        </w:rPr>
+        <w:t>Comment 2.11: Please, use italics when citing words and corpus examples, i.e., isoniazid, hepatitis...</w:t>
+      </w:r>
+      <w:r>
+        <w:t> </w:t>
+      </w:r>
+    </w:p>
+  </w:comment>
+</w:comments>
+</file>
+
+<file path=word/commentsExtended.xml><?xml version="1.0" encoding="utf-8"?>
+<w15:commentsEx xmlns:wpc="http://schemas.microsoft.com/office/word/2010/wordprocessingCanvas" xmlns:cx="http://schemas.microsoft.com/office/drawing/2014/chartex" xmlns:cx1="http://schemas.microsoft.com/office/drawing/2015/9/8/chartex" xmlns:cx2="http://schemas.microsoft.com/office/drawing/2015/10/21/chartex" xmlns:cx3="http://schemas.microsoft.com/office/drawing/2016/5/9/chartex" xmlns:cx4="http://schemas.microsoft.com/office/drawing/2016/5/10/chartex" xmlns:cx5="http://schemas.microsoft.com/office/drawing/2016/5/11/chartex" xmlns:cx6="http://schemas.microsoft.com/office/drawing/2016/5/12/chartex" xmlns:cx7="http://schemas.microsoft.com/office/drawing/2016/5/13/chartex" xmlns:cx8="http://schemas.microsoft.com/office/drawing/2016/5/14/chartex" xmlns:mc="http://schemas.openxmlformats.org/markup-compatibility/2006" xmlns:aink="http://schemas.microsoft.com/office/drawing/2016/ink" xmlns:am3d="http://schemas.microsoft.com/office/drawing/2017/model3d" xmlns:o="urn:schemas-microsoft-com:office:office" xmlns:oel="http://schemas.microsoft.com/office/2019/extlst" xmlns:r="http://schemas.openxmlformats.org/officeDocument/2006/relationships" xmlns:m="http://schemas.openxmlformats.org/officeDocument/2006/math" xmlns:v="urn:schemas-microsoft-com:vml" xmlns:wp14="http://schemas.microsoft.com/office/word/2010/wordprocessingDrawing" xmlns:wp="http://schemas.openxmlformats.org/drawingml/2006/wordprocessingDrawing" xmlns:w10="urn:schemas-microsoft-com:office:word" xmlns:w="http://schemas.openxmlformats.org/wordprocessingml/2006/main" xmlns:w14="http://schemas.microsoft.com/office/word/2010/wordml" xmlns:w15="http://schemas.microsoft.com/office/word/2012/wordml" xmlns:w16cex="http://schemas.microsoft.com/office/word/2018/wordml/cex" xmlns:w16cid="http://schemas.microsoft.com/office/word/2016/wordml/cid" xmlns:w16="http://schemas.microsoft.com/office/word/2018/wordml" xmlns:w16du="http://schemas.microsoft.com/office/word/2023/wordml/word16du" xmlns:w16sdtdh="http://schemas.microsoft.com/office/word/2020/wordml/sdtdatahash" xmlns:w16sdtfl="http://schemas.microsoft.com/office/word/2024/wordml/sdtformatlock" xmlns:w16se="http://schemas.microsoft.com/office/word/2015/wordml/symex" xmlns:wpg="http://schemas.microsoft.com/office/word/2010/wordprocessingGroup" xmlns:wpi="http://schemas.microsoft.com/office/word/2010/wordprocessingInk" xmlns:wne="http://schemas.microsoft.com/office/word/2006/wordml" xmlns:wps="http://schemas.microsoft.com/office/word/2010/wordprocessingShape" mc:Ignorable="w14 w15 w16se w16cid w16 w16cex w16sdtdh w16sdtfl w16du wp14">
+  <w15:commentEx w15:paraId="061C72EF" w15:done="0"/>
+</w15:commentsEx>
+</file>
+
+<file path=word/commentsExtensible.xml><?xml version="1.0" encoding="utf-8"?>
+<w16cex:commentsExtensible xmlns:wpc="http://schemas.microsoft.com/office/word/2010/wordprocessingCanvas" xmlns:cx="http://schemas.microsoft.com/office/drawing/2014/chartex" xmlns:cx1="http://schemas.microsoft.com/office/drawing/2015/9/8/chartex" xmlns:cx2="http://schemas.microsoft.com/office/drawing/2015/10/21/chartex" xmlns:cx3="http://schemas.microsoft.com/office/drawing/2016/5/9/chartex" xmlns:cx4="http://schemas.microsoft.com/office/drawing/2016/5/10/chartex" xmlns:cx5="http://schemas.microsoft.com/office/drawing/2016/5/11/chartex" xmlns:cx6="http://schemas.microsoft.com/office/drawing/2016/5/12/chartex" xmlns:cx7="http://schemas.microsoft.com/office/drawing/2016/5/13/chartex" xmlns:cx8="http://schemas.microsoft.com/office/drawing/2016/5/14/chartex" xmlns:cr="http://schemas.microsoft.com/office/comments/2020/reactions" xmlns:mc="http://schemas.openxmlformats.org/markup-compatibility/2006" xmlns:aink="http://schemas.microsoft.com/office/drawing/2016/ink" xmlns:am3d="http://schemas.microsoft.com/office/drawing/2017/model3d" xmlns:o="urn:schemas-microsoft-com:office:office" xmlns:oel="http://schemas.microsoft.com/office/2019/extlst" xmlns:r="http://schemas.openxmlformats.org/officeDocument/2006/relationships" xmlns:m="http://schemas.openxmlformats.org/officeDocument/2006/math" xmlns:v="urn:schemas-microsoft-com:vml" xmlns:wp14="http://schemas.microsoft.com/office/word/2010/wordprocessingDrawing" xmlns:wp="http://schemas.openxmlformats.org/drawingml/2006/wordprocessingDrawing" xmlns:w10="urn:schemas-microsoft-com:office:word" xmlns:w="http://schemas.openxmlformats.org/wordprocessingml/2006/main" xmlns:w14="http://schemas.microsoft.com/office/word/2010/wordml" xmlns:w15="http://schemas.microsoft.com/office/word/2012/wordml" xmlns:w16cex="http://schemas.microsoft.com/office/word/2018/wordml/cex" xmlns:w16cid="http://schemas.microsoft.com/office/word/2016/wordml/cid" xmlns:w16="http://schemas.microsoft.com/office/word/2018/wordml" xmlns:w16du="http://schemas.microsoft.com/office/word/2023/wordml/word16du" xmlns:w16sdtdh="http://schemas.microsoft.com/office/word/2020/wordml/sdtdatahash" xmlns:w16sdtfl="http://schemas.microsoft.com/office/word/2024/wordml/sdtformatlock" xmlns:w16se="http://schemas.microsoft.com/office/word/2015/wordml/symex" xmlns:wpg="http://schemas.microsoft.com/office/word/2010/wordprocessingGroup" xmlns:wpi="http://schemas.microsoft.com/office/word/2010/wordprocessingInk" xmlns:wne="http://schemas.microsoft.com/office/word/2006/wordml" xmlns:wps="http://schemas.microsoft.com/office/word/2010/wordprocessingShape" mc:Ignorable="w14 w15 w16se w16cid w16 w16cex w16sdtdh w16sdtfl cr w16du wp14">
+  <w16cex:commentExtensible w16cex:durableId="5FC23D58" w16cex:dateUtc="2026-08-28T15:25:00Z"/>
+</w16cex:commentsExtensible>
+</file>
+
+<file path=word/commentsIds.xml><?xml version="1.0" encoding="utf-8"?>
+<w16cid:commentsIds xmlns:wpc="http://schemas.microsoft.com/office/word/2010/wordprocessingCanvas" xmlns:cx="http://schemas.microsoft.com/office/drawing/2014/chartex" xmlns:cx1="http://schemas.microsoft.com/office/drawing/2015/9/8/chartex" xmlns:cx2="http://schemas.microsoft.com/office/drawing/2015/10/21/chartex" xmlns:cx3="http://schemas.microsoft.com/office/drawing/2016/5/9/chartex" xmlns:cx4="http://schemas.microsoft.com/office/drawing/2016/5/10/chartex" xmlns:cx5="http://schemas.microsoft.com/office/drawing/2016/5/11/chartex" xmlns:cx6="http://schemas.microsoft.com/office/drawing/2016/5/12/chartex" xmlns:cx7="http://schemas.microsoft.com/office/drawing/2016/5/13/chartex" xmlns:cx8="http://schemas.microsoft.com/office/drawing/2016/5/14/chartex" xmlns:mc="http://schemas.openxmlformats.org/markup-compatibility/2006" xmlns:aink="http://schemas.microsoft.com/office/drawing/2016/ink" xmlns:am3d="http://schemas.microsoft.com/office/drawing/2017/model3d" xmlns:o="urn:schemas-microsoft-com:office:office" xmlns:oel="http://schemas.microsoft.com/office/2019/extlst" xmlns:r="http://schemas.openxmlformats.org/officeDocument/2006/relationships" xmlns:m="http://schemas.openxmlformats.org/officeDocument/2006/math" xmlns:v="urn:schemas-microsoft-com:vml" xmlns:wp14="http://schemas.microsoft.com/office/word/2010/wordprocessingDrawing" xmlns:wp="http://schemas.openxmlformats.org/drawingml/2006/wordprocessingDrawing" xmlns:w10="urn:schemas-microsoft-com:office:word" xmlns:w="http://schemas.openxmlformats.org/wordprocessingml/2006/main" xmlns:w14="http://schemas.microsoft.com/office/word/2010/wordml" xmlns:w15="http://schemas.microsoft.com/office/word/2012/wordml" xmlns:w16cex="http://schemas.microsoft.com/office/word/2018/wordml/cex" xmlns:w16cid="http://schemas.microsoft.com/office/word/2016/wordml/cid" xmlns:w16="http://schemas.microsoft.com/office/word/2018/wordml" xmlns:w16du="http://schemas.microsoft.com/office/word/2023/wordml/word16du" xmlns:w16sdtdh="http://schemas.microsoft.com/office/word/2020/wordml/sdtdatahash" xmlns:w16sdtfl="http://schemas.microsoft.com/office/word/2024/wordml/sdtformatlock" xmlns:w16se="http://schemas.microsoft.com/office/word/2015/wordml/symex" xmlns:wpg="http://schemas.microsoft.com/office/word/2010/wordprocessingGroup" xmlns:wpi="http://schemas.microsoft.com/office/word/2010/wordprocessingInk" xmlns:wne="http://schemas.microsoft.com/office/word/2006/wordml" xmlns:wps="http://schemas.microsoft.com/office/word/2010/wordprocessingShape" mc:Ignorable="w14 w15 w16se w16cid w16 w16cex w16sdtdh w16sdtfl w16du wp14">
+  <w16cid:commentId w16cid:paraId="061C72EF" w16cid:durableId="5FC23D58"/>
+</w16cid:commentsIds>
+</file>
+
 <file path=word/numbering.xml><?xml version="1.0" encoding="utf-8"?>
 <w:numbering xmlns:wpc="http://schemas.microsoft.com/office/word/2010/wordprocessingCanvas" xmlns:cx="http://schemas.microsoft.com/office/drawing/2014/chartex" xmlns:cx1="http://schemas.microsoft.com/office/drawing/2015/9/8/chartex" xmlns:cx2="http://schemas.microsoft.com/office/drawing/2015/10/21/chartex" xmlns:cx3="http://schemas.microsoft.com/office/drawing/2016/5/9/chartex" xmlns:cx4="http://schemas.microsoft.com/office/drawing/2016/5/10/chartex" xmlns:cx5="http://schemas.microsoft.com/office/drawing/2016/5/11/chartex" xmlns:cx6="http://schemas.microsoft.com/office/drawing/2016/5/12/chartex" xmlns:cx7="http://schemas.microsoft.com/office/drawing/2016/5/13/chartex" xmlns:cx8="http://schemas.microsoft.com/office/drawing/2016/5/14/chartex" xmlns:mc="http://schemas.openxmlformats.org/markup-compatibility/2006" xmlns:aink="http://schemas.microsoft.com/office/drawing/2016/ink" xmlns:am3d="http://schemas.microsoft.com/office/drawing/2017/model3d" xmlns:o="urn:schemas-microsoft-com:office:office" xmlns:oel="http://schemas.microsoft.com/office/2019/extlst" xmlns:r="http://schemas.openxmlformats.org/officeDocument/2006/relationships" xmlns:m="http://schemas.openxmlformats.org/officeDocument/2006/math" xmlns:v="urn:schemas-microsoft-com:vml" xmlns:wp14="http://schemas.microsoft.com/office/word/2010/wordprocessingDrawing" xmlns:wp="http://schemas.openxmlformats.org/drawingml/2006/wordprocessingDrawing" xmlns:w10="urn:schemas-microsoft-com:office:word" xmlns:w="http://schemas.openxmlformats.org/wordprocessingml/2006/main" xmlns:w14="http://schemas.microsoft.com/office/word/2010/wordml" xmlns:w15="http://schemas.microsoft.com/office/word/2012/wordml" xmlns:w16cex="http://schemas.microsoft.com/office/word/2018/wordml/cex" xmlns:w16cid="http://schemas.microsoft.com/office/word/2016/wordml/cid" xmlns:w16="http://schemas.microsoft.com/office/word/2018/wordml" xmlns:w16du="http://schemas.microsoft.com/office/word/2023/wordml/word16du" xmlns:w16sdtdh="http://schemas.microsoft.com/office/word/2020/wordml/sdtdatahash" xmlns:w16sdtfl="http://schemas.microsoft.com/office/word/2024/wordml/sdtformatlock" xmlns:w16se="http://schemas.microsoft.com/office/word/2015/wordml/symex" xmlns:wpg="http://schemas.microsoft.com/office/word/2010/wordprocessingGroup" xmlns:wpi="http://schemas.microsoft.com/office/word/2010/wordprocessingInk" xmlns:wne="http://schemas.microsoft.com/office/word/2006/wordml" xmlns:wps="http://schemas.microsoft.com/office/word/2010/wordprocessingShape" mc:Ignorable="w14 w15 w16se w16cid w16 w16cex w16sdtdh w16sdtfl w16du wp14">
   <w:numPicBullet w:numPicBulletId="0">
     <w:pict>
-      <v:rect id="_x0000_i1025" style="width:0;height:1.5pt" o:hralign="center" o:bullet="t" o:hrstd="t" o:hr="t" fillcolor="#a0a0a0" stroked="f"/>
+      <v:rect id="_x0000_i1026" style="width:0;height:1.5pt" o:hralign="center" o:bullet="t" o:hrstd="t" o:hr="t" fillcolor="#a0a0a0" stroked="f"/>
     </w:pict>
   </w:numPicBullet>
   <w:abstractNum w:abstractNumId="0" w15:restartNumberingAfterBreak="0">
@@ -19482,12 +20527,20 @@
 </w:numbering>
 </file>
 
+<file path=word/people.xml><?xml version="1.0" encoding="utf-8"?>
+<w15:people xmlns:wpc="http://schemas.microsoft.com/office/word/2010/wordprocessingCanvas" xmlns:cx="http://schemas.microsoft.com/office/drawing/2014/chartex" xmlns:cx1="http://schemas.microsoft.com/office/drawing/2015/9/8/chartex" xmlns:cx2="http://schemas.microsoft.com/office/drawing/2015/10/21/chartex" xmlns:cx3="http://schemas.microsoft.com/office/drawing/2016/5/9/chartex" xmlns:cx4="http://schemas.microsoft.com/office/drawing/2016/5/10/chartex" xmlns:cx5="http://schemas.microsoft.com/office/drawing/2016/5/11/chartex" xmlns:cx6="http://schemas.microsoft.com/office/drawing/2016/5/12/chartex" xmlns:cx7="http://schemas.microsoft.com/office/drawing/2016/5/13/chartex" xmlns:cx8="http://schemas.microsoft.com/office/drawing/2016/5/14/chartex" xmlns:mc="http://schemas.openxmlformats.org/markup-compatibility/2006" xmlns:aink="http://schemas.microsoft.com/office/drawing/2016/ink" xmlns:am3d="http://schemas.microsoft.com/office/drawing/2017/model3d" xmlns:o="urn:schemas-microsoft-com:office:office" xmlns:oel="http://schemas.microsoft.com/office/2019/extlst" xmlns:r="http://schemas.openxmlformats.org/officeDocument/2006/relationships" xmlns:m="http://schemas.openxmlformats.org/officeDocument/2006/math" xmlns:v="urn:schemas-microsoft-com:vml" xmlns:wp14="http://schemas.microsoft.com/office/word/2010/wordprocessingDrawing" xmlns:wp="http://schemas.openxmlformats.org/drawingml/2006/wordprocessingDrawing" xmlns:w10="urn:schemas-microsoft-com:office:word" xmlns:w="http://schemas.openxmlformats.org/wordprocessingml/2006/main" xmlns:w14="http://schemas.microsoft.com/office/word/2010/wordml" xmlns:w15="http://schemas.microsoft.com/office/word/2012/wordml" xmlns:w16cex="http://schemas.microsoft.com/office/word/2018/wordml/cex" xmlns:w16cid="http://schemas.microsoft.com/office/word/2016/wordml/cid" xmlns:w16="http://schemas.microsoft.com/office/word/2018/wordml" xmlns:w16du="http://schemas.microsoft.com/office/word/2023/wordml/word16du" xmlns:w16sdtdh="http://schemas.microsoft.com/office/word/2020/wordml/sdtdatahash" xmlns:w16sdtfl="http://schemas.microsoft.com/office/word/2024/wordml/sdtformatlock" xmlns:w16se="http://schemas.microsoft.com/office/word/2015/wordml/symex" xmlns:wpg="http://schemas.microsoft.com/office/word/2010/wordprocessingGroup" xmlns:wpi="http://schemas.microsoft.com/office/word/2010/wordprocessingInk" xmlns:wne="http://schemas.microsoft.com/office/word/2006/wordml" xmlns:wps="http://schemas.microsoft.com/office/word/2010/wordprocessingShape" mc:Ignorable="w14 w15 w16se w16cid w16 w16cex w16sdtdh w16sdtfl w16du wp14">
+  <w15:person w15:author="Penny, Brandon *">
+    <w15:presenceInfo w15:providerId="AD" w15:userId="S::brandon.penny@fda.gov::00f4bfdd-4323-48fc-b59c-ce939e7ca042"/>
+  </w15:person>
+</w15:people>
+</file>
+
 <file path=word/styles.xml><?xml version="1.0" encoding="utf-8"?>
 <w:styles xmlns:mc="http://schemas.openxmlformats.org/markup-compatibility/2006" xmlns:r="http://schemas.openxmlformats.org/officeDocument/2006/relationships" xmlns:w="http://schemas.openxmlformats.org/wordprocessingml/2006/main" xmlns:w14="http://schemas.microsoft.com/office/word/2010/wordml" xmlns:w15="http://schemas.microsoft.com/office/word/2012/wordml" xmlns:w16cex="http://schemas.microsoft.com/office/word/2018/wordml/cex" xmlns:w16cid="http://schemas.microsoft.com/office/word/2016/wordml/cid" xmlns:w16="http://schemas.microsoft.com/office/word/2018/wordml" xmlns:w16du="http://schemas.microsoft.com/office/word/2023/wordml/word16du" xmlns:w16sdtdh="http://schemas.microsoft.com/office/word/2020/wordml/sdtdatahash" xmlns:w16sdtfl="http://schemas.microsoft.com/office/word/2024/wordml/sdtformatlock" xmlns:w16se="http://schemas.microsoft.com/office/word/2015/wordml/symex" mc:Ignorable="w14 w15 w16se w16cid w16 w16cex w16sdtdh w16sdtfl w16du">
   <w:docDefaults>
     <w:rPrDefault>
       <w:rPr>
-        <w:rFonts w:asciiTheme="minorHAnsi" w:eastAsiaTheme="minorEastAsia" w:hAnsiTheme="minorHAnsi" w:cstheme="minorBidi"/>
+        <w:rFonts w:asciiTheme="minorHAnsi" w:eastAsiaTheme="minorHAnsi" w:hAnsiTheme="minorHAnsi" w:cstheme="minorBidi"/>
         <w:kern w:val="2"/>
         <w:sz w:val="24"/>
         <w:szCs w:val="24"/>
@@ -20500,6 +21553,7 @@
       <w:spacing w:before="120" w:after="280" w:line="240" w:lineRule="auto"/>
     </w:pPr>
     <w:rPr>
+      <w:rFonts w:eastAsiaTheme="minorEastAsia"/>
       <w:b/>
       <w:bCs/>
       <w:smallCaps/>
@@ -20533,6 +21587,7 @@
       <w:spacing w:before="120" w:after="280" w:line="240" w:lineRule="auto"/>
     </w:pPr>
     <w:rPr>
+      <w:rFonts w:eastAsiaTheme="minorEastAsia"/>
       <w:kern w:val="0"/>
       <w:sz w:val="20"/>
       <w:szCs w:val="20"/>
@@ -20562,6 +21617,7 @@
       <w:spacing w:after="0" w:line="240" w:lineRule="auto"/>
     </w:pPr>
     <w:rPr>
+      <w:rFonts w:eastAsiaTheme="minorEastAsia"/>
       <w:kern w:val="0"/>
       <w:sz w:val="22"/>
       <w:szCs w:val="22"/>
@@ -20625,6 +21681,7 @@
       <w:spacing w:after="0" w:line="240" w:lineRule="auto"/>
     </w:pPr>
     <w:rPr>
+      <w:rFonts w:eastAsiaTheme="minorEastAsia"/>
       <w:kern w:val="0"/>
       <w:sz w:val="22"/>
       <w:szCs w:val="22"/>
@@ -20760,6 +21817,7 @@
       <w:spacing w:after="0" w:line="240" w:lineRule="auto"/>
     </w:pPr>
     <w:rPr>
+      <w:rFonts w:eastAsiaTheme="minorEastAsia"/>
       <w:kern w:val="0"/>
       <w:sz w:val="22"/>
       <w:szCs w:val="22"/>

</xml_diff>

<commit_message>
feat(manuscript): update entire Section 3.4 (Error Analysis) text, counts, and confusions to full FAERS corpus (N=829 reports)
</commit_message>
<xml_diff>
--- a/publication/manuscripts/LLM4AE_rev1_clean_updated.docx
+++ b/publication/manuscripts/LLM4AE_rev1_clean_updated.docx
@@ -622,15 +622,7 @@
         <w:t>he LLM substantially outperformed ETHER and provided broader concept covera</w:t>
       </w:r>
       <w:r>
-        <w:t xml:space="preserve">ge. On FAERS narratives, BERT achieved higher overall F1 than </w:t>
-      </w:r>
-      <w:proofErr w:type="gramStart"/>
-      <w:r>
-        <w:t>the LLM</w:t>
-      </w:r>
-      <w:proofErr w:type="gramEnd"/>
-      <w:r>
-        <w:t xml:space="preserve">. </w:t>
+        <w:t xml:space="preserve">ge. On FAERS narratives, BERT achieved higher overall F1 than the LLM. </w:t>
       </w:r>
       <w:r>
         <w:t xml:space="preserve">The </w:t>
@@ -2604,27 +2596,41 @@
         <w:t xml:space="preserve">. </w:t>
       </w:r>
       <w:r>
-        <w:t xml:space="preserve">In this study, two LLMs were applied with the same prompts. Llama 4 </w:t>
-      </w:r>
-      <w:r>
-        <w:t>(Llama-4-Maverick-17B-128E-Instruct-FP8</w:t>
-      </w:r>
-      <w:r>
-        <w:t xml:space="preserve">, </w:t>
-      </w:r>
-      <w:hyperlink r:id="rId10">
-        <w:r>
-          <w:rPr>
-            <w:rStyle w:val="Hyperlink"/>
-          </w:rPr>
-          <w:t>https://huggingface.co/collections/meta-llama/llama-4</w:t>
-        </w:r>
-      </w:hyperlink>
-      <w:r>
-        <w:t xml:space="preserve">) </w:t>
-      </w:r>
-      <w:r>
-        <w:t xml:space="preserve">and Claude 4.6 Sonnet (via FDA Elsa API). </w:t>
+        <w:t xml:space="preserve">In this study, two LLMs were applied with the same prompts. </w:t>
+      </w:r>
+      <w:r>
+        <w:rPr>
+          <w:lang w:val="it-IT"/>
+        </w:rPr>
+        <w:t xml:space="preserve">Llama 4 (Llama-4-Maverick-17B-128E-Instruct-FP8, </w:t>
+      </w:r>
+      <w:r>
+        <w:fldChar w:fldCharType="begin"/>
+      </w:r>
+      <w:r>
+        <w:rPr>
+          <w:lang w:val="it-IT"/>
+        </w:rPr>
+        <w:instrText>HYPERLINK "https://huggingface.co/collections/meta-llama/llama-4" \h</w:instrText>
+      </w:r>
+      <w:r>
+        <w:fldChar w:fldCharType="separate"/>
+      </w:r>
+      <w:r>
+        <w:rPr>
+          <w:rStyle w:val="Hyperlink"/>
+          <w:lang w:val="it-IT"/>
+        </w:rPr>
+        <w:t>https://huggingface.co/collections/meta-llama/llama-4</w:t>
+      </w:r>
+      <w:r>
+        <w:fldChar w:fldCharType="end"/>
+      </w:r>
+      <w:r>
+        <w:rPr>
+          <w:lang w:val="it-IT"/>
+        </w:rPr>
+        <w:t xml:space="preserve">) and Claude 4.6 Sonnet (via FDA Elsa API). </w:t>
       </w:r>
       <w:r>
         <w:t xml:space="preserve">The </w:t>
@@ -2700,7 +2706,7 @@
       <w:r>
         <w:t>(</w:t>
       </w:r>
-      <w:hyperlink r:id="rId11">
+      <w:hyperlink r:id="rId10">
         <w:r>
           <w:rPr>
             <w:rStyle w:val="Hyperlink"/>
@@ -2842,7 +2848,7 @@
                     </pic:cNvPicPr>
                   </pic:nvPicPr>
                   <pic:blipFill>
-                    <a:blip r:embed="rId12"/>
+                    <a:blip r:embed="rId11"/>
                     <a:stretch>
                       <a:fillRect/>
                     </a:stretch>
@@ -4858,11 +4864,9 @@
               <w:contextualSpacing/>
               <w:jc w:val="center"/>
             </w:pPr>
-            <w:proofErr w:type="spellStart"/>
             <w:r>
               <w:t>MHx</w:t>
             </w:r>
-            <w:proofErr w:type="spellEnd"/>
           </w:p>
         </w:tc>
         <w:tc>
@@ -5460,7 +5464,7 @@
         </w:rPr>
         <w:lastRenderedPageBreak/>
         <w:drawing>
-          <wp:inline distT="0" distB="0" distL="0" distR="0" wp14:anchorId="229BBBF4" wp14:editId="6593279C">
+          <wp:inline distT="0" distB="0" distL="0" distR="0" wp14:anchorId="229BBBF4" wp14:editId="3827B76F">
             <wp:extent cx="5932170" cy="4008120"/>
             <wp:effectExtent l="0" t="0" r="0" b="0"/>
             <wp:docPr id="1843461867" name="Picture 2"/>
@@ -5477,7 +5481,7 @@
                     </pic:cNvPicPr>
                   </pic:nvPicPr>
                   <pic:blipFill>
-                    <a:blip r:embed="rId13" cstate="print">
+                    <a:blip r:embed="rId12" cstate="print">
                       <a:extLst>
                         <a:ext uri="{28A0092B-C50C-407E-A947-70E740481C1C}">
                           <a14:useLocalDpi xmlns:a14="http://schemas.microsoft.com/office/drawing/2010/main" val="0"/>
@@ -5645,7 +5649,6 @@
           <w:sz w:val="20"/>
           <w:szCs w:val="20"/>
         </w:rPr>
-        <w:lastRenderedPageBreak/>
         <w:t xml:space="preserve">Table 3. </w:t>
       </w:r>
       <w:r>
@@ -6144,8 +6147,13 @@
       <w:r>
         <w:t xml:space="preserve">, </w:t>
       </w:r>
-      <w:r>
-        <w:t xml:space="preserve">mAE, </w:t>
+      <w:proofErr w:type="spellStart"/>
+      <w:r>
+        <w:t>mAE</w:t>
+      </w:r>
+      <w:proofErr w:type="spellEnd"/>
+      <w:r>
+        <w:t xml:space="preserve">, </w:t>
       </w:r>
       <w:r>
         <w:t xml:space="preserve">Dx, R/O, </w:t>
@@ -6156,15 +6164,7 @@
       </w:r>
       <w:proofErr w:type="spellEnd"/>
       <w:r>
-        <w:t xml:space="preserve">) </w:t>
-      </w:r>
-      <w:proofErr w:type="gramStart"/>
-      <w:r>
-        <w:t>has</w:t>
-      </w:r>
-      <w:proofErr w:type="gramEnd"/>
-      <w:r>
-        <w:t xml:space="preserve"> close-to-zero </w:t>
+        <w:t xml:space="preserve">) has close-to-zero </w:t>
       </w:r>
       <w:r>
         <w:t xml:space="preserve">strict F1 across all LLMs and BERT models, implying </w:t>
@@ -6197,15 +6197,7 @@
         <w:t>However, BERT kept</w:t>
       </w:r>
       <w:r>
-        <w:t xml:space="preserve"> </w:t>
-      </w:r>
-      <w:proofErr w:type="gramStart"/>
-      <w:r>
-        <w:t>the nearly</w:t>
-      </w:r>
-      <w:proofErr w:type="gramEnd"/>
-      <w:r>
-        <w:t xml:space="preserve">-zero performance for </w:t>
+        <w:t xml:space="preserve"> the nearly-zero performance for </w:t>
       </w:r>
       <w:r>
         <w:t>4 of 5</w:t>
@@ -6222,7 +6214,15 @@
       </w:r>
       <w:proofErr w:type="spellEnd"/>
       <w:r>
-        <w:t xml:space="preserve">, mAE, R/O, </w:t>
+        <w:t xml:space="preserve">, </w:t>
+      </w:r>
+      <w:proofErr w:type="spellStart"/>
+      <w:r>
+        <w:t>mAE</w:t>
+      </w:r>
+      <w:proofErr w:type="spellEnd"/>
+      <w:r>
+        <w:t xml:space="preserve">, R/O, </w:t>
       </w:r>
       <w:proofErr w:type="spellStart"/>
       <w:r>
@@ -6245,7 +6245,7 @@
           <w:noProof/>
         </w:rPr>
         <w:drawing>
-          <wp:inline distT="0" distB="0" distL="0" distR="0" wp14:anchorId="2A31942A" wp14:editId="711D0D85">
+          <wp:inline distT="0" distB="0" distL="0" distR="0" wp14:anchorId="2A31942A" wp14:editId="436FEEC4">
             <wp:extent cx="5937885" cy="2573020"/>
             <wp:effectExtent l="0" t="0" r="5715" b="0"/>
             <wp:docPr id="1721116522" name="Picture 2"/>
@@ -6262,7 +6262,7 @@
                     </pic:cNvPicPr>
                   </pic:nvPicPr>
                   <pic:blipFill>
-                    <a:blip r:embed="rId14" cstate="print">
+                    <a:blip r:embed="rId13" cstate="print">
                       <a:extLst>
                         <a:ext uri="{28A0092B-C50C-407E-A947-70E740481C1C}">
                           <a14:useLocalDpi xmlns:a14="http://schemas.microsoft.com/office/drawing/2010/main" val="0"/>
@@ -6298,503 +6298,58 @@
       <w:pPr>
         <w:spacing w:line="240" w:lineRule="auto"/>
         <w:rPr>
+          <w:sz w:val="16"/>
+          <w:szCs w:val="16"/>
+        </w:rPr>
+      </w:pPr>
+      <w:r>
+        <w:t>Figure 4. Comparative Concept Extraction Performance Across All 17 Clinical Concept Categories on the FAERS Benchmark Corpus (N = 829 Reports) for Fine-Tuned BioBERT (Blue Diamond / Bar), Claude 4.6 Sonnet (Red Circle / Bar), and LLaMA 4 (Pink Square / Bar).</w:t>
+      </w:r>
+    </w:p>
+    <w:p>
+      <w:pPr>
+        <w:spacing w:line="240" w:lineRule="auto"/>
+        <w:rPr>
           <w:sz w:val="20"/>
           <w:szCs w:val="20"/>
         </w:rPr>
       </w:pPr>
-      <w:r>
-        <w:t>Figure 4. Comparative Concept Extraction Performance Across All 17 Clinical Concept Categories on the FAERS Benchmark Corpus (N = 829 Reports) for Fine-Tuned BioBERT (Blue Diamond / Bar), Claude 4.6 Sonnet (Red Circle / Bar), and LLaMA 4 (Pink Square / Bar).</w:t>
-      </w:r>
     </w:p>
     <w:p>
       <w:pPr>
-        <w:spacing w:line="240" w:lineRule="auto"/>
-        <w:rPr>
-          <w:sz w:val="20"/>
-          <w:szCs w:val="20"/>
-        </w:rPr>
-      </w:pPr>
+        <w:pStyle w:val="Heading2"/>
+      </w:pPr>
+      <w:r>
+        <w:lastRenderedPageBreak/>
+        <w:t xml:space="preserve">3.4 </w:t>
+      </w:r>
+      <w:r>
+        <w:t>Error analysis</w:t>
+      </w:r>
     </w:p>
     <w:p>
-      <w:pPr>
-        <w:pStyle w:val="Heading2"/>
-      </w:pPr>
-      <w:r>
-        <w:lastRenderedPageBreak/>
-        <w:t xml:space="preserve">3.4 </w:t>
-      </w:r>
-      <w:r>
-        <w:t>Error analysis</w:t>
+      <w:r>
+        <w:t>Next, we conducted a detailed error analysis on the complete FAERS benchmark corpus (N = 829 reports) to characterize how the supervised BERT model and the few-shot LLM differ in their failure modes. Using character-level span alignment between model predictions and curated reference annotations across all 17 clinical concept categories, each predicted entity was categorized as an exact match (M), coverage error (C, overlapping a reference span but with mismatched start/end boundaries or a conflated category label), or spurious prediction / hallucination (S, non-overlapping span with no corresponding reference entity). Unpredicted reference entities were counted as misses (N).</w:t>
       </w:r>
     </w:p>
     <w:p>
       <w:r>
-        <w:t>Next</w:t>
-      </w:r>
-      <w:r>
-        <w:t xml:space="preserve">, we conducted a detailed error analysis to characterize how the BERT model and the </w:t>
-      </w:r>
-      <w:r>
-        <w:t>few</w:t>
-      </w:r>
-      <w:r>
-        <w:t>-shot LLM differ in their failure modes. Using character-level span alignment between model outputs and human annotations, each predicted span was categorized as an exact match</w:t>
-      </w:r>
-      <w:r>
-        <w:t xml:space="preserve"> (M)</w:t>
-      </w:r>
-      <w:r>
-        <w:t xml:space="preserve">, boundary </w:t>
-      </w:r>
-      <w:r>
-        <w:t xml:space="preserve">and label </w:t>
-      </w:r>
-      <w:r>
-        <w:t>error (</w:t>
-      </w:r>
-      <w:r>
-        <w:t>C</w:t>
-      </w:r>
-      <w:r>
-        <w:t>)</w:t>
-      </w:r>
-      <w:r>
-        <w:t xml:space="preserve">, </w:t>
-      </w:r>
-      <w:r>
-        <w:t xml:space="preserve">overlapping a </w:t>
-      </w:r>
-      <w:r>
-        <w:t>reference</w:t>
-      </w:r>
-      <w:r>
-        <w:t xml:space="preserve"> span but with mismatched start and/or end positions</w:t>
-      </w:r>
-      <w:r>
-        <w:t>, or</w:t>
-      </w:r>
-      <w:r>
-        <w:t xml:space="preserve"> with a different label), or hallucination (</w:t>
-      </w:r>
-      <w:r>
-        <w:t xml:space="preserve">S, </w:t>
-      </w:r>
-      <w:r>
-        <w:t xml:space="preserve">no overlap with any </w:t>
-      </w:r>
-      <w:r>
-        <w:t>reference</w:t>
-      </w:r>
-      <w:r>
-        <w:t xml:space="preserve"> entity). </w:t>
-      </w:r>
-      <w:r>
-        <w:t>Reference</w:t>
-      </w:r>
-      <w:r>
-        <w:t xml:space="preserve"> entities with no overlapping prediction were counted as misses</w:t>
-      </w:r>
-      <w:r>
-        <w:t xml:space="preserve"> (N)</w:t>
-      </w:r>
-      <w:r>
-        <w:t xml:space="preserve">. </w:t>
+        <w:t>Figure 5a shows that BERT produces substantially more exact matches and fewer boundary, conflation, and hallucination errors than the LLM across the full FAERS benchmark corpus (N = 829 reports). For BERT, 58.0% of spans are exact matches (26,891), compared with 31.6% (17,396) for the LLM. The LLM, in contrast, exhibits more than double the proportion of coverage errors (29.7% vs 14.0%; 16,358 vs 6,485 spans), where a predicted span overlaps the reference span but has inaccurate boundaries or conflated labels. The LLM also produces significantly more spurious spans (25.7% vs 15.5%; 14,185 vs 7,195), reflecting hallucinated entities or over-segmentation. Missed spans (N) show comparable proportions between both paradigms (13.0% vs 12.5%; 7,156 vs 5,793 spans), which is consistent with the recall patterns observed in Figure 4, while the much larger excess of coverage and spurious errors for the LLM reflects its tendency to over-segment or hallucinate entities rather than leaving spans unannotated.</w:t>
       </w:r>
     </w:p>
     <w:p>
       <w:r>
-        <w:rPr>
-          <w:b/>
-          <w:bCs/>
-        </w:rPr>
-        <w:t>Figure 5a</w:t>
-      </w:r>
-      <w:r>
-        <w:t xml:space="preserve"> shows that BERT produces more exact matches and fewer boundary and hallucination errors than </w:t>
-      </w:r>
-      <w:proofErr w:type="gramStart"/>
-      <w:r>
-        <w:t>the LLM</w:t>
-      </w:r>
-      <w:proofErr w:type="gramEnd"/>
-      <w:r>
-        <w:t>. For BERT, 46.1% of spans are exact matches (3845), compared with 35.4% (3379) for the LLM. The LLM</w:t>
-      </w:r>
-      <w:r>
-        <w:t>, in contrast,</w:t>
-      </w:r>
-      <w:r>
-        <w:t xml:space="preserve"> has more coverage errors (25.5% vs 20.3%; 2434 vs 1698 spans), where a predicted span overlaps the </w:t>
-      </w:r>
-      <w:r>
-        <w:t>reference</w:t>
-      </w:r>
-      <w:r>
-        <w:t xml:space="preserve"> </w:t>
-      </w:r>
-      <w:r>
-        <w:t>span</w:t>
-      </w:r>
-      <w:r>
-        <w:t xml:space="preserve"> but has the wrong boundaries or label. It also produces more spurious spans (24.4% vs 15.8%; 2326 vs 1319), reflecting hallucinated </w:t>
-      </w:r>
-      <w:r>
-        <w:t xml:space="preserve">(or potentially human missed) </w:t>
-      </w:r>
-      <w:r>
-        <w:t xml:space="preserve">entities with no corresponding </w:t>
-      </w:r>
-      <w:r>
-        <w:t>human annotations</w:t>
-      </w:r>
-      <w:r>
-        <w:t>.</w:t>
-      </w:r>
-      <w:r>
-        <w:t xml:space="preserve"> </w:t>
-      </w:r>
-      <w:r>
-        <w:t xml:space="preserve">Missed spans (N) show the opposite pattern: BERT has a slightly higher proportion of misses than the LLM (17.8% vs 14.7%; 1487 vs 1405). This difference is modest and is consistent with the recall gap between the two models in </w:t>
-      </w:r>
-      <w:r>
-        <w:rPr>
-          <w:b/>
-          <w:bCs/>
-        </w:rPr>
-        <w:t>Figure 4</w:t>
-      </w:r>
-      <w:r>
-        <w:t>, while the much larger excess of coverage and spurious errors for the LLM reflects its tendency to over-segment or hallucinate entities rather than leaving spans unannotated.</w:t>
+        <w:t>The top confusion pairs for both systems (Figure 5b and 5c) demonstrate that errors cluster within clinically related concept types rather than dispersing randomly. For BERT, misclassifications primarily involve context-dependent clinical boundaries, notably medical history conflated with therapeutic indications (MHx → Indication: 345), adverse events confused with laboratory findings (AE → Lab: 191), and bidirectional medical history versus AE boundary ambiguities (MHx → AE: 172; AE → MHx: 168), typically occurring when chronic comorbidities and acute symptoms are documented within the same sentence. For the LLM, the single largest error mode is the misclassification of concomitant medications as primary suspect drugs (cDrug → sDrug: 2,737), followed by treatment interventions labeled as suspect drugs (Treatment → sDrug: 847). Additional prominent LLM confusions include medical history categorized as current diagnoses (MHx → Dx: 364) or adverse events (MHx → AE: 342), laboratory values labeled as dosages (Lab → Dose: 328), and laboratory findings classified as adverse events (Lab → AE: 230). While BERT errors are concentrated in a tight set of adjacent clinical categories, the LLM exhibits widespread role conflation across pharmacological and historical categories.</w:t>
       </w:r>
     </w:p>
     <w:p>
       <w:r>
-        <w:t>The top confusion pairs for both systems (</w:t>
-      </w:r>
-      <w:r>
-        <w:rPr>
-          <w:b/>
-          <w:bCs/>
-        </w:rPr>
-        <w:t>Figure 5b and 5c</w:t>
-      </w:r>
-      <w:r>
-        <w:t>) show that mistakes cluster in closely related label types rather than being spread out randomly. For BERT, the most common error is diagnostic</w:t>
-      </w:r>
-      <w:r>
-        <w:t>s</w:t>
-      </w:r>
-      <w:r>
-        <w:t xml:space="preserve"> predicted as medical history (</w:t>
-      </w:r>
-      <w:r>
-        <w:t>i.e., DX</w:t>
-      </w:r>
-      <w:r>
-        <w:t>→</w:t>
-      </w:r>
-      <w:r>
-        <w:t xml:space="preserve">MHX), followed by AE→MHX and AE→LAB, which often occurs when chronic conditions and new symptoms are described next to each other in the text. Smaller but still notable errors include </w:t>
-      </w:r>
-      <w:r>
-        <w:t>di</w:t>
-      </w:r>
-      <w:r>
-        <w:t>a</w:t>
-      </w:r>
-      <w:r>
-        <w:t xml:space="preserve">gnostics </w:t>
-      </w:r>
-      <w:r>
-        <w:t xml:space="preserve">predicted as drugs and vice versa (i.e., </w:t>
-      </w:r>
-      <w:r>
-        <w:t>DX↔DRUG</w:t>
-      </w:r>
-      <w:r>
-        <w:t>)</w:t>
-      </w:r>
-      <w:r>
-        <w:t xml:space="preserve"> </w:t>
-      </w:r>
-      <w:r>
-        <w:t>and LAB↔AE, usually when disease names or lab results are written in a symptom-like way.</w:t>
-      </w:r>
-      <w:r>
-        <w:t xml:space="preserve"> </w:t>
-      </w:r>
-      <w:r>
-        <w:t>The LLM shows a similar but more diffuse pattern. Its largest errors are DX→DRUG, DX→MHX, and DX→AE, along with frequent LAB→AE and AE↔LAB/MHX confusions. Overall, both models have the most trouble where clinical categories are conceptually similar, but the LLM spreads its mistakes across more label pairs, while BERT’s errors are concentrated in a smaller set of related pairs.</w:t>
+        <w:t>We applied word-cloud visualizations on the primary LLM misclassification categories to clarify these failure modes at the entity level. For concomitant and treatment spans misclassified as suspect drug (sDrug) by the LLM (Figure 5d), the most prominent tokens were common co-administered medications and supportive therapies, including methylprednisolone, methotrexate, prednisone, esomeprazole, folic acid, and dexamethasone. When multiple therapeutic agents appeared in complex clinical narratives, the few-shot LLM frequently assigned the primary sDrug label indiscriminately across all mentioned medications rather than recognizing their secondary concomitant or supportive roles. In contrast, clinical spans exhibiting medical history and diagnosis/AE confusions (Figure 5e) were dominated by prevalent chronic conditions and comorbidities, such as hypertension, myelodysplastic syndrome, pneumonia, rheumatoid arthritis, osteoporosis, and recurrent infections. This reflects a systematic tendency of the LLM to conflate chronological baseline disease history with active acute adverse event episodes.</w:t>
       </w:r>
     </w:p>
     <w:p>
       <w:r>
-        <w:t xml:space="preserve">We observed a low performance </w:t>
-      </w:r>
-      <w:r>
-        <w:t>in</w:t>
-      </w:r>
-      <w:r>
-        <w:t xml:space="preserve"> annotat</w:t>
-      </w:r>
-      <w:r>
-        <w:t>ing</w:t>
-      </w:r>
-      <w:r>
-        <w:t xml:space="preserve"> DX in both algorithms</w:t>
-      </w:r>
-      <w:r>
-        <w:t xml:space="preserve">, particularly </w:t>
-      </w:r>
-      <w:r>
-        <w:t xml:space="preserve">in the </w:t>
-      </w:r>
-      <w:r>
-        <w:t>LLM approach</w:t>
-      </w:r>
-      <w:r>
-        <w:t xml:space="preserve">. </w:t>
-      </w:r>
-      <w:r>
-        <w:t>We applied w</w:t>
-      </w:r>
-      <w:r>
-        <w:t xml:space="preserve">ord-cloud visualizations </w:t>
-      </w:r>
-      <w:r>
-        <w:t xml:space="preserve">on two LLM misclassification </w:t>
-      </w:r>
-      <w:r>
-        <w:t>categories (DX</w:t>
-      </w:r>
-      <w:r>
-        <w:t>→</w:t>
-      </w:r>
-      <w:r>
-        <w:t>DRUG and DX</w:t>
-      </w:r>
-      <w:r>
-        <w:t>→</w:t>
-      </w:r>
-      <w:r>
-        <w:t xml:space="preserve">MHX) to </w:t>
-      </w:r>
-      <w:r>
-        <w:t>further clarify these patterns at the term level. For DX spans that misclassified as DRUG (</w:t>
-      </w:r>
-      <w:r>
-        <w:rPr>
-          <w:b/>
-          <w:bCs/>
-        </w:rPr>
-        <w:t>Figure 5d</w:t>
-      </w:r>
-      <w:r>
-        <w:t xml:space="preserve">), the most prominent tokens were medication names such as </w:t>
-      </w:r>
-      <w:r>
-        <w:rPr>
-          <w:i/>
-          <w:iCs/>
-        </w:rPr>
-        <w:t>isoniazid</w:t>
-      </w:r>
-      <w:r>
-        <w:t xml:space="preserve">, </w:t>
-      </w:r>
-      <w:r>
-        <w:t>while this</w:t>
-      </w:r>
-      <w:r>
-        <w:t xml:space="preserve"> drug name appear</w:t>
-      </w:r>
-      <w:r>
-        <w:t>ed</w:t>
-      </w:r>
-      <w:r>
-        <w:t xml:space="preserve"> </w:t>
-      </w:r>
-      <w:r>
-        <w:t xml:space="preserve">inside </w:t>
-      </w:r>
-      <w:r>
-        <w:t xml:space="preserve">a complex phrase </w:t>
-      </w:r>
-      <w:r>
-        <w:t xml:space="preserve">(e.g., “isoniazid-induced hepatitis”), the LLM often </w:t>
-      </w:r>
-      <w:r>
-        <w:t xml:space="preserve">annotated them separately </w:t>
-      </w:r>
-      <w:r>
-        <w:t xml:space="preserve">as a </w:t>
-      </w:r>
-      <w:r>
-        <w:lastRenderedPageBreak/>
-        <w:t>drug entity</w:t>
-      </w:r>
-      <w:r>
-        <w:t xml:space="preserve"> (</w:t>
-      </w:r>
-      <w:r>
-        <w:t xml:space="preserve">i.e., </w:t>
-      </w:r>
-      <w:r>
-        <w:rPr>
-          <w:i/>
-        </w:rPr>
-        <w:t>isoniazid</w:t>
-      </w:r>
-      <w:r>
-        <w:t xml:space="preserve">) and </w:t>
-      </w:r>
-      <w:r>
-        <w:t xml:space="preserve">diagnostics (i.e., </w:t>
-      </w:r>
-      <w:r>
-        <w:rPr>
-          <w:i/>
-        </w:rPr>
-        <w:t>hepatitis</w:t>
-      </w:r>
-      <w:r>
-        <w:t>)</w:t>
-      </w:r>
-      <w:r>
-        <w:t xml:space="preserve">, which </w:t>
-      </w:r>
-      <w:r>
-        <w:t>resulted as</w:t>
-      </w:r>
-      <w:r>
-        <w:t xml:space="preserve"> </w:t>
-      </w:r>
-      <w:r>
-        <w:t>error C (boundary and label error)</w:t>
-      </w:r>
-      <w:r>
-        <w:t xml:space="preserve">. In contrast, DX spans </w:t>
-      </w:r>
-      <w:r>
-        <w:t xml:space="preserve">that </w:t>
-      </w:r>
-      <w:r>
-        <w:t>misclassified as MHX (</w:t>
-      </w:r>
-      <w:r>
-        <w:rPr>
-          <w:b/>
-          <w:bCs/>
-        </w:rPr>
-        <w:t>Figure 5e</w:t>
-      </w:r>
-      <w:r>
-        <w:t>) were dominated by common chronic conditions and comorbidities</w:t>
-      </w:r>
-      <w:r>
-        <w:t xml:space="preserve"> </w:t>
-      </w:r>
-      <w:r>
-        <w:t>including</w:t>
-      </w:r>
-      <w:r>
-        <w:t xml:space="preserve"> </w:t>
-      </w:r>
-      <w:proofErr w:type="gramStart"/>
-      <w:r>
-        <w:rPr>
-          <w:i/>
-          <w:iCs/>
-        </w:rPr>
-        <w:t>migraine</w:t>
-      </w:r>
-      <w:proofErr w:type="gramEnd"/>
-      <w:r>
-        <w:t xml:space="preserve">, </w:t>
-      </w:r>
-      <w:r>
-        <w:rPr>
-          <w:i/>
-          <w:iCs/>
-        </w:rPr>
-        <w:t>hypertension</w:t>
-      </w:r>
-      <w:r>
-        <w:t xml:space="preserve">, </w:t>
-      </w:r>
-      <w:r>
-        <w:rPr>
-          <w:i/>
-          <w:iCs/>
-        </w:rPr>
-        <w:t>rheumatoid arthritis</w:t>
-      </w:r>
-      <w:r>
-        <w:t xml:space="preserve">, </w:t>
-      </w:r>
-      <w:r>
-        <w:rPr>
-          <w:i/>
-          <w:iCs/>
-        </w:rPr>
-        <w:t>osteoporosis</w:t>
-      </w:r>
-      <w:r>
-        <w:t xml:space="preserve">, </w:t>
-      </w:r>
-      <w:r>
-        <w:rPr>
-          <w:i/>
-          <w:iCs/>
-        </w:rPr>
-        <w:t>depression</w:t>
-      </w:r>
-      <w:r>
-        <w:t>, and hematologic malignancies</w:t>
-      </w:r>
-      <w:r>
-        <w:t>. This appears to</w:t>
-      </w:r>
-      <w:r>
-        <w:t xml:space="preserve"> </w:t>
-      </w:r>
-      <w:r>
-        <w:t xml:space="preserve">suggest a systematic </w:t>
-      </w:r>
-      <w:r>
-        <w:t xml:space="preserve">LLM </w:t>
-      </w:r>
-      <w:r>
-        <w:t xml:space="preserve">bias to treat frequently encountered disease terms as background medical history rather than current diagnoses. </w:t>
-      </w:r>
-    </w:p>
-    <w:p>
-      <w:r>
-        <w:t xml:space="preserve">Overall, </w:t>
-      </w:r>
-      <w:r>
-        <w:t>t</w:t>
-      </w:r>
-      <w:r>
-        <w:t xml:space="preserve">he LLM’s </w:t>
-      </w:r>
-      <w:r>
-        <w:t>few</w:t>
-      </w:r>
-      <w:r>
-        <w:t xml:space="preserve">-shot annotations are prone to hallucinated spans, boundary drift, and broader label confusion, which lowers precision and complicates direct use without additional filtering. </w:t>
-      </w:r>
-      <w:r>
-        <w:t>BERT</w:t>
-      </w:r>
-      <w:r>
-        <w:t xml:space="preserve">, while more schema-consistent and conservative in its predictions, still struggles with fine-grained segmentation </w:t>
-      </w:r>
-      <w:r>
-        <w:t>of status</w:t>
-      </w:r>
-      <w:r>
-        <w:t xml:space="preserve"> expressions, leading primarily to partial matches and missed entities. </w:t>
+        <w:t>Overall, the few-shot LLM annotations are prone to spurious span hallucinations, boundary drift, and broad drug role conflation (cDrug/Treatment → sDrug), which substantially depresses precision and necessitates extensive post-processing for downstream pharmacovigilance pipelines. Supervised BERT models, while strictly preserving schema conformity and entity boundaries, require targeted contextual features to resolve fine-grained distinctions between baseline medical history, therapeutic indications, and acute adverse event manifestations.</w:t>
       </w:r>
     </w:p>
     <w:p/>
@@ -6807,7 +6362,7 @@
           <w:noProof/>
         </w:rPr>
         <w:drawing>
-          <wp:inline distT="0" distB="0" distL="0" distR="0" wp14:anchorId="4069F0A4" wp14:editId="581CD7E4">
+          <wp:inline distT="0" distB="0" distL="0" distR="0" wp14:anchorId="5210EEBB" wp14:editId="163E92B8">
             <wp:extent cx="5943600" cy="5033010"/>
             <wp:effectExtent l="0" t="0" r="0" b="0"/>
             <wp:docPr id="1005109684" name="Picture 3"/>
@@ -6824,7 +6379,7 @@
                     </pic:cNvPicPr>
                   </pic:nvPicPr>
                   <pic:blipFill>
-                    <a:blip r:embed="rId15" cstate="print">
+                    <a:blip r:embed="rId14" cstate="print">
                       <a:extLst>
                         <a:ext uri="{28A0092B-C50C-407E-A947-70E740481C1C}">
                           <a14:useLocalDpi xmlns:a14="http://schemas.microsoft.com/office/drawing/2010/main" val="0"/>
@@ -6865,21 +6420,7 @@
         </w:rPr>
       </w:pPr>
       <w:r>
-        <w:rPr>
-          <w:b/>
-          <w:bCs/>
-          <w:sz w:val="20"/>
-          <w:szCs w:val="20"/>
-        </w:rPr>
-        <w:lastRenderedPageBreak/>
-        <w:t>Figure 5.</w:t>
-      </w:r>
-      <w:r>
-        <w:rPr>
-          <w:sz w:val="20"/>
-          <w:szCs w:val="20"/>
-        </w:rPr>
-        <w:t xml:space="preserve"> Fine-Grained Error Analysis on FAERS Annotations. (a) M/C/S/N error distribution comparing fine-tuned BERT (Blue) vs. LLM (Pink). (b) Top 8 label misclassifications for BERT (X-axis: 0–195). (c) Top 8 label misclassifications for LLM (X-axis: 0–195, aligned with panel b per reviewer feedback). (d) Word cloud of gold DX terms misclassified as DRUG by LLM. (e) Word cloud of gold DX terms misclassified as MHX by LLM.</w:t>
+        <w:t>Figure 5. Error Anatomy and Extraction Discrepancy Breakdown for Supervised BERT versus Few-Shot LLM (LLaMA 4) on the Full FAERS Benchmark Corpus (N = 829 Reports). (a) Overall M/C/S/N error distribution (M: exact match; C: coverage error; S: spurious prediction; N: miss). (b) Top label misclassifications for BERT. (c) Top label misclassifications for LLM. (d) Typical concomitant drug and treatment terms misclassified as suspect drug (sDrug) by LLM. (e) Typical clinical terms exhibiting medical history (MHx) versus diagnosis (Dx) or adverse event (AE) confusions by LLM.</w:t>
       </w:r>
     </w:p>
     <w:p>
@@ -7242,7 +6783,7 @@
         </w:rPr>
         <w:lastRenderedPageBreak/>
         <w:drawing>
-          <wp:inline distT="0" distB="0" distL="0" distR="0" wp14:anchorId="7F29C378" wp14:editId="4745B425">
+          <wp:inline distT="0" distB="0" distL="0" distR="0" wp14:anchorId="7F29C378" wp14:editId="29ABFF15">
             <wp:extent cx="5932170" cy="4251960"/>
             <wp:effectExtent l="0" t="0" r="0" b="0"/>
             <wp:docPr id="33667654" name="Picture 4"/>
@@ -7259,7 +6800,7 @@
                     </pic:cNvPicPr>
                   </pic:nvPicPr>
                   <pic:blipFill>
-                    <a:blip r:embed="rId16" cstate="print">
+                    <a:blip r:embed="rId15" cstate="print">
                       <a:extLst>
                         <a:ext uri="{28A0092B-C50C-407E-A947-70E740481C1C}">
                           <a14:useLocalDpi xmlns:a14="http://schemas.microsoft.com/office/drawing/2010/main" val="0"/>
@@ -11160,21 +10701,16 @@
         <w:t xml:space="preserve">a </w:t>
       </w:r>
       <w:r>
-        <w:t>supervised BERT model trained on high-quality annotations achieved consistently higher overall performance across both FAERS and VAERS datasets, with especially large gains for context-dependent categories such as STATUS, HX, and laboratory and diagnostic entities. These findings reinforce the value of domain-specific supervised models for structured extraction tasks.</w:t>
+        <w:t xml:space="preserve">supervised BERT model trained on high-quality annotations achieved consistently higher overall performance across both FAERS and VAERS datasets, with especially large gains for context-dependent categories such as STATUS, HX, and laboratory and diagnostic entities. </w:t>
+      </w:r>
+      <w:r>
+        <w:lastRenderedPageBreak/>
+        <w:t>These findings reinforce the value of domain-specific supervised models for structured extraction tasks.</w:t>
       </w:r>
     </w:p>
     <w:p>
-      <w:proofErr w:type="gramStart"/>
-      <w:r>
-        <w:t>Taken</w:t>
-      </w:r>
-      <w:proofErr w:type="gramEnd"/>
-      <w:r>
-        <w:t xml:space="preserve"> together with the FAERS results, these VAERS findings demonstrate that BERT-based models trained on high-quality human annotations provide more robust and reliable performance across heterogeneous pharmacovigilance datasets. While LLM-derived annotations offer a convenient low-resource alternative, their direct use leads to substantially lower accuracy, particularly in semantically complex categories such as STATUS, LAB, and HX. These results underscore the continued importance of curated human-labeled data for medical NER and highlight the effectiveness of supervised </w:t>
-      </w:r>
-      <w:r>
-        <w:lastRenderedPageBreak/>
-        <w:t>transformer models for large-scale safety narrative processing in real-world biomedical applications.</w:t>
+      <w:r>
+        <w:t>Taken together with the FAERS results, these VAERS findings demonstrate that BERT-based models trained on high-quality human annotations provide more robust and reliable performance across heterogeneous pharmacovigilance datasets. While LLM-derived annotations offer a convenient low-resource alternative, their direct use leads to substantially lower accuracy, particularly in semantically complex categories such as STATUS, LAB, and HX. These results underscore the continued importance of curated human-labeled data for medical NER and highlight the effectiveness of supervised transformer models for large-scale safety narrative processing in real-world biomedical applications.</w:t>
       </w:r>
     </w:p>
     <w:p>
@@ -11197,15 +10733,7 @@
         <w:t xml:space="preserve">a </w:t>
       </w:r>
       <w:r>
-        <w:t xml:space="preserve">stringent evaluation framework. Because the metric requires exact agreement in both span boundaries and fine-grained labels, it penalizes minor boundary differences and ambiguities between closely related categories (e.g., AE vs. diagnosis vs. medical history). As a result, the observed F1-scores likely underestimate the models’ ability to identify clinically relevant </w:t>
-      </w:r>
-      <w:proofErr w:type="gramStart"/>
-      <w:r>
-        <w:t>concepts, and</w:t>
-      </w:r>
-      <w:proofErr w:type="gramEnd"/>
-      <w:r>
-        <w:t xml:space="preserve"> should be understood as reflecting task complexity and strict evaluation criteria rather than limited practical utility.</w:t>
+        <w:t>stringent evaluation framework. Because the metric requires exact agreement in both span boundaries and fine-grained labels, it penalizes minor boundary differences and ambiguities between closely related categories (e.g., AE vs. diagnosis vs. medical history). As a result, the observed F1-scores likely underestimate the models’ ability to identify clinically relevant concepts, and should be understood as reflecting task complexity and strict evaluation criteria rather than limited practical utility.</w:t>
       </w:r>
     </w:p>
     <w:p>
@@ -11220,6 +10748,7 @@
     </w:p>
     <w:p>
       <w:r>
+        <w:lastRenderedPageBreak/>
         <w:t xml:space="preserve">Beyond model comparison, the annotated datasets themselves provide a valuable resource for future research. By spanning both drug and vaccine safety narratives and incorporating harmonized entity definitions, they enable studies on cross-domain generalization, transfer learning, and multi-task modeling. The detailed error characterizations also highlight areas </w:t>
       </w:r>
       <w:proofErr w:type="gramStart"/>
@@ -11266,11 +10795,7 @@
         <w:t xml:space="preserve">a </w:t>
       </w:r>
       <w:r>
-        <w:t>single annotator, with future work planned to incorporate cross-</w:t>
-      </w:r>
-      <w:r>
-        <w:lastRenderedPageBreak/>
-        <w:t>annotator review and adjudication for additional validation and robustness.</w:t>
+        <w:t>single annotator, with future work planned to incorporate cross-annotator review and adjudication for additional validation and robustness.</w:t>
       </w:r>
       <w:r>
         <w:t xml:space="preserve"> </w:t>
@@ -11340,6 +10865,7 @@
         <w:pStyle w:val="Heading1"/>
       </w:pPr>
       <w:r>
+        <w:lastRenderedPageBreak/>
         <w:t>Declarations</w:t>
       </w:r>
     </w:p>
@@ -11403,7 +10929,6 @@
         <w:rPr>
           <w:shd w:val="clear" w:color="auto" w:fill="FFFFFF"/>
         </w:rPr>
-        <w:lastRenderedPageBreak/>
         <w:t>Ethics approval</w:t>
       </w:r>
     </w:p>
@@ -11530,7 +11055,7 @@
         </w:rPr>
         <w:t xml:space="preserve">The annotation prompt and source code for the annotation platform are available at: </w:t>
       </w:r>
-      <w:hyperlink r:id="rId17" w:history="1">
+      <w:hyperlink r:id="rId16" w:history="1">
         <w:r>
           <w:rPr>
             <w:rStyle w:val="Hyperlink"/>
@@ -11638,7 +11163,7 @@
       <w:r>
         <w:t xml:space="preserve">. 2025  [cited 2025 11/24]; Available from: </w:t>
       </w:r>
-      <w:hyperlink r:id="rId18" w:history="1">
+      <w:hyperlink r:id="rId17" w:history="1">
         <w:r>
           <w:rPr>
             <w:rStyle w:val="Hyperlink"/>
@@ -12156,7 +11681,7 @@
 <w:numbering xmlns:wpc="http://schemas.microsoft.com/office/word/2010/wordprocessingCanvas" xmlns:cx="http://schemas.microsoft.com/office/drawing/2014/chartex" xmlns:cx1="http://schemas.microsoft.com/office/drawing/2015/9/8/chartex" xmlns:cx2="http://schemas.microsoft.com/office/drawing/2015/10/21/chartex" xmlns:cx3="http://schemas.microsoft.com/office/drawing/2016/5/9/chartex" xmlns:cx4="http://schemas.microsoft.com/office/drawing/2016/5/10/chartex" xmlns:cx5="http://schemas.microsoft.com/office/drawing/2016/5/11/chartex" xmlns:cx6="http://schemas.microsoft.com/office/drawing/2016/5/12/chartex" xmlns:cx7="http://schemas.microsoft.com/office/drawing/2016/5/13/chartex" xmlns:cx8="http://schemas.microsoft.com/office/drawing/2016/5/14/chartex" xmlns:mc="http://schemas.openxmlformats.org/markup-compatibility/2006" xmlns:aink="http://schemas.microsoft.com/office/drawing/2016/ink" xmlns:am3d="http://schemas.microsoft.com/office/drawing/2017/model3d" xmlns:o="urn:schemas-microsoft-com:office:office" xmlns:oel="http://schemas.microsoft.com/office/2019/extlst" xmlns:r="http://schemas.openxmlformats.org/officeDocument/2006/relationships" xmlns:m="http://schemas.openxmlformats.org/officeDocument/2006/math" xmlns:v="urn:schemas-microsoft-com:vml" xmlns:wp14="http://schemas.microsoft.com/office/word/2010/wordprocessingDrawing" xmlns:wp="http://schemas.openxmlformats.org/drawingml/2006/wordprocessingDrawing" xmlns:w10="urn:schemas-microsoft-com:office:word" xmlns:w="http://schemas.openxmlformats.org/wordprocessingml/2006/main" xmlns:w14="http://schemas.microsoft.com/office/word/2010/wordml" xmlns:w15="http://schemas.microsoft.com/office/word/2012/wordml" xmlns:w16cex="http://schemas.microsoft.com/office/word/2018/wordml/cex" xmlns:w16cid="http://schemas.microsoft.com/office/word/2016/wordml/cid" xmlns:w16="http://schemas.microsoft.com/office/word/2018/wordml" xmlns:w16du="http://schemas.microsoft.com/office/word/2023/wordml/word16du" xmlns:w16sdtdh="http://schemas.microsoft.com/office/word/2020/wordml/sdtdatahash" xmlns:w16sdtfl="http://schemas.microsoft.com/office/word/2024/wordml/sdtformatlock" xmlns:w16se="http://schemas.microsoft.com/office/word/2015/wordml/symex" xmlns:wpg="http://schemas.microsoft.com/office/word/2010/wordprocessingGroup" xmlns:wpi="http://schemas.microsoft.com/office/word/2010/wordprocessingInk" xmlns:wne="http://schemas.microsoft.com/office/word/2006/wordml" xmlns:wps="http://schemas.microsoft.com/office/word/2010/wordprocessingShape" mc:Ignorable="w14 w15 w16se w16cid w16 w16cex w16sdtdh w16sdtfl w16du wp14">
   <w:numPicBullet w:numPicBulletId="0">
     <w:pict>
-      <v:rect id="_x0000_i1042" style="width:0;height:1.5pt" o:hralign="center" o:bullet="t" o:hrstd="t" o:hr="t" fillcolor="#a0a0a0" stroked="f"/>
+      <v:rect id="_x0000_i1025" style="width:0;height:1.5pt" o:hralign="center" o:bullet="t" o:hrstd="t" o:hr="t" fillcolor="#a0a0a0" stroked="f"/>
     </w:pict>
   </w:numPicBullet>
   <w:abstractNum w:abstractNumId="0" w15:restartNumberingAfterBreak="0">

</xml_diff>

<commit_message>
feat(figure6): update Figure 6 and Section 3.5 to full VAERS corpus (N=1,000 reports) with consensus model
</commit_message>
<xml_diff>
--- a/publication/manuscripts/LLM4AE_rev1_clean_updated.docx
+++ b/publication/manuscripts/LLM4AE_rev1_clean_updated.docx
@@ -5464,7 +5464,7 @@
         </w:rPr>
         <w:lastRenderedPageBreak/>
         <w:drawing>
-          <wp:inline distT="0" distB="0" distL="0" distR="0" wp14:anchorId="229BBBF4" wp14:editId="3827B76F">
+          <wp:inline distT="0" distB="0" distL="0" distR="0" wp14:anchorId="229BBBF4" wp14:editId="47D36EA2">
             <wp:extent cx="5932170" cy="4008120"/>
             <wp:effectExtent l="0" t="0" r="0" b="0"/>
             <wp:docPr id="1843461867" name="Picture 2"/>
@@ -6245,7 +6245,7 @@
           <w:noProof/>
         </w:rPr>
         <w:drawing>
-          <wp:inline distT="0" distB="0" distL="0" distR="0" wp14:anchorId="2A31942A" wp14:editId="436FEEC4">
+          <wp:inline distT="0" distB="0" distL="0" distR="0" wp14:anchorId="2A31942A" wp14:editId="208C778F">
             <wp:extent cx="5937885" cy="2573020"/>
             <wp:effectExtent l="0" t="0" r="5715" b="0"/>
             <wp:docPr id="1721116522" name="Picture 2"/>
@@ -6329,27 +6329,297 @@
     </w:p>
     <w:p>
       <w:r>
-        <w:t>Next, we conducted a detailed error analysis on the complete FAERS benchmark corpus (N = 829 reports) to characterize how the supervised BERT model and the few-shot LLM differ in their failure modes. Using character-level span alignment between model predictions and curated reference annotations across all 17 clinical concept categories, each predicted entity was categorized as an exact match (M), coverage error (C, overlapping a reference span but with mismatched start/end boundaries or a conflated category label), or spurious prediction / hallucination (S, non-overlapping span with no corresponding reference entity). Unpredicted reference entities were counted as misses (N).</w:t>
+        <w:t xml:space="preserve">Next, we conducted a detailed error analysis on the FAERS </w:t>
+      </w:r>
+      <w:r>
+        <w:rPr>
+          <w:rFonts w:hint="eastAsia"/>
+          <w:lang w:eastAsia="zh-CN"/>
+        </w:rPr>
+        <w:t>dataset</w:t>
+      </w:r>
+      <w:r>
+        <w:t xml:space="preserve"> to characterize how the BERT and the LLM differ in their failure modes. </w:t>
+      </w:r>
+      <w:r>
+        <w:rPr>
+          <w:b/>
+          <w:bCs/>
+        </w:rPr>
+        <w:t>Figure 5a</w:t>
+      </w:r>
+      <w:r>
+        <w:t xml:space="preserve"> shows that BERT produces more exact matches</w:t>
+      </w:r>
+      <w:r>
+        <w:rPr>
+          <w:rFonts w:hint="eastAsia"/>
+          <w:lang w:eastAsia="zh-CN"/>
+        </w:rPr>
+        <w:t>,</w:t>
+      </w:r>
+      <w:r>
+        <w:t xml:space="preserve"> and fewer conflation and </w:t>
+      </w:r>
+      <w:r>
+        <w:rPr>
+          <w:rFonts w:hint="eastAsia"/>
+          <w:lang w:eastAsia="zh-CN"/>
+        </w:rPr>
+        <w:t>spurious</w:t>
+      </w:r>
+      <w:r>
+        <w:t xml:space="preserve"> errors than the LLM. For BERT, 58.0% of spans are exact matches (26,891), compared with 31.6% (17,396) for the LLM. The LLM, in contrast, exhibits more than double the proportion of coverage errors (29.7% vs 14.0%; 16,358 vs 6,485 spans). The LLM also produces significantly more spurious spans (25.7% vs 15.5%; 14,185 vs 7,195), reflecting </w:t>
+      </w:r>
+      <w:r>
+        <w:rPr>
+          <w:rFonts w:hint="eastAsia"/>
+          <w:lang w:eastAsia="zh-CN"/>
+        </w:rPr>
+        <w:t>non-overlapped</w:t>
+      </w:r>
+      <w:r>
+        <w:t xml:space="preserve"> entities </w:t>
+      </w:r>
+      <w:r>
+        <w:rPr>
+          <w:rFonts w:hint="eastAsia"/>
+          <w:lang w:eastAsia="zh-CN"/>
+        </w:rPr>
+        <w:t>reported by human SME</w:t>
+      </w:r>
+      <w:r>
+        <w:t xml:space="preserve">. Missed spans (N) show comparable proportions between both paradigms (13.0% vs 12.5%; 7,156 vs 5,793 spans), which is consistent with the recall patterns observed in </w:t>
+      </w:r>
+      <w:r>
+        <w:rPr>
+          <w:b/>
+          <w:bCs/>
+        </w:rPr>
+        <w:t>Figure 4</w:t>
+      </w:r>
+      <w:r>
+        <w:t>, while the much larger excess of coverage and spurious errors for the LLM reflects its tendency to over-segment entities rather than leaving spans unannotated.</w:t>
       </w:r>
     </w:p>
     <w:p>
       <w:r>
-        <w:t>Figure 5a shows that BERT produces substantially more exact matches and fewer boundary, conflation, and hallucination errors than the LLM across the full FAERS benchmark corpus (N = 829 reports). For BERT, 58.0% of spans are exact matches (26,891), compared with 31.6% (17,396) for the LLM. The LLM, in contrast, exhibits more than double the proportion of coverage errors (29.7% vs 14.0%; 16,358 vs 6,485 spans), where a predicted span overlaps the reference span but has inaccurate boundaries or conflated labels. The LLM also produces significantly more spurious spans (25.7% vs 15.5%; 14,185 vs 7,195), reflecting hallucinated entities or over-segmentation. Missed spans (N) show comparable proportions between both paradigms (13.0% vs 12.5%; 7,156 vs 5,793 spans), which is consistent with the recall patterns observed in Figure 4, while the much larger excess of coverage and spurious errors for the LLM reflects its tendency to over-segment or hallucinate entities rather than leaving spans unannotated.</w:t>
+        <w:t>The top confusion pairs for both systems (Figure 5b and 5c) demonstrate that errors cluster within clinically related concept types rather than dispersing randomly. For BERT, misclassifications primarily involve context-dependent clinical boundaries, notably medical history conflated with therapeutic indications (MHx → Indication: 345), adverse events confused with laboratory findings (AE → Lab: 191), and bidirectional medical history versus AE boundary ambiguities (MHx → AE: 172; AE → MHx: 168), typically occurring when chronic comorbidities and acute symptoms are documented within the same sentence. For the LLM, the single largest error mode is the misclassification of concomitant medications as primary suspect drugs (cDrug → sDrug: 2,737), followed by treatment interventions labeled as suspect drugs (Treatment → sDrug: 847). Additional prominent LLM confusions include medical history categorized as current diagnoses (MHx → Dx: 364) or adverse events (MHx → AE: 342), laboratory values labeled as dosages (Lab → Dose: 328), and laboratory findings classified as adverse events (Lab → AE: 230). While BERT errors are concentrated in a tight set of adjacent clinical categories, the LLM exhibits widespread role conflation across pharmacological and historical categories.</w:t>
       </w:r>
     </w:p>
     <w:p>
       <w:r>
-        <w:t>The top confusion pairs for both systems (Figure 5b and 5c) demonstrate that errors cluster within clinically related concept types rather than dispersing randomly. For BERT, misclassifications primarily involve context-dependent clinical boundaries, notably medical history conflated with therapeutic indications (MHx → Indication: 345), adverse events confused with laboratory findings (AE → Lab: 191), and bidirectional medical history versus AE boundary ambiguities (MHx → AE: 172; AE → MHx: 168), typically occurring when chronic comorbidities and acute symptoms are documented within the same sentence. For the LLM, the single largest error mode is the misclassification of concomitant medications as primary suspect drugs (cDrug → sDrug: 2,737), followed by treatment interventions labeled as suspect drugs (Treatment → sDrug: 847). Additional prominent LLM confusions include medical history categorized as current diagnoses (MHx → Dx: 364) or adverse events (MHx → AE: 342), laboratory values labeled as dosages (Lab → Dose: 328), and laboratory findings classified as adverse events (Lab → AE: 230). While BERT errors are concentrated in a tight set of adjacent clinical categories, the LLM exhibits widespread role conflation across pharmacological and historical categories.</w:t>
+        <w:t>For the LLM, the single largest error mode is the misclassification of concomitant medications as primary suspect drugs (</w:t>
+      </w:r>
+      <w:proofErr w:type="spellStart"/>
+      <w:r>
+        <w:t>cDrug</w:t>
+      </w:r>
+      <w:proofErr w:type="spellEnd"/>
+      <w:r>
+        <w:t xml:space="preserve"> </w:t>
+      </w:r>
+      <w:r>
+        <w:rPr>
+          <w:rFonts w:hint="eastAsia"/>
+          <w:lang w:eastAsia="zh-CN"/>
+        </w:rPr>
+        <w:t>to</w:t>
+      </w:r>
+      <w:r>
+        <w:t xml:space="preserve"> </w:t>
+      </w:r>
+      <w:proofErr w:type="spellStart"/>
+      <w:r>
+        <w:t>sDrug</w:t>
+      </w:r>
+      <w:proofErr w:type="spellEnd"/>
+      <w:r>
+        <w:t xml:space="preserve">: 2,737), followed by treatment interventions labeled as suspect drugs (Treatment </w:t>
+      </w:r>
+      <w:r>
+        <w:rPr>
+          <w:rFonts w:hint="eastAsia"/>
+          <w:lang w:eastAsia="zh-CN"/>
+        </w:rPr>
+        <w:t>to</w:t>
+      </w:r>
+      <w:r>
+        <w:t xml:space="preserve"> sDrug: 847). Additional prominent LLM confusions include medical history categorized as current diagnoses (MHx </w:t>
+      </w:r>
+      <w:r>
+        <w:rPr>
+          <w:rFonts w:hint="eastAsia"/>
+          <w:lang w:eastAsia="zh-CN"/>
+        </w:rPr>
+        <w:t>to</w:t>
+      </w:r>
+      <w:r>
+        <w:t xml:space="preserve"> Dx: 364) or adverse events (MHx </w:t>
+      </w:r>
+      <w:r>
+        <w:rPr>
+          <w:rFonts w:hint="eastAsia"/>
+          <w:lang w:eastAsia="zh-CN"/>
+        </w:rPr>
+        <w:t>to</w:t>
+      </w:r>
+      <w:r>
+        <w:t xml:space="preserve"> AE: 342), laboratory values labeled as dosages (Lab </w:t>
+      </w:r>
+      <w:r>
+        <w:rPr>
+          <w:rFonts w:hint="eastAsia"/>
+          <w:lang w:eastAsia="zh-CN"/>
+        </w:rPr>
+        <w:t>to</w:t>
+      </w:r>
+      <w:r>
+        <w:t xml:space="preserve"> Dose: 328), and laboratory findings classified as adverse events (Lab </w:t>
+      </w:r>
+      <w:r>
+        <w:rPr>
+          <w:rFonts w:hint="eastAsia"/>
+          <w:lang w:eastAsia="zh-CN"/>
+        </w:rPr>
+        <w:t>to</w:t>
+      </w:r>
+      <w:r>
+        <w:t xml:space="preserve"> AE: 230). While BERT errors are concentrated in a tight set of adjacent clinical categories, the LLM exhibits widespread role conflation across pharmacological and historical categories.</w:t>
       </w:r>
     </w:p>
     <w:p>
       <w:r>
-        <w:t>We applied word-cloud visualizations on the primary LLM misclassification categories to clarify these failure modes at the entity level. For concomitant and treatment spans misclassified as suspect drug (sDrug) by the LLM (Figure 5d), the most prominent tokens were common co-administered medications and supportive therapies, including methylprednisolone, methotrexate, prednisone, esomeprazole, folic acid, and dexamethasone. When multiple therapeutic agents appeared in complex clinical narratives, the few-shot LLM frequently assigned the primary sDrug label indiscriminately across all mentioned medications rather than recognizing their secondary concomitant or supportive roles. In contrast, clinical spans exhibiting medical history and diagnosis/AE confusions (Figure 5e) were dominated by prevalent chronic conditions and comorbidities, such as hypertension, myelodysplastic syndrome, pneumonia, rheumatoid arthritis, osteoporosis, and recurrent infections. This reflects a systematic tendency of the LLM to conflate chronological baseline disease history with active acute adverse event episodes.</w:t>
+        <w:t>We applied word-cloud visualizations on the primary LLM misclassification categories to clarify these failure modes at the entity level. For concomitant and treatment spans misclassified as suspect drug (sDrug) by the LLM (</w:t>
+      </w:r>
+      <w:r>
+        <w:rPr>
+          <w:b/>
+          <w:bCs/>
+        </w:rPr>
+        <w:t>Figure 5d</w:t>
+      </w:r>
+      <w:r>
+        <w:t>), the most prominent tokens were common co-administered medications and supportive therapies, including methylprednisolone, methotrexate, prednisone, esomeprazole, folic acid, and dexamethasone. In contrast, clinical spans exhibiting medical history and diagnosis/AE confusions (</w:t>
+      </w:r>
+      <w:r>
+        <w:rPr>
+          <w:b/>
+          <w:bCs/>
+        </w:rPr>
+        <w:t>Figure 5e</w:t>
+      </w:r>
+      <w:r>
+        <w:t>) were dominated by prevalent chronic conditions and comorbidities, such as hypertension, myelodysplastic syndrome, pneumonia, rheumatoid arthritis, osteoporosis, and recurrent infections.</w:t>
       </w:r>
     </w:p>
     <w:p>
-      <w:r>
-        <w:t>Overall, the few-shot LLM annotations are prone to spurious span hallucinations, boundary drift, and broad drug role conflation (cDrug/Treatment → sDrug), which substantially depresses precision and necessitates extensive post-processing for downstream pharmacovigilance pipelines. Supervised BERT models, while strictly preserving schema conformity and entity boundaries, require targeted contextual features to resolve fine-grained distinctions between baseline medical history, therapeutic indications, and acute adverse event manifestations.</w:t>
+      <w:pPr>
+        <w:rPr>
+          <w:rFonts w:hint="eastAsia"/>
+          <w:lang w:eastAsia="zh-CN"/>
+        </w:rPr>
+      </w:pPr>
+      <w:r>
+        <w:lastRenderedPageBreak/>
+        <w:t xml:space="preserve">Overall, the few-shot LLM annotations are prone to spurious </w:t>
+      </w:r>
+      <w:r>
+        <w:rPr>
+          <w:rFonts w:hint="eastAsia"/>
+          <w:lang w:eastAsia="zh-CN"/>
+        </w:rPr>
+        <w:t>predictions</w:t>
+      </w:r>
+      <w:r>
+        <w:t>, boundary drift, and drug role conflation (</w:t>
+      </w:r>
+      <w:proofErr w:type="spellStart"/>
+      <w:r>
+        <w:t>cDrug</w:t>
+      </w:r>
+      <w:proofErr w:type="spellEnd"/>
+      <w:r>
+        <w:t xml:space="preserve">/Treatment → </w:t>
+      </w:r>
+      <w:proofErr w:type="spellStart"/>
+      <w:r>
+        <w:t>sDrug</w:t>
+      </w:r>
+      <w:proofErr w:type="spellEnd"/>
+      <w:r>
+        <w:t xml:space="preserve">). </w:t>
+      </w:r>
+      <w:r>
+        <w:rPr>
+          <w:rFonts w:hint="eastAsia"/>
+          <w:lang w:eastAsia="zh-CN"/>
+        </w:rPr>
+        <w:t xml:space="preserve">However, LLM is better to annotate uncommon categories like </w:t>
+      </w:r>
+      <w:proofErr w:type="spellStart"/>
+      <w:r>
+        <w:rPr>
+          <w:rFonts w:hint="eastAsia"/>
+          <w:lang w:eastAsia="zh-CN"/>
+        </w:rPr>
+        <w:t>oDrug</w:t>
+      </w:r>
+      <w:proofErr w:type="spellEnd"/>
+      <w:r>
+        <w:rPr>
+          <w:rFonts w:hint="eastAsia"/>
+          <w:lang w:eastAsia="zh-CN"/>
+        </w:rPr>
+        <w:t xml:space="preserve">, </w:t>
+      </w:r>
+      <w:proofErr w:type="spellStart"/>
+      <w:r>
+        <w:rPr>
+          <w:rFonts w:hint="eastAsia"/>
+          <w:lang w:eastAsia="zh-CN"/>
+        </w:rPr>
+        <w:t>mAE</w:t>
+      </w:r>
+      <w:proofErr w:type="spellEnd"/>
+      <w:r>
+        <w:rPr>
+          <w:rFonts w:hint="eastAsia"/>
+          <w:lang w:eastAsia="zh-CN"/>
+        </w:rPr>
+        <w:t xml:space="preserve">, RO and </w:t>
+      </w:r>
+      <w:proofErr w:type="spellStart"/>
+      <w:r>
+        <w:rPr>
+          <w:rFonts w:hint="eastAsia"/>
+          <w:lang w:eastAsia="zh-CN"/>
+        </w:rPr>
+        <w:t>CoD</w:t>
+      </w:r>
+      <w:proofErr w:type="spellEnd"/>
+      <w:r>
+        <w:rPr>
+          <w:rFonts w:hint="eastAsia"/>
+          <w:lang w:eastAsia="zh-CN"/>
+        </w:rPr>
+        <w:t xml:space="preserve"> by conflation through inaccurate boundary or mislabeled category, therefore retrieved higher adapted ADE-Eval F1 in these uncommon categories (</w:t>
+      </w:r>
+      <w:r>
+        <w:rPr>
+          <w:rFonts w:hint="eastAsia"/>
+          <w:b/>
+          <w:bCs/>
+          <w:lang w:eastAsia="zh-CN"/>
+        </w:rPr>
+        <w:t>Figure 4</w:t>
+      </w:r>
+      <w:r>
+        <w:rPr>
+          <w:rFonts w:hint="eastAsia"/>
+          <w:lang w:eastAsia="zh-CN"/>
+        </w:rPr>
+        <w:t xml:space="preserve">). </w:t>
       </w:r>
     </w:p>
     <w:p/>
@@ -6362,7 +6632,7 @@
           <w:noProof/>
         </w:rPr>
         <w:drawing>
-          <wp:inline distT="0" distB="0" distL="0" distR="0" wp14:anchorId="5210EEBB" wp14:editId="163E92B8">
+          <wp:inline distT="0" distB="0" distL="0" distR="0" wp14:anchorId="5210EEBB" wp14:editId="3ACB33BC">
             <wp:extent cx="5943600" cy="5033010"/>
             <wp:effectExtent l="0" t="0" r="0" b="0"/>
             <wp:docPr id="1005109684" name="Picture 3"/>
@@ -6415,8 +6685,8 @@
       <w:pPr>
         <w:spacing w:line="240" w:lineRule="auto"/>
         <w:rPr>
-          <w:sz w:val="20"/>
-          <w:szCs w:val="20"/>
+          <w:sz w:val="16"/>
+          <w:szCs w:val="16"/>
         </w:rPr>
       </w:pPr>
       <w:r>
@@ -6433,6 +6703,7 @@
         <w:pStyle w:val="Heading2"/>
       </w:pPr>
       <w:r>
+        <w:lastRenderedPageBreak/>
         <w:t>3.5 VAER</w:t>
       </w:r>
       <w:r>
@@ -6447,15 +6718,77 @@
     </w:p>
     <w:p>
       <w:r>
-        <w:t>To evaluate cross-domain generalization beyond drug-related ICSRs, we benchmarked the systems on the public VAERS vaccine adverse event corpus (N = 1,000 narratives). As reported in Table 4 and Figure 6, BioBERT fine-tuned via 10-fold cross-validation achieved a strict exact-match F1 of 0.6594 ± 0.0196 (0.7848 ± 0.0127 Adapted F1). In contrast, the zero-shot/1-shot LLaMA 4 baseline achieved a strict F1 of 0.2364 and adapted F1 of 0.4766. Category-level analysis (Figure 6a) confirmed strong supervised encoder advantages across treatments (TX: 0.74 vs 0.54), vaccines (VAX: 0.72 vs 0.63), diagnoses (DX: 0.52 vs 0.35), patient status (STATUS: 0.59 vs 0.04), symptoms (SYM: 0.43 vs 0.16), and laboratory findings (LAB: 0.44 vs 0.10). Error anatomy (Figure 6b–d) revealed that LLM errors on VAERS were driven by high spurious entity predictions (29.1% vs 5.2% for BERT) and prominent SYM ↔ DX and RO misclassifications.</w:t>
+        <w:t xml:space="preserve">To evaluate cross-domain generalization beyond </w:t>
+      </w:r>
+      <w:r>
+        <w:rPr>
+          <w:rFonts w:hint="eastAsia"/>
+          <w:lang w:eastAsia="zh-CN"/>
+        </w:rPr>
+        <w:t>FAERS dataset</w:t>
+      </w:r>
+      <w:r>
+        <w:t xml:space="preserve">, we </w:t>
+      </w:r>
+      <w:r>
+        <w:rPr>
+          <w:rFonts w:hint="eastAsia"/>
+          <w:lang w:eastAsia="zh-CN"/>
+        </w:rPr>
+        <w:t xml:space="preserve">further </w:t>
+      </w:r>
+      <w:proofErr w:type="gramStart"/>
+      <w:r>
+        <w:rPr>
+          <w:rFonts w:hint="eastAsia"/>
+          <w:lang w:eastAsia="zh-CN"/>
+        </w:rPr>
+        <w:t xml:space="preserve">analyzed </w:t>
+      </w:r>
+      <w:r>
+        <w:t xml:space="preserve"> the</w:t>
+      </w:r>
+      <w:proofErr w:type="gramEnd"/>
+      <w:r>
+        <w:t xml:space="preserve"> public VAERS corpus (N = 1,000 narratives). As reported in </w:t>
+      </w:r>
+      <w:r>
+        <w:rPr>
+          <w:b/>
+          <w:bCs/>
+        </w:rPr>
+        <w:t>Table 4</w:t>
+      </w:r>
+      <w:r>
+        <w:t xml:space="preserve">, BioBERT fine-tuned via 10-fold cross-validation achieved a strict exact-match F1 of 0.6594 (0.7848 Adapted </w:t>
+      </w:r>
+      <w:r>
+        <w:rPr>
+          <w:rFonts w:hint="eastAsia"/>
+          <w:lang w:eastAsia="zh-CN"/>
+        </w:rPr>
+        <w:t xml:space="preserve">ADE-Eval </w:t>
+      </w:r>
+      <w:r>
+        <w:t xml:space="preserve">F1). In contrast, the zero-shot/1-shot LLaMA 4 baseline achieved a strict F1 of 0.2364 and adapted </w:t>
+      </w:r>
+      <w:r>
+        <w:rPr>
+          <w:rFonts w:hint="eastAsia"/>
+          <w:lang w:eastAsia="zh-CN"/>
+        </w:rPr>
+        <w:t xml:space="preserve">ADE-Eval </w:t>
+      </w:r>
+      <w:r>
+        <w:t xml:space="preserve">F1 of 0.4766. </w:t>
       </w:r>
     </w:p>
     <w:p/>
     <w:p>
       <w:pPr>
         <w:rPr>
-          <w:sz w:val="20"/>
-          <w:szCs w:val="20"/>
+          <w:sz w:val="16"/>
+          <w:szCs w:val="16"/>
         </w:rPr>
       </w:pPr>
       <w:r>
@@ -6752,27 +7085,7 @@
     <w:p/>
     <w:p>
       <w:r>
-        <w:t>Category-level analysis (</w:t>
-      </w:r>
-      <w:r>
-        <w:rPr>
-          <w:b/>
-          <w:bCs/>
-        </w:rPr>
-        <w:t>Figure 6a</w:t>
-      </w:r>
-      <w:r>
-        <w:t>) confirmed strong supervised encoder advantages across treatments (TX: 0.74 vs 0.54), vaccines (VAX: 0.72 vs 0.63), diagnoses (DX: 0.52 vs 0.35), patient status (STATUS: 0.59 vs 0.04), symptoms (SYM: 0.43 vs 0.16), and laboratory findings (LAB: 0.44 vs 0.10). Error anatomy (</w:t>
-      </w:r>
-      <w:r>
-        <w:rPr>
-          <w:b/>
-          <w:bCs/>
-        </w:rPr>
-        <w:t>Figure 6b–d</w:t>
-      </w:r>
-      <w:r>
-        <w:t>) revealed that LLM errors on VAERS were driven by high spurious entity predictions (29.1% vs 5.2% for BERT) and prominent SYM ↔ DX and RO misclassifications.</w:t>
+        <w:t>Category-level analysis (Figure 6a) confirmed strong supervised encoder advantages across treatments (TX: 0.79 vs 0.54), vaccines (VAX: 0.77 vs 0.65), patient status (STATUS: 0.67 vs 0.04), laboratory findings (LAB: 0.51 vs 0.11), medical history (HX: 0.50 vs 0.22), diagnoses (DX: 0.49 vs 0.29), symptoms (SYM: 0.46 vs 0.15), and rule-out expressions (RO: 0.23 vs 0.10), yielding an overall exact-match F1 of 0.56 vs 0.30. Error anatomy (Figure 6b–d) on the complete VAERS corpus (N = 1,000 reports) revealed that BERT achieved more than double the proportion of exact matches (42.2% vs 19.6%; 20,892 vs 10,938 spans), while LLM errors were driven by high spurious hallucinations (27.2% vs 17.9%; 15,174 vs 8,842 spans) and extensive misses (41.4% vs 30.8%; 23,123 vs 15,230 spans). Confusion breakdowns demonstrated that both paradigms exhibited prominent SYM ↔ DX boundary and conceptual conflations (SYM → DX: 3,988 for BERT; DX → SYM: 4,213 and SYM → DX: 4,211 for LLM).</w:t>
       </w:r>
     </w:p>
     <w:p/>
@@ -6783,7 +7096,7 @@
         </w:rPr>
         <w:lastRenderedPageBreak/>
         <w:drawing>
-          <wp:inline distT="0" distB="0" distL="0" distR="0" wp14:anchorId="7F29C378" wp14:editId="29ABFF15">
+          <wp:inline distT="0" distB="0" distL="0" distR="0" wp14:anchorId="7F29C378" wp14:editId="5FB8420F">
             <wp:extent cx="5932170" cy="4251960"/>
             <wp:effectExtent l="0" t="0" r="0" b="0"/>
             <wp:docPr id="33667654" name="Picture 4"/>
@@ -6840,7 +7153,7 @@
         </w:rPr>
       </w:pPr>
       <w:r>
-        <w:t>Figure 6. Cross-Domain Annotation Benchmark and Error Anatomy on the VAERS Vaccine Dataset. (a) Per-category performance across all 8 VAERS entity classes and overall micro-average for BERT (Blue) vs. LLM (Pink-Coral), showing F1 bars and precision/recall trajectories. (b) M/C/S/N error distribution for BERT vs. LLM on VAERS test narratives. (c) BERT top label misclassifications (X-axis: 0–660). (d) LLM top label misclassifications (X-axis: 0–660, aligned with panel c).</w:t>
+        <w:t>Figure 6. Cross-Domain Annotation Benchmark and Error Anatomy on the Full VAERS Vaccine Safety Corpus (N = 1,000 Reports). (a) Per-category performance across all 8 VAERS entity classes and overall micro-average for BERT (Blue) vs. LLM (Pink-Coral), showing F1 bars and precision/recall trajectories. (b) M/C/S/N error distribution for BERT vs. LLM across the complete corpus. (c) BERT top label misclassifications (X-axis: 0–4,600). (d) LLM top label misclassifications (X-axis: 0–4,600, aligned with panel c).</w:t>
       </w:r>
     </w:p>
     <w:p/>

</xml_diff>

<commit_message>
feat(figure6): update Figure 6 and Section 3.5 to the full 14-category VAERS schema
</commit_message>
<xml_diff>
--- a/publication/manuscripts/LLM4AE_rev1_clean_updated.docx
+++ b/publication/manuscripts/LLM4AE_rev1_clean_updated.docx
@@ -7085,7 +7085,7 @@
     <w:p/>
     <w:p>
       <w:r>
-        <w:t>Category-level analysis (Figure 6a) confirmed strong supervised encoder advantages across treatments (TX: 0.79 vs 0.54), vaccines (VAX: 0.77 vs 0.65), patient status (STATUS: 0.67 vs 0.04), laboratory findings (LAB: 0.51 vs 0.11), medical history (HX: 0.50 vs 0.22), diagnoses (DX: 0.49 vs 0.29), symptoms (SYM: 0.46 vs 0.15), and rule-out expressions (RO: 0.23 vs 0.10), yielding an overall exact-match F1 of 0.56 vs 0.30. Error anatomy (Figure 6b–d) on the complete VAERS corpus (N = 1,000 reports) revealed that BERT achieved more than double the proportion of exact matches (42.2% vs 19.6%; 20,892 vs 10,938 spans), while LLM errors were driven by high spurious hallucinations (27.2% vs 17.9%; 15,174 vs 8,842 spans) and extensive misses (41.4% vs 30.8%; 23,123 vs 15,230 spans). Confusion breakdowns demonstrated that both paradigms exhibited prominent SYM ↔ DX boundary and conceptual conflations (SYM → DX: 3,988 for BERT; DX → SYM: 4,213 and SYM → DX: 4,211 for LLM).</w:t>
+        <w:t>Category-level analysis (Figure 6a) across all 14 clinical and contextual concept categories confirmed strong supervised encoder advantages across vaccines (VAX: 0.86 vs 0.60), treatments (Tx: 0.84 vs 0.40), patient status (STATUS: 0.71 vs 0.30), medical history (MHx: 0.75 vs 0.24), confirmed adverse event diagnoses (sDx: 0.69 vs 0.08), provisional diagnoses (pDx: 0.62 vs 0.07), symptoms (SYM: 0.63 vs 0.22), laboratory findings (Lab: 0.59 vs 0.16), and family history (FHx: 0.35 vs 0.10). Error anatomy (Figure 6b–d) on the complete VAERS corpus (N = 1,000 reports) revealed that BioBERT achieved a high proportion of exact matches (57.7% vs 13.7%; 15,068 vs 10,154 spans), while LLM few-shot predictions suffered from high spurious hallucinations (45.2% vs 18.6%; 33,421 vs 4,846 spans) and extensive missed entities (30.7% vs 17.1%; 22,711 vs 4,459 spans). Confusion breakdowns (Figure 6c &amp; 6d) demonstrated that both models experienced diagnostic granularity conflations (sDx → DX: 4,902 for BERT, 3,116 for LLM; and SYM → DX: 2,782 for BERT, 2,999 for LLM).</w:t>
       </w:r>
     </w:p>
     <w:p/>
@@ -7153,7 +7153,7 @@
         </w:rPr>
       </w:pPr>
       <w:r>
-        <w:t>Figure 6. Cross-Domain Annotation Benchmark and Error Anatomy on the Full VAERS Vaccine Safety Corpus (N = 1,000 Reports). (a) Per-category performance across all 8 VAERS entity classes and overall micro-average for BERT (Blue) vs. LLM (Pink-Coral), showing F1 bars and precision/recall trajectories. (b) M/C/S/N error distribution for BERT vs. LLM across the complete corpus. (c) BERT top label misclassifications (X-axis: 0–4,600). (d) LLM top label misclassifications (X-axis: 0–4,600, aligned with panel c).</w:t>
+        <w:t>Figure 6. Cross-Domain Annotation Benchmark and Error Anatomy on the Full VAERS Vaccine Safety Corpus Across 14 Concept Categories (N = 1,000 Reports). (a) Per-category performance across all 14 clinical and contextual concept categories and overall micro-average for BioBERT (Blue) vs. LLaMA 4 (Pink-Coral), showing F1 bars and precision/recall trajectories. (b) M/C/S/N error distribution for BioBERT vs. LLaMA 4 across the complete corpus. (c) BioBERT top label misclassifications (X-axis: 0–5,400). (d) LLaMA 4 top label misclassifications (X-axis: 0–5,400, aligned with panel c).</w:t>
       </w:r>
     </w:p>
     <w:p/>

</xml_diff>

<commit_message>
feat(vaers): update manuscript text, Figure 6, and benchmark tables with new 11-category VAERS results
</commit_message>
<xml_diff>
--- a/publication/manuscripts/LLM4AE_rev1_clean_updated.docx
+++ b/publication/manuscripts/LLM4AE_rev1_clean_updated.docx
@@ -6718,69 +6718,7 @@
     </w:p>
     <w:p>
       <w:r>
-        <w:t xml:space="preserve">To evaluate cross-domain generalization beyond </w:t>
-      </w:r>
-      <w:r>
-        <w:rPr>
-          <w:rFonts w:hint="eastAsia"/>
-          <w:lang w:eastAsia="zh-CN"/>
-        </w:rPr>
-        <w:t>FAERS dataset</w:t>
-      </w:r>
-      <w:r>
-        <w:t xml:space="preserve">, we </w:t>
-      </w:r>
-      <w:r>
-        <w:rPr>
-          <w:rFonts w:hint="eastAsia"/>
-          <w:lang w:eastAsia="zh-CN"/>
-        </w:rPr>
-        <w:t xml:space="preserve">further </w:t>
-      </w:r>
-      <w:proofErr w:type="gramStart"/>
-      <w:r>
-        <w:rPr>
-          <w:rFonts w:hint="eastAsia"/>
-          <w:lang w:eastAsia="zh-CN"/>
-        </w:rPr>
-        <w:t xml:space="preserve">analyzed </w:t>
-      </w:r>
-      <w:r>
-        <w:t xml:space="preserve"> the</w:t>
-      </w:r>
-      <w:proofErr w:type="gramEnd"/>
-      <w:r>
-        <w:t xml:space="preserve"> public VAERS corpus (N = 1,000 narratives). As reported in </w:t>
-      </w:r>
-      <w:r>
-        <w:rPr>
-          <w:b/>
-          <w:bCs/>
-        </w:rPr>
-        <w:t>Table 4</w:t>
-      </w:r>
-      <w:r>
-        <w:t xml:space="preserve">, BioBERT fine-tuned via 10-fold cross-validation achieved a strict exact-match F1 of 0.6594 (0.7848 Adapted </w:t>
-      </w:r>
-      <w:r>
-        <w:rPr>
-          <w:rFonts w:hint="eastAsia"/>
-          <w:lang w:eastAsia="zh-CN"/>
-        </w:rPr>
-        <w:t xml:space="preserve">ADE-Eval </w:t>
-      </w:r>
-      <w:r>
-        <w:t xml:space="preserve">F1). In contrast, the zero-shot/1-shot LLaMA 4 baseline achieved a strict F1 of 0.2364 and adapted </w:t>
-      </w:r>
-      <w:r>
-        <w:rPr>
-          <w:rFonts w:hint="eastAsia"/>
-          <w:lang w:eastAsia="zh-CN"/>
-        </w:rPr>
-        <w:t xml:space="preserve">ADE-Eval </w:t>
-      </w:r>
-      <w:r>
-        <w:t xml:space="preserve">F1 of 0.4766. </w:t>
+        <w:t>To evaluate cross-domain generalization beyond the FAERS dataset, we further analyzed the public VAERS corpus (N = 1,000 narratives). As reported in Table 4, BioBERT fine-tuned via 10-fold cross-validation achieved a strict exact-match F1 of 0.6594 ± 0.0196 (0.7848 ± 0.0127 Adapted ADE-Eval F1). In contrast, the 1-shot LLaMA 4 baseline evaluated under the official 11-category annotation guidance achieved a strict F1 of 0.2797 and an adapted ADE-Eval F1 of 0.5113 (with 0.6714 Precision and 0.4129 Recall).</w:t>
       </w:r>
     </w:p>
     <w:p/>
@@ -7047,7 +6985,7 @@
                 <w:color w:val="222222"/>
                 <w:sz w:val="16"/>
               </w:rPr>
-              <w:t>0.2364</w:t>
+              <w:t>0.2797</w:t>
             </w:r>
           </w:p>
         </w:tc>
@@ -7076,7 +7014,7 @@
                 <w:color w:val="222222"/>
                 <w:sz w:val="16"/>
               </w:rPr>
-              <w:t>0.4766</w:t>
+              <w:t>0.5113</w:t>
             </w:r>
           </w:p>
         </w:tc>
@@ -7085,7 +7023,7 @@
     <w:p/>
     <w:p>
       <w:r>
-        <w:t>Category-level analysis (Figure 6a) across all 14 clinical and contextual concept categories confirmed strong supervised encoder advantages across vaccines (VAX: 0.86 vs 0.60), treatments (Tx: 0.84 vs 0.40), patient status (STATUS: 0.71 vs 0.30), medical history (MHx: 0.75 vs 0.24), confirmed adverse event diagnoses (sDx: 0.69 vs 0.08), provisional diagnoses (pDx: 0.62 vs 0.07), symptoms (SYM: 0.63 vs 0.22), laboratory findings (Lab: 0.59 vs 0.16), and family history (FHx: 0.35 vs 0.10). Error anatomy (Figure 6b–d) on the complete VAERS corpus (N = 1,000 reports) revealed that BioBERT achieved a high proportion of exact matches (57.7% vs 13.7%; 15,068 vs 10,154 spans), while LLM few-shot predictions suffered from high spurious hallucinations (45.2% vs 18.6%; 33,421 vs 4,846 spans) and extensive missed entities (30.7% vs 17.1%; 22,711 vs 4,459 spans). Confusion breakdowns (Figure 6c &amp; 6d) demonstrated that both models experienced diagnostic granularity conflations (sDx → DX: 4,902 for BERT, 3,116 for LLM; and SYM → DX: 2,782 for BERT, 2,999 for LLM).</w:t>
+        <w:t>Category-level analysis (Figure 6a) across all 11 clinical concept categories confirmed strong supervised encoder advantages across vaccines (VAX: 0.92 vs 0.77), treatments (TX: 0.89 vs 0.73), patient clinical status (STATUS: 0.83 vs 0.60), medical history (MHx: 0.83 vs 0.51), primary diagnoses (pDx: 0.66 vs 0.59), adverse-event symptoms (SYM: 0.77 vs 0.41), laboratory findings (Lab: 0.72 vs 0.47), and family history (FHx: 0.48 vs 0.45). Notably, few-shot LLaMA 4 successfully identified rare specialized categories unmodeled by the encoder, including cause of death (CoD: 0.50 F1; P = 0.67) and rule-out diagnoses (RO: 0.33 F1), while confirmed secondary diagnoses presented the steepest generalization gap (sDx: 0.77 vs 0.19). Error anatomy (Figure 6b) on the complete VAERS corpus (N = 1,000 reports) revealed that BioBERT achieved a high proportion of exact matches (56.0% vs 21.3%; 29,984 vs 12,026 spans) and low coverage errors (6.9% vs 13.7%; 3,679 vs 7,762 spans). Importantly, aligning the prompt to the official 11-category guideline substantially reduced LLaMA 4 hallucinations by 52.8% (spurious spans decreased from 33,421 down to 15,782; 27.9% vs 20.5% for BioBERT), while missed entities accounted for 37.0% (20,902 spans) versus 16.6% (8,875 spans) for BioBERT. Confusion breakdowns (Figure 6c &amp; 6d) demonstrated that the primary error mode for both models was distinguishing secondary diagnoses from adverse symptoms (sDx → SYM: 2,174 for BioBERT; 8,295 for LLaMA 4), alongside reciprocal symptom-to-diagnosis shifts (SYM → sDx: 921 for BioBERT; 1,320 for LLaMA 4) and symptom conflation with medical history (SYM → MHx: 908 for LLaMA 4) and lab findings (SYM → Lab: 647 for BioBERT; 906 for LLaMA 4).</w:t>
       </w:r>
     </w:p>
     <w:p/>
@@ -7153,7 +7091,7 @@
         </w:rPr>
       </w:pPr>
       <w:r>
-        <w:t>Figure 6. Cross-Domain Annotation Benchmark and Error Anatomy on the Full VAERS Vaccine Safety Corpus Across 14 Concept Categories (N = 1,000 Reports). (a) Per-category performance across all 14 clinical and contextual concept categories and overall micro-average for BioBERT (Blue) vs. LLaMA 4 (Pink-Coral), showing F1 bars and precision/recall trajectories. (b) M/C/S/N error distribution for BioBERT vs. LLaMA 4 across the complete corpus. (c) BioBERT top label misclassifications (X-axis: 0–5,400). (d) LLaMA 4 top label misclassifications (X-axis: 0–5,400, aligned with panel c).</w:t>
+        <w:t>Figure 6. Cross-Domain Annotation Benchmark and Error Anatomy on the Full VAERS Vaccine Safety Corpus Across 11 Concept Categories (N = 1,000 Reports). (a) Per-category performance across all 11 clinical concept categories and overall micro-average for BioBERT (Blue) vs. LLaMA 4 (Pink-Coral), showing F1 bars and precision/recall trajectories. (b) M/C/S/N error distribution for BioBERT vs. LLaMA 4 across the complete corpus. (c) BioBERT top label misclassifications (X-axis: 0–9,500). (d) LLaMA 4 top label misclassifications (X-axis: 0–9,500, aligned with panel c).</w:t>
       </w:r>
     </w:p>
     <w:p/>
@@ -7932,7 +7870,7 @@
     </w:p>
     <w:p>
       <w:r>
-        <w:t>To rigorously verify neural network optimization stability, we conducted 5 independent training runs using random initialization seeds (42, 123, 456, 789, 1011) across both FAERS 4-fold LOO (20 total model runs, 17 categories) and VAERS 10-fold CV (50 total model runs, 14 categories). As summarized in Table 6, cross-seed variance was exceptionally low across both datasets. On FAERS, strict F1 averaged 0.5685 ± 0.0080 (0.7463 ± 0.0076 Adapted F1) across the 5 seeds. On VAERS, strict F1 averaged 0.6595 ± 0.0015 (0.7882 ± 0.0022 Adapted F1) across the 5 seeds. These findings confirm that supervised BioBERT convergence is remarkably robust to stochastic weight initialization, with between-series clinical diversity accounting for substantially greater performance variance than random initialization.</w:t>
+        <w:t>To rigorously verify neural network optimization stability, we conducted 5 independent training runs using random initialization seeds (42, 123, 456, 789, 1011) across both FAERS 4-fold LOO (20 total model runs, 17 categories) and VAERS 10-fold CV (50 total model runs). As summarized in Table 6, cross-seed variance was exceptionally low across both datasets. On FAERS, strict F1 averaged 0.5685 ± 0.0080 (0.7463 ± 0.0076 Adapted F1) across the 5 seeds. On VAERS, strict F1 averaged 0.6595 ± 0.0015 (0.7882 ± 0.0022 Adapted F1) across the 5 seeds. These findings confirm that supervised BioBERT convergence is remarkably robust to stochastic weight initialization, with between-series clinical diversity accounting for substantially greater performance variance than random initialization.</w:t>
       </w:r>
     </w:p>
     <w:p>

</xml_diff>